<commit_message>
Memòria: dades del tècnic, pressupost Mansergas 74666/26, barres antipànic i obertura en sentit d'evacuació
Co-Authored-By: Claude Opus 5.5 <noreply@anthropic.com>
Claude-Session: https://claude.ai/code/session_01LriNJKpLsMik4TbQD5oKzn
</commit_message>
<xml_diff>
--- a/memoria/20261005 - Memòria substitució portes accés Nau Turbines.docx
+++ b/memoria/20261005 - Memòria substitució portes accés Nau Turbines.docx
@@ -549,16 +549,7 @@
         <w:t xml:space="preserve">Projectista i redactor del projecte: </w:t>
       </w:r>
       <w:r>
-        <w:t xml:space="preserve">Ignasi Tutzó Seró, Arquitecte Tècnic, col·legiat núm. 14646. </w:t>
-      </w:r>
-      <w:r>
-        <w:rPr>
-          <w:highlight w:val="yellow"/>
-        </w:rPr>
-        <w:t xml:space="preserve">NIF: [·········]  Tel.: [·········]</w:t>
-      </w:r>
-      <w:r>
-        <w:t xml:space="preserve">  Correu electrònic: itutzo@gmail.com</w:t>
+        <w:t xml:space="preserve">Ignasi Tutzó Seró, Arquitecte Tècnic, col·legiat núm. 14646 del Col·legi de l’Arquitectura Tècnica de Barcelona (CAATEEB). NIF 47710532E. C/ Escorial, 113, 1r 2a, 08024 Barcelona. Tel. 627 601 224. Correu electrònic: itutzo@gmail.com</w:t>
       </w:r>
     </w:p>
     <w:p>
@@ -568,6 +559,22 @@
       </w:pPr>
       <w:r>
         <w:t xml:space="preserve">No intervé cap altre tècnic en la redacció d’aquest projecte.</w:t>
+      </w:r>
+    </w:p>
+    <w:p>
+      <w:pPr>
+        <w:spacing w:after="120" w:before="0" w:line="300"/>
+        <w:jc w:val="both"/>
+      </w:pPr>
+      <w:r>
+        <w:rPr>
+          <w:b/>
+          <w:bCs/>
+        </w:rPr>
+        <w:t xml:space="preserve">Industrial que ha valorat les portes: </w:t>
+      </w:r>
+      <w:r>
+        <w:t xml:space="preserve">J.A. Mansergas, SA, CIF A58075250, Rubí (Barcelona). Pressupost núm. 74666/26, de 23 de setembre de 2026.</w:t>
       </w:r>
     </w:p>
     <w:p>
@@ -933,7 +940,17 @@
         <w:t xml:space="preserve">Quatre portes peatonals d’accés i evacuació </w:t>
       </w:r>
       <w:r>
-        <w:t xml:space="preserve">de dues fulles batents cadascuna, de 2,50 m entre eixos (2,35 m de llum de pas lliure) i 3,00 m d’alçada.</w:t>
+        <w:t xml:space="preserve">de dues fulles batents cadascuna (model JAM), de 2,50 m entre eixos (2,35 m de llum de pas lliure) i 3,00 m d’alçada, que obren en el sentit de l’evacuació (cap a l’avinguda) i porten </w:t>
+      </w:r>
+      <w:r>
+        <w:rPr>
+          <w:b/>
+          <w:bCs/>
+        </w:rPr>
+        <w:t xml:space="preserve">barres antipànic segons UNE-EN 1125</w:t>
+      </w:r>
+      <w:r>
+        <w:t xml:space="preserve"> i comandament exterior amb clau.</w:t>
       </w:r>
     </w:p>
     <w:p>
@@ -954,7 +971,7 @@
         <w:t xml:space="preserve">Una porta corredissa de vehicles </w:t>
       </w:r>
       <w:r>
-        <w:t xml:space="preserve">d’una fulla, de 5,77 m de llum i 3,00 m d’alçada, que en obrir-se es desplaça cap al costat de l’edifici adjacent (costat Badalona), per darrere de la línia de façana, sense envair el pas de vianants ni la via pública.</w:t>
+        <w:t xml:space="preserve">d’una fulla (model JAM), de 5,77 m de llum i 3,00 m d’alçada, motoritzada i amb dispositius de seguretat, que en obrir-se es desplaça cap al costat de l’edifici adjacent (costat Badalona), per darrere de la línia de façana, sense envair el pas de vianants ni la via pública.</w:t>
       </w:r>
     </w:p>
     <w:p>
@@ -975,7 +992,7 @@
         <w:t xml:space="preserve">Pilars d’acer galvanitzat de 150×150 mm </w:t>
       </w:r>
       <w:r>
-        <w:t xml:space="preserve">(en lloc dels muntants originals de 80×80 mm), amb més inèrcia davant d’impactes, sobre nous daus de formigó executats fora del traçat de la línia elèctrica soterrada.</w:t>
+        <w:t xml:space="preserve">(muntants laterals de les cancel·les JAM, en lloc dels muntants originals de 80×80 mm), amb més inèrcia davant d’impactes, sobre nous daus de formigó executats fora del traçat de la línia elèctrica soterrada.</w:t>
       </w:r>
     </w:p>
     <w:p>
@@ -989,19 +1006,18 @@
     </w:p>
     <w:p>
       <w:pPr>
-        <w:pStyle w:val="Heading3"/>
-      </w:pPr>
-      <w:r>
-        <w:t xml:space="preserve">MD2.2. JUSTIFICACIÓ DEL COMPLIMENT DE LA NORMATIVA URBANÍSTICA I MUNICIPAL</w:t>
-      </w:r>
-    </w:p>
-    <w:p>
-      <w:pPr>
         <w:spacing w:after="120" w:before="0" w:line="300"/>
         <w:jc w:val="both"/>
       </w:pPr>
       <w:r>
-        <w:t xml:space="preserve">L’actuació és una substitució d’un element de tancament existent per un altre de característiques i dimensions anàlogues. No altera l’alineació, l’alçada (3,00 m, igual que l’existent), l’ocupació, l’edificabilitat ni l’ús del recinte. És compatible amb el planejament vigent (PDU de les Tres Xemeneies) i amb el règim d’activitats esporàdiques amb què es van tramitar els projectes originals.</w:t>
+        <w:rPr>
+          <w:b/>
+          <w:bCs/>
+        </w:rPr>
+        <w:t xml:space="preserve">Canvi del sentit d’obertura respecte de l’estat actual. </w:t>
+      </w:r>
+      <w:r>
+        <w:t xml:space="preserve">Les portes existents obren cap a l’interior del recinte. Les noves portes peatonals obriran cap a l’exterior, que és el sentit de l’evacuació, perquè les barres antipànic puguin funcionar (CTE DB SI 3, apartat 6). En obrir-se, les fulles (≈ 1,18 m) escombren l’espai d’accés d’uns 3,80 m de fondària que hi ha entre la línia de portes i l’alineació de l’Avinguda d’Eduard Maristany, sense arribar a la vorera.</w:t>
       </w:r>
     </w:p>
     <w:p>
@@ -1010,7 +1026,36 @@
         <w:jc w:val="both"/>
       </w:pPr>
       <w:r>
-        <w:t xml:space="preserve">Les fulles batents de les portes peatonals obren cap a l’interior del recinte i la porta corredissa llisca per la cara interior, de manera que cap element mòbil envaeix la vorera de l’Avinguda d’Eduard Maristany, d’acord amb les ordenances municipals.</w:t>
+        <w:rPr>
+          <w:highlight w:val="yellow"/>
+        </w:rPr>
+        <w:t xml:space="preserve">Cal comprovar que l’espai d’accés davant de les portes és dins de l’àmbit d’ocupació directa i no és via pública, i actualitzar el plànol 02 amb les portes obrint cap a l’exterior.</w:t>
+      </w:r>
+    </w:p>
+    <w:p>
+      <w:pPr>
+        <w:pStyle w:val="Heading3"/>
+      </w:pPr>
+      <w:r>
+        <w:t xml:space="preserve">MD2.2. JUSTIFICACIÓ DEL COMPLIMENT DE LA NORMATIVA URBANÍSTICA I MUNICIPAL</w:t>
+      </w:r>
+    </w:p>
+    <w:p>
+      <w:pPr>
+        <w:spacing w:after="120" w:before="0" w:line="300"/>
+        <w:jc w:val="both"/>
+      </w:pPr>
+      <w:r>
+        <w:t xml:space="preserve">L’actuació és una substitució d’un element de tancament existent per un altre de característiques i dimensions anàlogues. No altera l’alineació, l’alçada (3,00 m, igual que l’existent), l’ocupació, l’edificabilitat ni l’ús del recinte. És compatible amb el planejament vigent (PDU de les Tres Xemeneies) i amb el règim d’activitats esporàdiques amb què es van tramitar els projectes originals.</w:t>
+      </w:r>
+    </w:p>
+    <w:p>
+      <w:pPr>
+        <w:spacing w:after="120" w:before="0" w:line="300"/>
+        <w:jc w:val="both"/>
+      </w:pPr>
+      <w:r>
+        <w:t xml:space="preserve">Les fulles batents de les portes peatonals obren cap a l’exterior dins l’espai d’accés retranquejat (≈ 3,80 m de fondària), i la porta corredissa llisca per la cara interior. Cap element mòbil envaeix la vorera de l’Avinguda d’Eduard Maristany, d’acord amb les ordenances municipals.</w:t>
       </w:r>
     </w:p>
     <w:p>
@@ -1048,7 +1093,7 @@
         <w:t xml:space="preserve">SUA 1. </w:t>
       </w:r>
       <w:r>
-        <w:t xml:space="preserve">El pas es manté al mateix nivell que el paviment existent, sense graons ni ressalts. El carril de la porta corredissa s’ancora superficialment amb rampes d’acord 1:12 i un ressalt màxim de 15 mm, i se situa fora dels passos de vianants. Els forrellats de fulla passiva queden encastats a terra, sense sobresortir quan la porta és oberta.</w:t>
+        <w:t xml:space="preserve">El pas es manté al mateix nivell que el paviment existent, sense graons ni ressalts. La guia inferior de la porta corredissa (Ø 20 mm) se situa fora dels passos de vianants. Els passadors inferiors de les barres antipànic de dos punts entren en un encaix enrasat amb el paviment, sense sobresortir.</w:t>
       </w:r>
     </w:p>
     <w:p>
@@ -1069,7 +1114,7 @@
         <w:t xml:space="preserve">SUA 2. </w:t>
       </w:r>
       <w:r>
-        <w:t xml:space="preserve">Les fulles batents obertes queden fixades amb retenidors i sense envair cap itinerari. La porta corredissa té topalls de final de cursa i guia superior antibolcada (UNE-EN 13241 i UNE-EN 12604). Els pilars se senyalitzen amb bandes reflectants contra els impactes de vehicles.</w:t>
+        <w:t xml:space="preserve">Quan les fulles batents s’obren cap a l’exterior, no envaeixen la vorera. La porta corredissa és motoritzada i compleix UNE-EN 13241, UNE-EN 12453 i UNE-EN 12445: fotocèl·lula, banda de seguretat sensible, avisador òptic, finals de cursa i desbloqueig manual. Els muntants se senyalitzen amb bandes reflectants contra els impactes de vehicles.</w:t>
       </w:r>
     </w:p>
     <w:p>
@@ -1698,7 +1743,7 @@
                 <w:sz w:val="18"/>
                 <w:szCs w:val="18"/>
               </w:rPr>
-              <w:t xml:space="preserve">1 u corredissa de 5,77 m</w:t>
+              <w:t xml:space="preserve">1 u corredissa motoritzada de 5,77 m</w:t>
             </w:r>
           </w:p>
         </w:tc>
@@ -1734,7 +1779,7 @@
                 <w:sz w:val="18"/>
                 <w:szCs w:val="18"/>
               </w:rPr>
-              <w:t xml:space="preserve">Muntants / pilars</w:t>
+              <w:t xml:space="preserve">Sentit d’obertura portes peatonals</w:t>
             </w:r>
           </w:p>
         </w:tc>
@@ -1764,7 +1809,7 @@
                 <w:sz w:val="18"/>
                 <w:szCs w:val="18"/>
               </w:rPr>
-              <w:t xml:space="preserve">Tub 80×80 mm</w:t>
+              <w:t xml:space="preserve">Cap a l’interior</w:t>
             </w:r>
           </w:p>
         </w:tc>
@@ -1794,7 +1839,199 @@
                 <w:sz w:val="18"/>
                 <w:szCs w:val="18"/>
               </w:rPr>
-              <w:t xml:space="preserve">Tub 150×150 mm</w:t>
+              <w:t xml:space="preserve">Cap a l’exterior (evacuació)</w:t>
+            </w:r>
+          </w:p>
+        </w:tc>
+      </w:tr>
+      <w:tr>
+        <w:trPr>
+          <w:cantSplit/>
+          <w:tblHeader w:val="false"/>
+        </w:trPr>
+        <w:tc>
+          <w:tcPr>
+            <w:tcW w:type="dxa" w:w="4600"/>
+            <w:tcBorders>
+              <w:top w:val="single" w:color="999999" w:sz="4"/>
+              <w:left w:val="single" w:color="999999" w:sz="4"/>
+              <w:bottom w:val="single" w:color="999999" w:sz="4"/>
+              <w:right w:val="single" w:color="999999" w:sz="4"/>
+            </w:tcBorders>
+            <w:tcMar>
+              <w:top w:type="dxa" w:w="50"/>
+              <w:left w:type="dxa" w:w="90"/>
+              <w:bottom w:type="dxa" w:w="50"/>
+              <w:right w:type="dxa" w:w="90"/>
+            </w:tcMar>
+            <w:vAlign w:val="center"/>
+          </w:tcPr>
+          <w:p>
+            <w:pPr>
+              <w:jc w:val="left"/>
+            </w:pPr>
+            <w:r>
+              <w:rPr>
+                <w:sz w:val="18"/>
+                <w:szCs w:val="18"/>
+              </w:rPr>
+              <w:t xml:space="preserve">Barres antipànic (UNE-EN 1125)</w:t>
+            </w:r>
+          </w:p>
+        </w:tc>
+        <w:tc>
+          <w:tcPr>
+            <w:tcW w:type="dxa" w:w="2200"/>
+            <w:tcBorders>
+              <w:top w:val="single" w:color="999999" w:sz="4"/>
+              <w:left w:val="single" w:color="999999" w:sz="4"/>
+              <w:bottom w:val="single" w:color="999999" w:sz="4"/>
+              <w:right w:val="single" w:color="999999" w:sz="4"/>
+            </w:tcBorders>
+            <w:tcMar>
+              <w:top w:type="dxa" w:w="50"/>
+              <w:left w:type="dxa" w:w="90"/>
+              <w:bottom w:type="dxa" w:w="50"/>
+              <w:right w:type="dxa" w:w="90"/>
+            </w:tcMar>
+            <w:vAlign w:val="center"/>
+          </w:tcPr>
+          <w:p>
+            <w:pPr>
+              <w:jc w:val="left"/>
+            </w:pPr>
+            <w:r>
+              <w:rPr>
+                <w:sz w:val="18"/>
+                <w:szCs w:val="18"/>
+              </w:rPr>
+              <w:t xml:space="preserve">No</w:t>
+            </w:r>
+          </w:p>
+        </w:tc>
+        <w:tc>
+          <w:tcPr>
+            <w:tcW w:type="dxa" w:w="2200"/>
+            <w:tcBorders>
+              <w:top w:val="single" w:color="999999" w:sz="4"/>
+              <w:left w:val="single" w:color="999999" w:sz="4"/>
+              <w:bottom w:val="single" w:color="999999" w:sz="4"/>
+              <w:right w:val="single" w:color="999999" w:sz="4"/>
+            </w:tcBorders>
+            <w:tcMar>
+              <w:top w:type="dxa" w:w="50"/>
+              <w:left w:type="dxa" w:w="90"/>
+              <w:bottom w:type="dxa" w:w="50"/>
+              <w:right w:type="dxa" w:w="90"/>
+            </w:tcMar>
+            <w:vAlign w:val="center"/>
+          </w:tcPr>
+          <w:p>
+            <w:pPr>
+              <w:jc w:val="left"/>
+            </w:pPr>
+            <w:r>
+              <w:rPr>
+                <w:sz w:val="18"/>
+                <w:szCs w:val="18"/>
+              </w:rPr>
+              <w:t xml:space="preserve">Sí, a les 4 portes</w:t>
+            </w:r>
+          </w:p>
+        </w:tc>
+      </w:tr>
+      <w:tr>
+        <w:trPr>
+          <w:cantSplit/>
+          <w:tblHeader w:val="false"/>
+        </w:trPr>
+        <w:tc>
+          <w:tcPr>
+            <w:tcW w:type="dxa" w:w="4600"/>
+            <w:tcBorders>
+              <w:top w:val="single" w:color="999999" w:sz="4"/>
+              <w:left w:val="single" w:color="999999" w:sz="4"/>
+              <w:bottom w:val="single" w:color="999999" w:sz="4"/>
+              <w:right w:val="single" w:color="999999" w:sz="4"/>
+            </w:tcBorders>
+            <w:tcMar>
+              <w:top w:type="dxa" w:w="50"/>
+              <w:left w:type="dxa" w:w="90"/>
+              <w:bottom w:type="dxa" w:w="50"/>
+              <w:right w:type="dxa" w:w="90"/>
+            </w:tcMar>
+            <w:vAlign w:val="center"/>
+          </w:tcPr>
+          <w:p>
+            <w:pPr>
+              <w:jc w:val="left"/>
+            </w:pPr>
+            <w:r>
+              <w:rPr>
+                <w:sz w:val="18"/>
+                <w:szCs w:val="18"/>
+              </w:rPr>
+              <w:t xml:space="preserve">Muntants / pilars</w:t>
+            </w:r>
+          </w:p>
+        </w:tc>
+        <w:tc>
+          <w:tcPr>
+            <w:tcW w:type="dxa" w:w="2200"/>
+            <w:tcBorders>
+              <w:top w:val="single" w:color="999999" w:sz="4"/>
+              <w:left w:val="single" w:color="999999" w:sz="4"/>
+              <w:bottom w:val="single" w:color="999999" w:sz="4"/>
+              <w:right w:val="single" w:color="999999" w:sz="4"/>
+            </w:tcBorders>
+            <w:tcMar>
+              <w:top w:type="dxa" w:w="50"/>
+              <w:left w:type="dxa" w:w="90"/>
+              <w:bottom w:type="dxa" w:w="50"/>
+              <w:right w:type="dxa" w:w="90"/>
+            </w:tcMar>
+            <w:vAlign w:val="center"/>
+          </w:tcPr>
+          <w:p>
+            <w:pPr>
+              <w:jc w:val="left"/>
+            </w:pPr>
+            <w:r>
+              <w:rPr>
+                <w:sz w:val="18"/>
+                <w:szCs w:val="18"/>
+              </w:rPr>
+              <w:t xml:space="preserve">Tub 80×80 mm</w:t>
+            </w:r>
+          </w:p>
+        </w:tc>
+        <w:tc>
+          <w:tcPr>
+            <w:tcW w:type="dxa" w:w="2200"/>
+            <w:tcBorders>
+              <w:top w:val="single" w:color="999999" w:sz="4"/>
+              <w:left w:val="single" w:color="999999" w:sz="4"/>
+              <w:bottom w:val="single" w:color="999999" w:sz="4"/>
+              <w:right w:val="single" w:color="999999" w:sz="4"/>
+            </w:tcBorders>
+            <w:tcMar>
+              <w:top w:type="dxa" w:w="50"/>
+              <w:left w:type="dxa" w:w="90"/>
+              <w:bottom w:type="dxa" w:w="50"/>
+              <w:right w:type="dxa" w:w="90"/>
+            </w:tcMar>
+            <w:vAlign w:val="center"/>
+          </w:tcPr>
+          <w:p>
+            <w:pPr>
+              <w:jc w:val="left"/>
+            </w:pPr>
+            <w:r>
+              <w:rPr>
+                <w:sz w:val="18"/>
+                <w:szCs w:val="18"/>
+              </w:rPr>
+              <w:t xml:space="preserve">Muntants laterals JAM (≈ 150×150 mm)</w:t>
             </w:r>
           </w:p>
         </w:tc>
@@ -3292,7 +3529,16 @@
         <w:pStyle w:val="Heading2"/>
       </w:pPr>
       <w:r>
-        <w:t xml:space="preserve">MJ4. CONDICIONS DE LES PORTES EN RELACIÓ AMB L’EVACUACIÓ</w:t>
+        <w:t xml:space="preserve">MJ4. CONDICIONS DE LES PORTES EN RELACIÓ AMB L’EVACUACIÓ (CTE DB SI 3, APARTAT 6)</w:t>
+      </w:r>
+    </w:p>
+    <w:p>
+      <w:pPr>
+        <w:spacing w:after="120" w:before="0" w:line="300"/>
+        <w:jc w:val="both"/>
+      </w:pPr>
+      <w:r>
+        <w:t xml:space="preserve">Les quatre portes peatonals es dissenyen com a portes de sortida d’evacuació a l’aire lliure, de manera que la capacitat d’evacuació no depèn de deixar-les obertes:</w:t>
       </w:r>
     </w:p>
     <w:p>
@@ -3306,7 +3552,14 @@
         <w:jc w:val="both"/>
       </w:pPr>
       <w:r>
-        <w:t xml:space="preserve">Es manté el règim d’ús dels projectes originals: durant l’horari de l’activitat totes les portes (peatonals i corredissa) romanen obertes i fixades en posició oberta amb retenidors, de manera que la sortida funciona com un pas lliure a l’aire lliure. Les portes només es tanquen fora de l’horari de l’activitat, sense ocupants al recinte.</w:t>
+        <w:rPr>
+          <w:b/>
+          <w:bCs/>
+        </w:rPr>
+        <w:t xml:space="preserve">Sentit d’obertura: </w:t>
+      </w:r>
+      <w:r>
+        <w:t xml:space="preserve">obren en el sentit de l’evacuació, cap a l’Avinguda d’Eduard Maristany, tal com exigeix SI 3-6.3 per a portes previstes per a més de 100 persones. Això millora la situació actual, on les portes obren cap a l’interior.</w:t>
       </w:r>
     </w:p>
     <w:p>
@@ -3320,7 +3573,14 @@
         <w:jc w:val="both"/>
       </w:pPr>
       <w:r>
-        <w:t xml:space="preserve">Les fulles batents giren cap a l’interior del recinte, igual que les portes existents, i no envaeixen la via pública. Obertes, queden recollides als laterals de cada mòdul i no redueixen la llum de pas (només resten el gruix de la fulla, inclòs als pilars).</w:t>
+        <w:rPr>
+          <w:b/>
+          <w:bCs/>
+        </w:rPr>
+        <w:t xml:space="preserve">Sistema d’obertura: </w:t>
+      </w:r>
+      <w:r>
+        <w:t xml:space="preserve">són abatibles amb eix de gir vertical i porten dispositiu antipànic de barra horitzontal d’empenta segons UNE-EN 1125 a totes dues fulles, com exigeix SI 3-6.1 per a l’evacuació de més de 50 persones no familiaritzades amb la porta. Des de l’interior s’obren sempre, sense clau, encara que estiguin tancades. Des de l’exterior s’obren amb maneta i clau.</w:t>
       </w:r>
     </w:p>
     <w:p>
@@ -3334,7 +3594,14 @@
         <w:jc w:val="both"/>
       </w:pPr>
       <w:r>
-        <w:t xml:space="preserve">La porta corredissa oberta queda totalment recollida darrere de la línia de façana de l’edifici adjacent, sense reduir l’amplada de pas.</w:t>
+        <w:rPr>
+          <w:b/>
+          <w:bCs/>
+        </w:rPr>
+        <w:t xml:space="preserve">Amplada de les fulles: </w:t>
+      </w:r>
+      <w:r>
+        <w:t xml:space="preserve">cada fulla ha de tenir una amplada de pas entre 0,60 i 1,23 m (SI 3-4.2). Amb 2,35 m de llum per porta, cada fulla fa ≈ 1,18 m. COMPLEIX.</w:t>
       </w:r>
     </w:p>
     <w:p>
@@ -3348,7 +3615,14 @@
         <w:jc w:val="both"/>
       </w:pPr>
       <w:r>
-        <w:t xml:space="preserve">Es mantenen la senyalització de sortida i l’enllumenat d’emergència existents a l’accés (SI 3.7 i SUA 4). Si cal desmuntar-los durant les obres, es reposaran.</w:t>
+        <w:rPr>
+          <w:b/>
+          <w:bCs/>
+        </w:rPr>
+        <w:t xml:space="preserve">Porta corredissa: </w:t>
+      </w:r>
+      <w:r>
+        <w:t xml:space="preserve">per ser corredissa i motoritzada, no es computa com a porta d’evacuació (comprovació c). Durant l’horari de l’activitat romandrà oberta i bloquejada, i aleshores funciona com un pas lliure addicional (comprovacions a i b). Té desbloqueig manual en cas de tall de subministrament elèctric.</w:t>
       </w:r>
     </w:p>
     <w:p>
@@ -3362,7 +3636,33 @@
         <w:jc w:val="both"/>
       </w:pPr>
       <w:r>
-        <w:t xml:space="preserve">Abans de reobrir el recinte al públic, l’explotador haurà d’incorporar al seu pla d’autoprotecció el procediment d’obertura i fixació de les portes.</w:t>
+        <w:t xml:space="preserve">Fora de l’horari de l’activitat les portes es poden tancar amb clau sense perdre la capacitat d’evacuació, perquè l’antipànic permet sortir des de l’interior en qualsevol moment.</w:t>
+      </w:r>
+    </w:p>
+    <w:p>
+      <w:pPr>
+        <w:pStyle w:val="ListParagraph"/>
+        <w:numPr>
+          <w:ilvl w:val="0"/>
+          <w:numId w:val="4"/>
+        </w:numPr>
+        <w:spacing w:after="60" w:line="300"/>
+        <w:jc w:val="both"/>
+      </w:pPr>
+      <w:r>
+        <w:t xml:space="preserve">Es mantenen la senyalització de sortida i l’enllumenat d’emergència existents a l’accés (SI 3.7 i SUA 4), i s’afegeix el rètol “Sortida d’emergència” a cada porta peatonal.</w:t>
+      </w:r>
+    </w:p>
+    <w:p>
+      <w:pPr>
+        <w:spacing w:after="120" w:before="0" w:line="300"/>
+        <w:jc w:val="both"/>
+      </w:pPr>
+      <w:r>
+        <w:rPr>
+          <w:highlight w:val="yellow"/>
+        </w:rPr>
+        <w:t xml:space="preserve">Cal demanar a Mansergas que confirmi que les fulles JAM de 2.500 mm donen una llum de pas lliure d’almenys 1,15 m per fulla (≥ 2,30 m per porta) i que el model JAM admet el kit antipànic UNE-EN 1125 i el gir cap a l’exterior.</w:t>
       </w:r>
     </w:p>
     <w:p>
@@ -3378,7 +3678,7 @@
         <w:t xml:space="preserve">Conclusió: </w:t>
       </w:r>
       <w:r>
-        <w:t xml:space="preserve">la nova configuració manté una llum útil de pas de 15,12 m, superior als 15 m previstos als projectes originals, i una capacitat d’evacuació de 9.072 persones amb el mateix criteri (P/600). Com que es manté la mateixa llum total entre paraments, el mateix nombre de portes peatonals i el mateix règim d’ús, </w:t>
+        <w:t xml:space="preserve">la nova configuració manté una llum útil de pas de 15,12 m, superior als 15 m previstos als projectes originals, i una capacitat d’evacuació de 9.072 persones amb el mateix criteri (P/600). Com que es manté la mateixa llum total entre paraments, el mateix nombre de portes peatonals i ara, a més, les portes obren en el sentit de l’evacuació i porten barres antipànic, </w:t>
       </w:r>
       <w:r>
         <w:rPr>
@@ -3511,7 +3811,7 @@
         <w:jc w:val="both"/>
       </w:pPr>
       <w:r>
-        <w:t xml:space="preserve">La porta corredissa no requereix rasa: el carril s’ancora superficialment al paviment existent amb tacs químics de longitud limitada (≤ 100 mm), i els daus es concentren només als pilars.</w:t>
+        <w:t xml:space="preserve">La porta corredissa no requereix rasa. La guia inferior de l’industrial (Ø 20 mm soldada sobre platines amb grapes) no s’encastarà al terra: les platines s’ancoraran al paviment existent amb tacs químics de longitud limitada (≤ 100 mm). Si cal formigonar una franja de suport, no farà més de 0,20 m de fondària i només es farà després de la detecció i amb l’autorització de la direcció facultativa. Els daus es concentren només als muntants i a la torreta.</w:t>
       </w:r>
     </w:p>
     <w:p>
@@ -3559,7 +3859,7 @@
         <w:jc w:val="both"/>
       </w:pPr>
       <w:r>
-        <w:t xml:space="preserve">Els nous pilars es fonamenten en daus aïllats de formigó en massa HA-25/B/20/IIa de 0,60×0,60×0,80 m, sobre una capa de neteja de 5 cm, amb una placa d’ancoratge de 300×300×15 mm i quatre perns Ø16 mm de B500S, galvanitzats. Es preveuen 7 daus: 5 per als pilars de les portes peatonals i el de recepció de la porta corredissa, i 2 per als pilars guia de la corredissa.</w:t>
+        <w:t xml:space="preserve">Els nous pilars es fonamenten en daus aïllats de formigó en massa HA-25/B/20/IIa de 0,60×0,60×0,80 m, sobre una capa de neteja de 5 cm, amb una placa d’ancoratge de 300×300×15 mm i quatre perns Ø16 mm de B500S, galvanitzats. Es preveuen 7 daus: 5 per als muntants de les portes peatonals (un dels quals també és el de recepció de la porta corredissa), i 2 per a la torreta de suport i el motor de la corredissa. L’oferta de l’industrial no inclou l’obra civil, que es valora als capítols 03 i 04.</w:t>
       </w:r>
     </w:p>
     <w:p>
@@ -3580,7 +3880,7 @@
         <w:rPr>
           <w:highlight w:val="yellow"/>
         </w:rPr>
-        <w:t xml:space="preserve">L’industrial ha de confirmar les reaccions definitives de la porta corredissa (pes i bolcada) abans de formigonar. La direcció facultativa pot ajustar les dimensions dels daus segons el terreny que es trobi.</w:t>
+        <w:t xml:space="preserve">Mansergas ha de confirmar les dimensions dels muntants, de les plaques i de la torreta, i les reaccions de la porta corredissa (pes i bolcada), abans de formigonar. La direcció facultativa pot ajustar les dimensions dels daus segons el terreny que es trobi.</w:t>
       </w:r>
     </w:p>
     <w:p>
@@ -3588,7 +3888,16 @@
         <w:pStyle w:val="Heading2"/>
       </w:pPr>
       <w:r>
-        <w:t xml:space="preserve">MC5. TANCAMENTS PRACTICABLES: PORTES I PILARS</w:t>
+        <w:t xml:space="preserve">MC5. TANCAMENTS PRACTICABLES: PORTES</w:t>
+      </w:r>
+    </w:p>
+    <w:p>
+      <w:pPr>
+        <w:spacing w:after="120" w:before="0" w:line="300"/>
+        <w:jc w:val="both"/>
+      </w:pPr>
+      <w:r>
+        <w:t xml:space="preserve">Les portes són les del pressupost de J.A. Mansergas, SA, núm. 74666/26 (Annex 5), complementades amb els dispositius antipànic que exigeix aquest projecte.</w:t>
       </w:r>
     </w:p>
     <w:p>
@@ -3606,10 +3915,10 @@
           <w:b/>
           <w:bCs/>
         </w:rPr>
-        <w:t xml:space="preserve">Pilars: </w:t>
-      </w:r>
-      <w:r>
-        <w:t xml:space="preserve">tub quadrat d’acer S275 de 150×150×6 mm i 3,30 m de longitud, galvanitzat en calent (UNE-EN ISO 1461, gruix mínim de 85 µm), amb placa base soldada i tapa superior, cargolat a la placa d’ancoratge.</w:t>
+        <w:t xml:space="preserve">Portes peatonals (4 u), cancel·la model JAM de 2.500×3.000 mm, de dues fulles: </w:t>
+      </w:r>
+      <w:r>
+        <w:t xml:space="preserve">fulla d’armadura tubular d’acer amb travessers rigiditzadors, folrada amb perfil especial JAM galvanitzat; gir amb cassoleta superior i pivot inferior amb rodaments de boles, allotjat en muntant lateral; acabat galvanitzat. Obertura cap a l’exterior.</w:t>
       </w:r>
     </w:p>
     <w:p>
@@ -3627,10 +3936,10 @@
           <w:b/>
           <w:bCs/>
         </w:rPr>
-        <w:t xml:space="preserve">Portes peatonals (4 u): </w:t>
-      </w:r>
-      <w:r>
-        <w:t xml:space="preserve">dues fulles batents per porta, de 2,50 m entre eixos i 3,00 m d’alçada. Bastidor perimetral de tub d’acer galvanitzat i barrots verticals de tub quadrat de 30×30 mm amb separació lliure ≤ 10 cm. Tres frontisses reforçades per fulla, forrellat vertical a la fulla passiva, pany de seguretat amb clau i maneta, i retenidors per fixar les fulles en posició oberta.</w:t>
+        <w:t xml:space="preserve">Dispositius antipànic (4 jocs, no inclosos a l’oferta de l’industrial): </w:t>
+      </w:r>
+      <w:r>
+        <w:t xml:space="preserve">barra horitzontal d’empenta UNE-EN 1125 amb pany de cop a la fulla activa; barra de dos punts (tancament superior i inferior) a la fulla passiva, que substitueix el forrellat manual; comandament exterior amb maneta i cilindre de clau; acabat per a exterior. Marcat CE.</w:t>
       </w:r>
     </w:p>
     <w:p>
@@ -3648,10 +3957,10 @@
           <w:b/>
           <w:bCs/>
         </w:rPr>
-        <w:t xml:space="preserve">Porta corredissa de vehicles (1 u): </w:t>
-      </w:r>
-      <w:r>
-        <w:t xml:space="preserve">fulla única de 5,77 m de llum i 3,00 m d’alçada, de la mateixa composició que les peatonals, amb carro de rodes sobre carril ancorat al paviment, guia superior amb rodets, topalls de final de cursa i pany de seguretat amb clau. Accionament manual. Ha de tenir marcat CE segons UNE-EN 13241. Si en el futur es motoritza, caldrà complir la UNE-EN 12453 (seguretat d’ús de portes motoritzades).</w:t>
+        <w:t xml:space="preserve">Porta corredissa de vehicles (1 u), model JAM de 5.770×3.000 mm: </w:t>
+      </w:r>
+      <w:r>
+        <w:t xml:space="preserve">fulla folrada amb perfils d’acer galvanitzat laminats en fred, rodes d’acer amb rodaments, guia inferior calibrada de Ø 20 mm, torreta de suport amb rodaments de niló i perfil en “U” de tancament. Motor BK-1200 (230 V, 380 W, 850 N, 10 m/min, IP54) amb fotocèl·lula, banda de seguretat, avisador òptic, finals de cursa mecànics i desbloqueig manual. Marcat CE i expedient tècnic segons UNE-EN 13241, UNE-EN 12453 i UNE-EN 12445.</w:t>
       </w:r>
     </w:p>
     <w:p>
@@ -3669,10 +3978,18 @@
           <w:b/>
           <w:bCs/>
         </w:rPr>
-        <w:t xml:space="preserve">Acabat: </w:t>
-      </w:r>
-      <w:r>
-        <w:t xml:space="preserve">galvanitzat en calent de tots els elements; retocs de soldadures i talls fets en obra amb pintura rica en zinc; bandes reflectants als pilars.</w:t>
+        <w:t xml:space="preserve">Senyalització: </w:t>
+      </w:r>
+      <w:r>
+        <w:t xml:space="preserve">bandes reflectants als muntants contra els impactes de vehicles i rètol fotoluminescent de “Sortida d’emergència” a cada porta peatonal.</w:t>
+      </w:r>
+    </w:p>
+    <w:p>
+      <w:pPr>
+        <w:pStyle w:val="Heading2"/>
+      </w:pPr>
+      <w:r>
+        <w:t xml:space="preserve">MC6. PAVIMENTS I REPOSICIONS</w:t>
       </w:r>
     </w:p>
     <w:p>
@@ -3681,21 +3998,36 @@
         <w:jc w:val="both"/>
       </w:pPr>
       <w:r>
-        <w:t xml:space="preserve">Aquests elements són els que ha valorat l’industrial a l’oferta ref. 74666 (Annex 5). </w:t>
-      </w:r>
+        <w:t xml:space="preserve">Es reposarà el paviment a l’entorn dels pilars amb panot igual a l’existent (o formigó raspallat), enrasat amb el paviment adjacent i sense ressalts, i se segellarà el contorn dels pilars amb massilla de poliuretà.</w:t>
+      </w:r>
+    </w:p>
+    <w:p>
+      <w:pPr>
+        <w:pStyle w:val="Heading2"/>
+      </w:pPr>
+      <w:r>
+        <w:t xml:space="preserve">MC7. INSTAL·LACIONS</w:t>
+      </w:r>
+    </w:p>
+    <w:p>
+      <w:pPr>
+        <w:spacing w:after="120" w:before="0" w:line="300"/>
+        <w:jc w:val="both"/>
+      </w:pPr>
+      <w:r>
+        <w:t xml:space="preserve">El motor de la porta corredissa necessita alimentació monofàsica de 230 V, que l’oferta de l’industrial no inclou. Es preveu una línia nova des del quadre existent més proper, amb cable RZ1-K 3G2,5 mm² en tub muntat superficialment pels paraments existents (mur de l’edifici adjacent), protegida amb magnetotèrmic de 10 A i diferencial de 30 mA. Així no cal obrir cap rasa a la zona de la línia elèctrica soterrada. Es farà d’acord amb el REBT i es lliurarà el butlletí corresponent.</w:t>
+      </w:r>
+    </w:p>
+    <w:p>
+      <w:pPr>
+        <w:spacing w:after="120" w:before="0" w:line="300"/>
+        <w:jc w:val="both"/>
+      </w:pPr>
       <w:r>
         <w:rPr>
           <w:highlight w:val="yellow"/>
         </w:rPr>
-        <w:t xml:space="preserve">Cal verificar que la descripció d’aquesta memòria coincideix amb la de l’oferta (seccions, accessoris i acabats).</w:t>
-      </w:r>
-    </w:p>
-    <w:p>
-      <w:pPr>
-        <w:pStyle w:val="Heading2"/>
-      </w:pPr>
-      <w:r>
-        <w:t xml:space="preserve">MC6. PAVIMENTS I REPOSICIONS</w:t>
+        <w:t xml:space="preserve">Cal que la propietat indiqui el punt de subministrament (quadre) per a l’alimentació del motor.</w:t>
       </w:r>
     </w:p>
     <w:p>
@@ -3704,24 +4036,7 @@
         <w:jc w:val="both"/>
       </w:pPr>
       <w:r>
-        <w:t xml:space="preserve">Es reposarà el paviment a l’entorn dels pilars amb panot igual a l’existent (o formigó raspallat), enrasat amb el paviment adjacent i sense ressalts, i se segellarà el contorn dels pilars amb massilla de poliuretà.</w:t>
-      </w:r>
-    </w:p>
-    <w:p>
-      <w:pPr>
-        <w:pStyle w:val="Heading2"/>
-      </w:pPr>
-      <w:r>
-        <w:t xml:space="preserve">MC7. INSTAL·LACIONS</w:t>
-      </w:r>
-    </w:p>
-    <w:p>
-      <w:pPr>
-        <w:spacing w:after="120" w:before="0" w:line="300"/>
-        <w:jc w:val="both"/>
-      </w:pPr>
-      <w:r>
-        <w:t xml:space="preserve">L’actuació no modifica cap instal·lació. No es toquen la línia elèctrica soterrada ni el quadre de telecomunicacions existent a l’extrem de la tanca (element 7 dels plànols), i es mantenen l’enllumenat d’emergència i la senyalització de l’accés.</w:t>
+        <w:t xml:space="preserve">No es toquen la línia elèctrica soterrada ni el quadre de telecomunicacions existent a l’extrem de la tanca (element 7 dels plànols), i es mantenen l’enllumenat d’emergència i la senyalització de l’accés.</w:t>
       </w:r>
     </w:p>
     <w:p>
@@ -3893,7 +4208,21 @@
         <w:jc w:val="both"/>
       </w:pPr>
       <w:r>
-        <w:t xml:space="preserve">UNE-EN 13241 (portes industrials, comercials i de garatge), UNE-EN 12604 i UNE-EN 12453.</w:t>
+        <w:t xml:space="preserve">UNE-EN 13241 (portes industrials, comercials i de garatge), UNE-EN 12604, UNE-EN 12453 i UNE-EN 12445 (seguretat d’ús de portes motoritzades).</w:t>
+      </w:r>
+    </w:p>
+    <w:p>
+      <w:pPr>
+        <w:pStyle w:val="ListParagraph"/>
+        <w:numPr>
+          <w:ilvl w:val="0"/>
+          <w:numId w:val="4"/>
+        </w:numPr>
+        <w:spacing w:after="60" w:line="300"/>
+        <w:jc w:val="both"/>
+      </w:pPr>
+      <w:r>
+        <w:t xml:space="preserve">UNE-EN 1125 (dispositius antipànic per a sortides d’emergència, accionats per barra horitzontal).</w:t>
       </w:r>
     </w:p>
     <w:p>
@@ -4859,16 +5188,23 @@
         <w:jc w:val="both"/>
       </w:pPr>
       <w:r>
-        <w:t xml:space="preserve">Els preus del capítol 05 (portes, reixes i pilars) </w:t>
+        <w:t xml:space="preserve">Els preus de les portes del capítol 05 (partides 05.01 i 05.02) són els del pressupost de J.A. Mansergas, SA, núm. 74666/26, de 23/09/2026 (</w:t>
+      </w:r>
+      <w:r>
+        <w:rPr>
+          <w:b/>
+          <w:bCs/>
+        </w:rPr>
+        <w:t xml:space="preserve">23.983,77 € sense IVA</w:t>
+      </w:r>
+      <w:r>
+        <w:t xml:space="preserve">). L’oferta no inclou les barres antipànic, l’obra civil, el desmuntatge de les portes existents ni l’alimentació elèctrica del motor, i per això s’han valorat a part amb preus de referència de mercat (base ITeC 2026). </w:t>
       </w:r>
       <w:r>
         <w:rPr>
           <w:highlight w:val="yellow"/>
         </w:rPr>
-        <w:t xml:space="preserve">són preus de referència provisionals, marcats en groc: s’han de substituir pels de l’oferta de l’industrial ref. 74666 (Annex 5)</w:t>
-      </w:r>
-      <w:r>
-        <w:t xml:space="preserve">. La resta de capítols (detecció de serveis, enderrocs, fonamentació, reposicions, residus i seguretat) no hi estan inclosos i s’han valorat amb preus de referència de mercat (base ITeC 2026).</w:t>
+        <w:t xml:space="preserve">El preu de la partida 05.03 (antipànic) és una estimació: s’ha de substituir pel preu que doni Mansergas.</w:t>
       </w:r>
     </w:p>
     <w:tbl>
@@ -9391,7 +9727,7 @@
                 <w:sz w:val="15"/>
                 <w:szCs w:val="15"/>
               </w:rPr>
-              <w:t xml:space="preserve">TANCAMENTS PRACTICABLES: PORTES I REIXES (OFERTA INDUSTRIAL)</w:t>
+              <w:t xml:space="preserve">TANCAMENTS PRACTICABLES: PORTES (OFERTA J.A. MANSERGAS, SA, PRESSUPOST 74666/26)</w:t>
             </w:r>
           </w:p>
         </w:tc>
@@ -9611,7 +9947,7 @@
                 <w:sz w:val="15"/>
                 <w:szCs w:val="15"/>
               </w:rPr>
-              <w:t xml:space="preserve">Pilar de perfil tubular quadrat d’acer galvanitzat en calent de 150×150×6 mm i 3,30 m de longitud, amb placa base i tapa superior soldades, cargolat a la placa d’ancoratge, aplomat i anivellat.</w:t>
+              <w:t xml:space="preserve">Porta batent de dues fulles (cancel·la) model JAM de J.A. Mansergas, de 2.500×3.000 mm, acabat galvanitzat. Fulla d’armadura tubular d’acer amb travessers rigiditzadors, folrada amb perfil especial tipus JAM galvanitzat; gir amb cassoleta superior i pivot inferior amb rodaments de boles, allotjat en muntant lateral dimensionat segons el pes i les dimensions de la fulla. Subministrament i col·locació. (Pressupost 74666/26, codi PTOCANCJAM.)</w:t>
             </w:r>
           </w:p>
         </w:tc>
@@ -9641,7 +9977,7 @@
                 <w:sz w:val="15"/>
                 <w:szCs w:val="15"/>
               </w:rPr>
-              <w:t xml:space="preserve">5 pilars portes peatonals + 2 pilars guia porta corredissa = 7 u</w:t>
+              <w:t xml:space="preserve">4 u</w:t>
             </w:r>
           </w:p>
         </w:tc>
@@ -9671,7 +10007,7 @@
                 <w:sz w:val="15"/>
                 <w:szCs w:val="15"/>
               </w:rPr>
-              <w:t xml:space="preserve">7,00</w:t>
+              <w:t xml:space="preserve">4,00</w:t>
             </w:r>
           </w:p>
         </w:tc>
@@ -9700,9 +10036,8 @@
               <w:rPr>
                 <w:sz w:val="15"/>
                 <w:szCs w:val="15"/>
-                <w:highlight w:val="yellow"/>
-              </w:rPr>
-              <w:t xml:space="preserve">340,00</w:t>
+              </w:rPr>
+              <w:t xml:space="preserve">3.857,84</w:t>
             </w:r>
           </w:p>
         </w:tc>
@@ -9731,9 +10066,8 @@
               <w:rPr>
                 <w:sz w:val="15"/>
                 <w:szCs w:val="15"/>
-                <w:highlight w:val="yellow"/>
-              </w:rPr>
-              <w:t xml:space="preserve">2.380,00</w:t>
+              </w:rPr>
+              <w:t xml:space="preserve">15.431,36</w:t>
             </w:r>
           </w:p>
         </w:tc>
@@ -9829,7 +10163,7 @@
                 <w:sz w:val="15"/>
                 <w:szCs w:val="15"/>
               </w:rPr>
-              <w:t xml:space="preserve">Porta peatonal practicable de dues fulles batents, de 2,50 m entre eixos (2,35 m de llum de pas lliure) i 3,00 m d’alçada, amb bastidor perimetral de tub d’acer galvanitzat en calent i barrots verticals de tub quadrat de 30×30 mm, frontisses reforçades, forrellat vertical de fulla passiva amb topall a terra, pany de seguretat amb clau i maneta, i retenidors de fulla en posició oberta. Col·locada.</w:t>
+              <w:t xml:space="preserve">Porta corredissa model JAM de J.A. Mansergas, de 5.770×3.000 mm, acabat galvanitzat. Fulla d’armadura tubular d’acer amb travessers rigiditzadors, folrada amb perfils d’acer galvanitzat laminats en fred model JAM; rodes d’acer tornejades amb rodaments registrables; guia inferior calibrada de Ø 20 mm soldada sobre platines amb grapes per fixar-la al terra; torreta de suport amb rodaments de niló a la part superior; perfil en “U” de tancament. Motoritzada amb motor BK-1200 amb fotocèl·lula, banda de seguretat, avisador òptic, maniobra incorporada, finals de cursa mecànics, cremallera i desbloqueig manual en cas de tall de subministrament elèctric. Subministrament i col·locació. (Pressupost 74666/26, codi PTOCORREJAM.)</w:t>
             </w:r>
           </w:p>
         </w:tc>
@@ -9859,7 +10193,7 @@
                 <w:sz w:val="15"/>
                 <w:szCs w:val="15"/>
               </w:rPr>
-              <w:t xml:space="preserve">4 u</w:t>
+              <w:t xml:space="preserve">1 u</w:t>
             </w:r>
           </w:p>
         </w:tc>
@@ -9889,7 +10223,7 @@
                 <w:sz w:val="15"/>
                 <w:szCs w:val="15"/>
               </w:rPr>
-              <w:t xml:space="preserve">4,00</w:t>
+              <w:t xml:space="preserve">1,00</w:t>
             </w:r>
           </w:p>
         </w:tc>
@@ -9918,9 +10252,8 @@
               <w:rPr>
                 <w:sz w:val="15"/>
                 <w:szCs w:val="15"/>
-                <w:highlight w:val="yellow"/>
-              </w:rPr>
-              <w:t xml:space="preserve">2.450,00</w:t>
+              </w:rPr>
+              <w:t xml:space="preserve">8.552,41</w:t>
             </w:r>
           </w:p>
         </w:tc>
@@ -9949,9 +10282,8 @@
               <w:rPr>
                 <w:sz w:val="15"/>
                 <w:szCs w:val="15"/>
-                <w:highlight w:val="yellow"/>
-              </w:rPr>
-              <w:t xml:space="preserve">9.800,00</w:t>
+              </w:rPr>
+              <w:t xml:space="preserve">8.552,41</w:t>
             </w:r>
           </w:p>
         </w:tc>
@@ -10047,7 +10379,7 @@
                 <w:sz w:val="15"/>
                 <w:szCs w:val="15"/>
               </w:rPr>
-              <w:t xml:space="preserve">Porta corredissa de vehicles d’una fulla, de 5,77 m de llum i 3,00 m d’alçada, amb bastidor de tub d’acer galvanitzat en calent i barrots verticals de tub quadrat de 30×30 mm, carro de rodes, guia superior amb rodets, topalls de final de cursa i pany de seguretat amb clau. Accionament manual. Marcat CE segons UNE-EN 13241. Col·locada.</w:t>
+              <w:t xml:space="preserve">Kit antipànic per a porta exterior de dues fulles batents, segons UNE-EN 1125, NO INCLÒS a l’oferta de l’industrial: barra horitzontal d’empenta amb pany de cop a la fulla activa, barra antipànic de dos punts (tancament superior i inferior) a la fulla passiva, comandament exterior amb maneta i cilindre de clau, acabat apte per a exterior (inox o galvanitzat), inclosa l’adaptació del bastidor JAM i la regulació. Col·locat.</w:t>
             </w:r>
           </w:p>
         </w:tc>
@@ -10077,7 +10409,7 @@
                 <w:sz w:val="15"/>
                 <w:szCs w:val="15"/>
               </w:rPr>
-              <w:t xml:space="preserve">1 u</w:t>
+              <w:t xml:space="preserve">4 portes peatonals</w:t>
             </w:r>
           </w:p>
         </w:tc>
@@ -10107,7 +10439,7 @@
                 <w:sz w:val="15"/>
                 <w:szCs w:val="15"/>
               </w:rPr>
-              <w:t xml:space="preserve">1,00</w:t>
+              <w:t xml:space="preserve">4,00</w:t>
             </w:r>
           </w:p>
         </w:tc>
@@ -10138,7 +10470,7 @@
                 <w:szCs w:val="15"/>
                 <w:highlight w:val="yellow"/>
               </w:rPr>
-              <w:t xml:space="preserve">5.900,00</w:t>
+              <w:t xml:space="preserve">980,00</w:t>
             </w:r>
           </w:p>
         </w:tc>
@@ -10169,7 +10501,7 @@
                 <w:szCs w:val="15"/>
                 <w:highlight w:val="yellow"/>
               </w:rPr>
-              <w:t xml:space="preserve">5.900,00</w:t>
+              <w:t xml:space="preserve">3.920,00</w:t>
             </w:r>
           </w:p>
         </w:tc>
@@ -10235,7 +10567,7 @@
                 <w:sz w:val="15"/>
                 <w:szCs w:val="15"/>
               </w:rPr>
-              <w:t xml:space="preserve">m</w:t>
+              <w:t xml:space="preserve">u</w:t>
             </w:r>
           </w:p>
         </w:tc>
@@ -10265,7 +10597,7 @@
                 <w:sz w:val="15"/>
                 <w:szCs w:val="15"/>
               </w:rPr>
-              <w:t xml:space="preserve">Carril de rodolament per a porta corredissa, de perfil d’acer massís, ancorat superficialment al paviment existent amb tacs químics (sense excavació de rasa), i rampes d’acord de 1:12 als extrems.</w:t>
+              <w:t xml:space="preserve">Senyalització dels muntants amb bandes reflectants contra impactes de vehicles, i senyalització de “Sortida d’emergència” fotoluminescent a cada porta peatonal.</w:t>
             </w:r>
           </w:p>
         </w:tc>
@@ -10295,7 +10627,7 @@
                 <w:sz w:val="15"/>
                 <w:szCs w:val="15"/>
               </w:rPr>
-              <w:t xml:space="preserve">2 × 5,77 = 11,54 m</w:t>
+              <w:t xml:space="preserve">4 u</w:t>
             </w:r>
           </w:p>
         </w:tc>
@@ -10325,7 +10657,7 @@
                 <w:sz w:val="15"/>
                 <w:szCs w:val="15"/>
               </w:rPr>
-              <w:t xml:space="preserve">11,54</w:t>
+              <w:t xml:space="preserve">4,00</w:t>
             </w:r>
           </w:p>
         </w:tc>
@@ -10354,9 +10686,8 @@
               <w:rPr>
                 <w:sz w:val="15"/>
                 <w:szCs w:val="15"/>
-                <w:highlight w:val="yellow"/>
-              </w:rPr>
-              <w:t xml:space="preserve">68,00</w:t>
+              </w:rPr>
+              <w:t xml:space="preserve">45,00</w:t>
             </w:r>
           </w:p>
         </w:tc>
@@ -10385,9 +10716,8 @@
               <w:rPr>
                 <w:sz w:val="15"/>
                 <w:szCs w:val="15"/>
-                <w:highlight w:val="yellow"/>
-              </w:rPr>
-              <w:t xml:space="preserve">784,72</w:t>
+              </w:rPr>
+              <w:t xml:space="preserve">180,00</w:t>
             </w:r>
           </w:p>
         </w:tc>
@@ -10453,7 +10783,7 @@
                 <w:sz w:val="15"/>
                 <w:szCs w:val="15"/>
               </w:rPr>
-              <w:t xml:space="preserve">u</w:t>
+              <w:t xml:space="preserve">PA</w:t>
             </w:r>
           </w:p>
         </w:tc>
@@ -10483,7 +10813,7 @@
                 <w:sz w:val="15"/>
                 <w:szCs w:val="15"/>
               </w:rPr>
-              <w:t xml:space="preserve">Pintat de retocs de soldadures i talls en obra amb pintura rica en zinc (≥ 90 %) i senyalització amb bandes reflectants dels pilars davant de risc d’impacte de vehicles.</w:t>
+              <w:t xml:space="preserve">Ajudes de ram de paleta a l’industrial (excloses a l’oferta 74666/26): recepció i aplomat de muntants i torreta, fixació de la guia inferior de la corredissa amb tacs químics sobre el paviment existent i reblert de juntes.</w:t>
             </w:r>
           </w:p>
         </w:tc>
@@ -10513,7 +10843,7 @@
                 <w:sz w:val="15"/>
                 <w:szCs w:val="15"/>
               </w:rPr>
-              <w:t xml:space="preserve">7 u</w:t>
+              <w:t xml:space="preserve">1 PA</w:t>
             </w:r>
           </w:p>
         </w:tc>
@@ -10543,7 +10873,7 @@
                 <w:sz w:val="15"/>
                 <w:szCs w:val="15"/>
               </w:rPr>
-              <w:t xml:space="preserve">7,00</w:t>
+              <w:t xml:space="preserve">1,00</w:t>
             </w:r>
           </w:p>
         </w:tc>
@@ -10572,9 +10902,8 @@
               <w:rPr>
                 <w:sz w:val="15"/>
                 <w:szCs w:val="15"/>
-                <w:highlight w:val="yellow"/>
-              </w:rPr>
-              <w:t xml:space="preserve">38,00</w:t>
+              </w:rPr>
+              <w:t xml:space="preserve">650,00</w:t>
             </w:r>
           </w:p>
         </w:tc>
@@ -10603,9 +10932,8 @@
               <w:rPr>
                 <w:sz w:val="15"/>
                 <w:szCs w:val="15"/>
-                <w:highlight w:val="yellow"/>
-              </w:rPr>
-              <w:t xml:space="preserve">266,00</w:t>
+              </w:rPr>
+              <w:t xml:space="preserve">650,00</w:t>
             </w:r>
           </w:p>
         </w:tc>
@@ -10825,7 +11153,7 @@
                 <w:sz w:val="15"/>
                 <w:szCs w:val="15"/>
               </w:rPr>
-              <w:t xml:space="preserve">19.130,72</w:t>
+              <w:t xml:space="preserve">28.733,77</w:t>
             </w:r>
           </w:p>
         </w:tc>
@@ -13463,6 +13791,669 @@
                 <w:szCs w:val="15"/>
               </w:rPr>
               <w:t xml:space="preserve">450,00</w:t>
+            </w:r>
+          </w:p>
+        </w:tc>
+      </w:tr>
+      <w:tr>
+        <w:trPr>
+          <w:cantSplit/>
+          <w:tblHeader w:val="false"/>
+        </w:trPr>
+        <w:tc>
+          <w:tcPr>
+            <w:tcW w:type="dxa" w:w="650"/>
+            <w:tcBorders>
+              <w:top w:val="single" w:color="999999" w:sz="4"/>
+              <w:left w:val="single" w:color="999999" w:sz="4"/>
+              <w:bottom w:val="single" w:color="999999" w:sz="4"/>
+              <w:right w:val="single" w:color="999999" w:sz="4"/>
+            </w:tcBorders>
+            <w:shd w:fill="EEF2F6" w:color="auto" w:val="clear"/>
+            <w:tcMar>
+              <w:top w:type="dxa" w:w="50"/>
+              <w:left w:type="dxa" w:w="90"/>
+              <w:bottom w:type="dxa" w:w="50"/>
+              <w:right w:type="dxa" w:w="90"/>
+            </w:tcMar>
+            <w:vAlign w:val="center"/>
+          </w:tcPr>
+          <w:p>
+            <w:pPr>
+              <w:jc w:val="left"/>
+            </w:pPr>
+            <w:r>
+              <w:rPr>
+                <w:b/>
+                <w:bCs/>
+                <w:sz w:val="15"/>
+                <w:szCs w:val="15"/>
+              </w:rPr>
+              <w:t xml:space="preserve">09</w:t>
+            </w:r>
+          </w:p>
+        </w:tc>
+        <w:tc>
+          <w:tcPr>
+            <w:tcW w:type="dxa" w:w="450"/>
+            <w:tcBorders>
+              <w:top w:val="single" w:color="999999" w:sz="4"/>
+              <w:left w:val="single" w:color="999999" w:sz="4"/>
+              <w:bottom w:val="single" w:color="999999" w:sz="4"/>
+              <w:right w:val="single" w:color="999999" w:sz="4"/>
+            </w:tcBorders>
+            <w:shd w:fill="EEF2F6" w:color="auto" w:val="clear"/>
+            <w:tcMar>
+              <w:top w:type="dxa" w:w="50"/>
+              <w:left w:type="dxa" w:w="90"/>
+              <w:bottom w:type="dxa" w:w="50"/>
+              <w:right w:type="dxa" w:w="90"/>
+            </w:tcMar>
+            <w:vAlign w:val="center"/>
+          </w:tcPr>
+          <w:p>
+            <w:pPr>
+              <w:jc w:val="left"/>
+            </w:pPr>
+            <w:r>
+              <w:rPr>
+                <w:sz w:val="15"/>
+                <w:szCs w:val="15"/>
+              </w:rPr>
+              <w:t xml:space="preserve"/>
+            </w:r>
+          </w:p>
+        </w:tc>
+        <w:tc>
+          <w:tcPr>
+            <w:tcW w:type="dxa" w:w="3700"/>
+            <w:tcBorders>
+              <w:top w:val="single" w:color="999999" w:sz="4"/>
+              <w:left w:val="single" w:color="999999" w:sz="4"/>
+              <w:bottom w:val="single" w:color="999999" w:sz="4"/>
+              <w:right w:val="single" w:color="999999" w:sz="4"/>
+            </w:tcBorders>
+            <w:shd w:fill="EEF2F6" w:color="auto" w:val="clear"/>
+            <w:tcMar>
+              <w:top w:type="dxa" w:w="50"/>
+              <w:left w:type="dxa" w:w="90"/>
+              <w:bottom w:type="dxa" w:w="50"/>
+              <w:right w:type="dxa" w:w="90"/>
+            </w:tcMar>
+            <w:vAlign w:val="center"/>
+          </w:tcPr>
+          <w:p>
+            <w:pPr>
+              <w:jc w:val="left"/>
+            </w:pPr>
+            <w:r>
+              <w:rPr>
+                <w:b/>
+                <w:bCs/>
+                <w:sz w:val="15"/>
+                <w:szCs w:val="15"/>
+              </w:rPr>
+              <w:t xml:space="preserve">INSTAL·LACIÓ ELÈCTRICA DEL MOTOR DE LA PORTA CORREDISSA</w:t>
+            </w:r>
+          </w:p>
+        </w:tc>
+        <w:tc>
+          <w:tcPr>
+            <w:tcW w:type="dxa" w:w="1950"/>
+            <w:tcBorders>
+              <w:top w:val="single" w:color="999999" w:sz="4"/>
+              <w:left w:val="single" w:color="999999" w:sz="4"/>
+              <w:bottom w:val="single" w:color="999999" w:sz="4"/>
+              <w:right w:val="single" w:color="999999" w:sz="4"/>
+            </w:tcBorders>
+            <w:shd w:fill="EEF2F6" w:color="auto" w:val="clear"/>
+            <w:tcMar>
+              <w:top w:type="dxa" w:w="50"/>
+              <w:left w:type="dxa" w:w="90"/>
+              <w:bottom w:type="dxa" w:w="50"/>
+              <w:right w:type="dxa" w:w="90"/>
+            </w:tcMar>
+            <w:vAlign w:val="center"/>
+          </w:tcPr>
+          <w:p>
+            <w:pPr>
+              <w:jc w:val="left"/>
+            </w:pPr>
+            <w:r>
+              <w:rPr>
+                <w:sz w:val="15"/>
+                <w:szCs w:val="15"/>
+              </w:rPr>
+              <w:t xml:space="preserve"/>
+            </w:r>
+          </w:p>
+        </w:tc>
+        <w:tc>
+          <w:tcPr>
+            <w:tcW w:type="dxa" w:w="700"/>
+            <w:tcBorders>
+              <w:top w:val="single" w:color="999999" w:sz="4"/>
+              <w:left w:val="single" w:color="999999" w:sz="4"/>
+              <w:bottom w:val="single" w:color="999999" w:sz="4"/>
+              <w:right w:val="single" w:color="999999" w:sz="4"/>
+            </w:tcBorders>
+            <w:shd w:fill="EEF2F6" w:color="auto" w:val="clear"/>
+            <w:tcMar>
+              <w:top w:type="dxa" w:w="50"/>
+              <w:left w:type="dxa" w:w="90"/>
+              <w:bottom w:type="dxa" w:w="50"/>
+              <w:right w:type="dxa" w:w="90"/>
+            </w:tcMar>
+            <w:vAlign w:val="center"/>
+          </w:tcPr>
+          <w:p>
+            <w:pPr>
+              <w:jc w:val="left"/>
+            </w:pPr>
+            <w:r>
+              <w:rPr>
+                <w:sz w:val="15"/>
+                <w:szCs w:val="15"/>
+              </w:rPr>
+              <w:t xml:space="preserve"/>
+            </w:r>
+          </w:p>
+        </w:tc>
+        <w:tc>
+          <w:tcPr>
+            <w:tcW w:type="dxa" w:w="850"/>
+            <w:tcBorders>
+              <w:top w:val="single" w:color="999999" w:sz="4"/>
+              <w:left w:val="single" w:color="999999" w:sz="4"/>
+              <w:bottom w:val="single" w:color="999999" w:sz="4"/>
+              <w:right w:val="single" w:color="999999" w:sz="4"/>
+            </w:tcBorders>
+            <w:shd w:fill="EEF2F6" w:color="auto" w:val="clear"/>
+            <w:tcMar>
+              <w:top w:type="dxa" w:w="50"/>
+              <w:left w:type="dxa" w:w="90"/>
+              <w:bottom w:type="dxa" w:w="50"/>
+              <w:right w:type="dxa" w:w="90"/>
+            </w:tcMar>
+            <w:vAlign w:val="center"/>
+          </w:tcPr>
+          <w:p>
+            <w:pPr>
+              <w:jc w:val="left"/>
+            </w:pPr>
+            <w:r>
+              <w:rPr>
+                <w:sz w:val="15"/>
+                <w:szCs w:val="15"/>
+              </w:rPr>
+              <w:t xml:space="preserve"/>
+            </w:r>
+          </w:p>
+        </w:tc>
+        <w:tc>
+          <w:tcPr>
+            <w:tcW w:type="dxa" w:w="1000"/>
+            <w:tcBorders>
+              <w:top w:val="single" w:color="999999" w:sz="4"/>
+              <w:left w:val="single" w:color="999999" w:sz="4"/>
+              <w:bottom w:val="single" w:color="999999" w:sz="4"/>
+              <w:right w:val="single" w:color="999999" w:sz="4"/>
+            </w:tcBorders>
+            <w:shd w:fill="EEF2F6" w:color="auto" w:val="clear"/>
+            <w:tcMar>
+              <w:top w:type="dxa" w:w="50"/>
+              <w:left w:type="dxa" w:w="90"/>
+              <w:bottom w:type="dxa" w:w="50"/>
+              <w:right w:type="dxa" w:w="90"/>
+            </w:tcMar>
+            <w:vAlign w:val="center"/>
+          </w:tcPr>
+          <w:p>
+            <w:pPr>
+              <w:jc w:val="left"/>
+            </w:pPr>
+            <w:r>
+              <w:rPr>
+                <w:sz w:val="15"/>
+                <w:szCs w:val="15"/>
+              </w:rPr>
+              <w:t xml:space="preserve"/>
+            </w:r>
+          </w:p>
+        </w:tc>
+      </w:tr>
+      <w:tr>
+        <w:trPr>
+          <w:cantSplit/>
+          <w:tblHeader w:val="false"/>
+        </w:trPr>
+        <w:tc>
+          <w:tcPr>
+            <w:tcW w:type="dxa" w:w="650"/>
+            <w:tcBorders>
+              <w:top w:val="single" w:color="999999" w:sz="4"/>
+              <w:left w:val="single" w:color="999999" w:sz="4"/>
+              <w:bottom w:val="single" w:color="999999" w:sz="4"/>
+              <w:right w:val="single" w:color="999999" w:sz="4"/>
+            </w:tcBorders>
+            <w:tcMar>
+              <w:top w:type="dxa" w:w="50"/>
+              <w:left w:type="dxa" w:w="90"/>
+              <w:bottom w:type="dxa" w:w="50"/>
+              <w:right w:type="dxa" w:w="90"/>
+            </w:tcMar>
+            <w:vAlign w:val="center"/>
+          </w:tcPr>
+          <w:p>
+            <w:pPr>
+              <w:jc w:val="left"/>
+            </w:pPr>
+            <w:r>
+              <w:rPr>
+                <w:sz w:val="15"/>
+                <w:szCs w:val="15"/>
+              </w:rPr>
+              <w:t xml:space="preserve">09.01</w:t>
+            </w:r>
+          </w:p>
+        </w:tc>
+        <w:tc>
+          <w:tcPr>
+            <w:tcW w:type="dxa" w:w="450"/>
+            <w:tcBorders>
+              <w:top w:val="single" w:color="999999" w:sz="4"/>
+              <w:left w:val="single" w:color="999999" w:sz="4"/>
+              <w:bottom w:val="single" w:color="999999" w:sz="4"/>
+              <w:right w:val="single" w:color="999999" w:sz="4"/>
+            </w:tcBorders>
+            <w:tcMar>
+              <w:top w:type="dxa" w:w="50"/>
+              <w:left w:type="dxa" w:w="90"/>
+              <w:bottom w:type="dxa" w:w="50"/>
+              <w:right w:type="dxa" w:w="90"/>
+            </w:tcMar>
+            <w:vAlign w:val="center"/>
+          </w:tcPr>
+          <w:p>
+            <w:pPr>
+              <w:jc w:val="left"/>
+            </w:pPr>
+            <w:r>
+              <w:rPr>
+                <w:sz w:val="15"/>
+                <w:szCs w:val="15"/>
+              </w:rPr>
+              <w:t xml:space="preserve">PA</w:t>
+            </w:r>
+          </w:p>
+        </w:tc>
+        <w:tc>
+          <w:tcPr>
+            <w:tcW w:type="dxa" w:w="3700"/>
+            <w:tcBorders>
+              <w:top w:val="single" w:color="999999" w:sz="4"/>
+              <w:left w:val="single" w:color="999999" w:sz="4"/>
+              <w:bottom w:val="single" w:color="999999" w:sz="4"/>
+              <w:right w:val="single" w:color="999999" w:sz="4"/>
+            </w:tcBorders>
+            <w:tcMar>
+              <w:top w:type="dxa" w:w="50"/>
+              <w:left w:type="dxa" w:w="90"/>
+              <w:bottom w:type="dxa" w:w="50"/>
+              <w:right w:type="dxa" w:w="90"/>
+            </w:tcMar>
+            <w:vAlign w:val="center"/>
+          </w:tcPr>
+          <w:p>
+            <w:pPr>
+              <w:jc w:val="left"/>
+            </w:pPr>
+            <w:r>
+              <w:rPr>
+                <w:sz w:val="15"/>
+                <w:szCs w:val="15"/>
+              </w:rPr>
+              <w:t xml:space="preserve">Alimentació elèctrica monofàsica 230 V al motor de la porta corredissa (380 W), des del quadre existent més proper (punt a definir per la propietat): línia de cable RZ1-K 3G2,5 mm² en tub d’acer o de PVC rígid muntat superficialment per paraments existents (sense obrir rasa a la zona de la línia soterrada), protecció magnetotèrmica de 10 A i diferencial de 30 mA, caixa de connexió al costat del motor i connexió del quadre de maniobra. Inclou el butlletí de la instal·lació elèctrica.</w:t>
+            </w:r>
+          </w:p>
+        </w:tc>
+        <w:tc>
+          <w:tcPr>
+            <w:tcW w:type="dxa" w:w="1950"/>
+            <w:tcBorders>
+              <w:top w:val="single" w:color="999999" w:sz="4"/>
+              <w:left w:val="single" w:color="999999" w:sz="4"/>
+              <w:bottom w:val="single" w:color="999999" w:sz="4"/>
+              <w:right w:val="single" w:color="999999" w:sz="4"/>
+            </w:tcBorders>
+            <w:tcMar>
+              <w:top w:type="dxa" w:w="50"/>
+              <w:left w:type="dxa" w:w="90"/>
+              <w:bottom w:type="dxa" w:w="50"/>
+              <w:right w:type="dxa" w:w="90"/>
+            </w:tcMar>
+            <w:vAlign w:val="center"/>
+          </w:tcPr>
+          <w:p>
+            <w:pPr>
+              <w:jc w:val="left"/>
+            </w:pPr>
+            <w:r>
+              <w:rPr>
+                <w:sz w:val="15"/>
+                <w:szCs w:val="15"/>
+              </w:rPr>
+              <w:t xml:space="preserve">1 PA</w:t>
+            </w:r>
+          </w:p>
+        </w:tc>
+        <w:tc>
+          <w:tcPr>
+            <w:tcW w:type="dxa" w:w="700"/>
+            <w:tcBorders>
+              <w:top w:val="single" w:color="999999" w:sz="4"/>
+              <w:left w:val="single" w:color="999999" w:sz="4"/>
+              <w:bottom w:val="single" w:color="999999" w:sz="4"/>
+              <w:right w:val="single" w:color="999999" w:sz="4"/>
+            </w:tcBorders>
+            <w:tcMar>
+              <w:top w:type="dxa" w:w="50"/>
+              <w:left w:type="dxa" w:w="90"/>
+              <w:bottom w:type="dxa" w:w="50"/>
+              <w:right w:type="dxa" w:w="90"/>
+            </w:tcMar>
+            <w:vAlign w:val="center"/>
+          </w:tcPr>
+          <w:p>
+            <w:pPr>
+              <w:jc w:val="right"/>
+            </w:pPr>
+            <w:r>
+              <w:rPr>
+                <w:sz w:val="15"/>
+                <w:szCs w:val="15"/>
+              </w:rPr>
+              <w:t xml:space="preserve">1,00</w:t>
+            </w:r>
+          </w:p>
+        </w:tc>
+        <w:tc>
+          <w:tcPr>
+            <w:tcW w:type="dxa" w:w="850"/>
+            <w:tcBorders>
+              <w:top w:val="single" w:color="999999" w:sz="4"/>
+              <w:left w:val="single" w:color="999999" w:sz="4"/>
+              <w:bottom w:val="single" w:color="999999" w:sz="4"/>
+              <w:right w:val="single" w:color="999999" w:sz="4"/>
+            </w:tcBorders>
+            <w:tcMar>
+              <w:top w:type="dxa" w:w="50"/>
+              <w:left w:type="dxa" w:w="90"/>
+              <w:bottom w:type="dxa" w:w="50"/>
+              <w:right w:type="dxa" w:w="90"/>
+            </w:tcMar>
+            <w:vAlign w:val="center"/>
+          </w:tcPr>
+          <w:p>
+            <w:pPr>
+              <w:jc w:val="right"/>
+            </w:pPr>
+            <w:r>
+              <w:rPr>
+                <w:sz w:val="15"/>
+                <w:szCs w:val="15"/>
+              </w:rPr>
+              <w:t xml:space="preserve">950,00</w:t>
+            </w:r>
+          </w:p>
+        </w:tc>
+        <w:tc>
+          <w:tcPr>
+            <w:tcW w:type="dxa" w:w="1000"/>
+            <w:tcBorders>
+              <w:top w:val="single" w:color="999999" w:sz="4"/>
+              <w:left w:val="single" w:color="999999" w:sz="4"/>
+              <w:bottom w:val="single" w:color="999999" w:sz="4"/>
+              <w:right w:val="single" w:color="999999" w:sz="4"/>
+            </w:tcBorders>
+            <w:tcMar>
+              <w:top w:type="dxa" w:w="50"/>
+              <w:left w:type="dxa" w:w="90"/>
+              <w:bottom w:type="dxa" w:w="50"/>
+              <w:right w:type="dxa" w:w="90"/>
+            </w:tcMar>
+            <w:vAlign w:val="center"/>
+          </w:tcPr>
+          <w:p>
+            <w:pPr>
+              <w:jc w:val="right"/>
+            </w:pPr>
+            <w:r>
+              <w:rPr>
+                <w:sz w:val="15"/>
+                <w:szCs w:val="15"/>
+              </w:rPr>
+              <w:t xml:space="preserve">950,00</w:t>
+            </w:r>
+          </w:p>
+        </w:tc>
+      </w:tr>
+      <w:tr>
+        <w:trPr>
+          <w:cantSplit/>
+          <w:tblHeader w:val="false"/>
+        </w:trPr>
+        <w:tc>
+          <w:tcPr>
+            <w:tcW w:type="dxa" w:w="650"/>
+            <w:tcBorders>
+              <w:top w:val="single" w:color="999999" w:sz="4"/>
+              <w:left w:val="single" w:color="999999" w:sz="4"/>
+              <w:bottom w:val="single" w:color="999999" w:sz="4"/>
+              <w:right w:val="single" w:color="999999" w:sz="4"/>
+            </w:tcBorders>
+            <w:tcMar>
+              <w:top w:type="dxa" w:w="50"/>
+              <w:left w:type="dxa" w:w="90"/>
+              <w:bottom w:type="dxa" w:w="50"/>
+              <w:right w:type="dxa" w:w="90"/>
+            </w:tcMar>
+            <w:vAlign w:val="center"/>
+          </w:tcPr>
+          <w:p>
+            <w:pPr>
+              <w:jc w:val="left"/>
+            </w:pPr>
+            <w:r>
+              <w:rPr>
+                <w:sz w:val="15"/>
+                <w:szCs w:val="15"/>
+              </w:rPr>
+              <w:t xml:space="preserve"/>
+            </w:r>
+          </w:p>
+        </w:tc>
+        <w:tc>
+          <w:tcPr>
+            <w:tcW w:type="dxa" w:w="450"/>
+            <w:tcBorders>
+              <w:top w:val="single" w:color="999999" w:sz="4"/>
+              <w:left w:val="single" w:color="999999" w:sz="4"/>
+              <w:bottom w:val="single" w:color="999999" w:sz="4"/>
+              <w:right w:val="single" w:color="999999" w:sz="4"/>
+            </w:tcBorders>
+            <w:tcMar>
+              <w:top w:type="dxa" w:w="50"/>
+              <w:left w:type="dxa" w:w="90"/>
+              <w:bottom w:type="dxa" w:w="50"/>
+              <w:right w:type="dxa" w:w="90"/>
+            </w:tcMar>
+            <w:vAlign w:val="center"/>
+          </w:tcPr>
+          <w:p>
+            <w:pPr>
+              <w:jc w:val="left"/>
+            </w:pPr>
+            <w:r>
+              <w:rPr>
+                <w:sz w:val="15"/>
+                <w:szCs w:val="15"/>
+              </w:rPr>
+              <w:t xml:space="preserve"/>
+            </w:r>
+          </w:p>
+        </w:tc>
+        <w:tc>
+          <w:tcPr>
+            <w:tcW w:type="dxa" w:w="3700"/>
+            <w:tcBorders>
+              <w:top w:val="single" w:color="999999" w:sz="4"/>
+              <w:left w:val="single" w:color="999999" w:sz="4"/>
+              <w:bottom w:val="single" w:color="999999" w:sz="4"/>
+              <w:right w:val="single" w:color="999999" w:sz="4"/>
+            </w:tcBorders>
+            <w:tcMar>
+              <w:top w:type="dxa" w:w="50"/>
+              <w:left w:type="dxa" w:w="90"/>
+              <w:bottom w:type="dxa" w:w="50"/>
+              <w:right w:type="dxa" w:w="90"/>
+            </w:tcMar>
+            <w:vAlign w:val="center"/>
+          </w:tcPr>
+          <w:p>
+            <w:pPr>
+              <w:jc w:val="left"/>
+            </w:pPr>
+            <w:r>
+              <w:rPr>
+                <w:b/>
+                <w:bCs/>
+                <w:sz w:val="15"/>
+                <w:szCs w:val="15"/>
+              </w:rPr>
+              <w:t xml:space="preserve">TOTAL CAPÍTOL 09</w:t>
+            </w:r>
+          </w:p>
+        </w:tc>
+        <w:tc>
+          <w:tcPr>
+            <w:tcW w:type="dxa" w:w="1950"/>
+            <w:tcBorders>
+              <w:top w:val="single" w:color="999999" w:sz="4"/>
+              <w:left w:val="single" w:color="999999" w:sz="4"/>
+              <w:bottom w:val="single" w:color="999999" w:sz="4"/>
+              <w:right w:val="single" w:color="999999" w:sz="4"/>
+            </w:tcBorders>
+            <w:tcMar>
+              <w:top w:type="dxa" w:w="50"/>
+              <w:left w:type="dxa" w:w="90"/>
+              <w:bottom w:type="dxa" w:w="50"/>
+              <w:right w:type="dxa" w:w="90"/>
+            </w:tcMar>
+            <w:vAlign w:val="center"/>
+          </w:tcPr>
+          <w:p>
+            <w:pPr>
+              <w:jc w:val="left"/>
+            </w:pPr>
+            <w:r>
+              <w:rPr>
+                <w:sz w:val="15"/>
+                <w:szCs w:val="15"/>
+              </w:rPr>
+              <w:t xml:space="preserve"/>
+            </w:r>
+          </w:p>
+        </w:tc>
+        <w:tc>
+          <w:tcPr>
+            <w:tcW w:type="dxa" w:w="700"/>
+            <w:tcBorders>
+              <w:top w:val="single" w:color="999999" w:sz="4"/>
+              <w:left w:val="single" w:color="999999" w:sz="4"/>
+              <w:bottom w:val="single" w:color="999999" w:sz="4"/>
+              <w:right w:val="single" w:color="999999" w:sz="4"/>
+            </w:tcBorders>
+            <w:tcMar>
+              <w:top w:type="dxa" w:w="50"/>
+              <w:left w:type="dxa" w:w="90"/>
+              <w:bottom w:type="dxa" w:w="50"/>
+              <w:right w:type="dxa" w:w="90"/>
+            </w:tcMar>
+            <w:vAlign w:val="center"/>
+          </w:tcPr>
+          <w:p>
+            <w:pPr>
+              <w:jc w:val="left"/>
+            </w:pPr>
+            <w:r>
+              <w:rPr>
+                <w:sz w:val="15"/>
+                <w:szCs w:val="15"/>
+              </w:rPr>
+              <w:t xml:space="preserve"/>
+            </w:r>
+          </w:p>
+        </w:tc>
+        <w:tc>
+          <w:tcPr>
+            <w:tcW w:type="dxa" w:w="850"/>
+            <w:tcBorders>
+              <w:top w:val="single" w:color="999999" w:sz="4"/>
+              <w:left w:val="single" w:color="999999" w:sz="4"/>
+              <w:bottom w:val="single" w:color="999999" w:sz="4"/>
+              <w:right w:val="single" w:color="999999" w:sz="4"/>
+            </w:tcBorders>
+            <w:tcMar>
+              <w:top w:type="dxa" w:w="50"/>
+              <w:left w:type="dxa" w:w="90"/>
+              <w:bottom w:type="dxa" w:w="50"/>
+              <w:right w:type="dxa" w:w="90"/>
+            </w:tcMar>
+            <w:vAlign w:val="center"/>
+          </w:tcPr>
+          <w:p>
+            <w:pPr>
+              <w:jc w:val="left"/>
+            </w:pPr>
+            <w:r>
+              <w:rPr>
+                <w:sz w:val="15"/>
+                <w:szCs w:val="15"/>
+              </w:rPr>
+              <w:t xml:space="preserve"/>
+            </w:r>
+          </w:p>
+        </w:tc>
+        <w:tc>
+          <w:tcPr>
+            <w:tcW w:type="dxa" w:w="1000"/>
+            <w:tcBorders>
+              <w:top w:val="single" w:color="999999" w:sz="4"/>
+              <w:left w:val="single" w:color="999999" w:sz="4"/>
+              <w:bottom w:val="single" w:color="999999" w:sz="4"/>
+              <w:right w:val="single" w:color="999999" w:sz="4"/>
+            </w:tcBorders>
+            <w:tcMar>
+              <w:top w:type="dxa" w:w="50"/>
+              <w:left w:type="dxa" w:w="90"/>
+              <w:bottom w:type="dxa" w:w="50"/>
+              <w:right w:type="dxa" w:w="90"/>
+            </w:tcMar>
+            <w:vAlign w:val="center"/>
+          </w:tcPr>
+          <w:p>
+            <w:pPr>
+              <w:jc w:val="right"/>
+            </w:pPr>
+            <w:r>
+              <w:rPr>
+                <w:b/>
+                <w:bCs/>
+                <w:sz w:val="15"/>
+                <w:szCs w:val="15"/>
+              </w:rPr>
+              <w:t xml:space="preserve">950,00</w:t>
             </w:r>
           </w:p>
         </w:tc>
@@ -14048,7 +15039,7 @@
                 <w:sz w:val="18"/>
                 <w:szCs w:val="18"/>
               </w:rPr>
-              <w:t xml:space="preserve">TANCAMENTS PRACTICABLES: PORTES I REIXES (OFERTA INDUSTRIAL)</w:t>
+              <w:t xml:space="preserve">TANCAMENTS PRACTICABLES: PORTES (OFERTA J.A. MANSERGAS, SA, PRESSUPOST 74666/26)</w:t>
             </w:r>
           </w:p>
         </w:tc>
@@ -14077,9 +15068,8 @@
               <w:rPr>
                 <w:sz w:val="18"/>
                 <w:szCs w:val="18"/>
-                <w:highlight w:val="yellow"/>
-              </w:rPr>
-              <w:t xml:space="preserve">19.130,72</w:t>
+              </w:rPr>
+              <w:t xml:space="preserve">28.733,77</w:t>
             </w:r>
           </w:p>
         </w:tc>
@@ -14403,7 +15393,7 @@
                 <w:sz w:val="18"/>
                 <w:szCs w:val="18"/>
               </w:rPr>
-              <w:t xml:space="preserve"/>
+              <w:t xml:space="preserve">09</w:t>
             </w:r>
           </w:p>
         </w:tc>
@@ -14430,12 +15420,10 @@
             </w:pPr>
             <w:r>
               <w:rPr>
-                <w:b/>
-                <w:bCs/>
                 <w:sz w:val="18"/>
                 <w:szCs w:val="18"/>
               </w:rPr>
-              <w:t xml:space="preserve">PRESSUPOST D’EXECUCIÓ MATERIAL (PEM)</w:t>
+              <w:t xml:space="preserve">INSTAL·LACIÓ ELÈCTRICA DEL MOTOR DE LA PORTA CORREDISSA</w:t>
             </w:r>
           </w:p>
         </w:tc>
@@ -14462,12 +15450,10 @@
             </w:pPr>
             <w:r>
               <w:rPr>
-                <w:b/>
-                <w:bCs/>
                 <w:sz w:val="18"/>
                 <w:szCs w:val="18"/>
               </w:rPr>
-              <w:t xml:space="preserve">24.410,80</w:t>
+              <w:t xml:space="preserve">950,00</w:t>
             </w:r>
           </w:p>
         </w:tc>
@@ -14530,10 +15516,12 @@
             </w:pPr>
             <w:r>
               <w:rPr>
+                <w:b/>
+                <w:bCs/>
                 <w:sz w:val="18"/>
                 <w:szCs w:val="18"/>
               </w:rPr>
-              <w:t xml:space="preserve">13 % Despeses generals</w:t>
+              <w:t xml:space="preserve">PRESSUPOST D’EXECUCIÓ MATERIAL (PEM)</w:t>
             </w:r>
           </w:p>
         </w:tc>
@@ -14560,10 +15548,12 @@
             </w:pPr>
             <w:r>
               <w:rPr>
+                <w:b/>
+                <w:bCs/>
                 <w:sz w:val="18"/>
                 <w:szCs w:val="18"/>
               </w:rPr>
-              <w:t xml:space="preserve">3.173,40</w:t>
+              <w:t xml:space="preserve">34.963,85</w:t>
             </w:r>
           </w:p>
         </w:tc>
@@ -14629,7 +15619,7 @@
                 <w:sz w:val="18"/>
                 <w:szCs w:val="18"/>
               </w:rPr>
-              <w:t xml:space="preserve">6 % Benefici industrial</w:t>
+              <w:t xml:space="preserve">13 % Despeses generals</w:t>
             </w:r>
           </w:p>
         </w:tc>
@@ -14659,7 +15649,7 @@
                 <w:sz w:val="18"/>
                 <w:szCs w:val="18"/>
               </w:rPr>
-              <w:t xml:space="preserve">1.464,65</w:t>
+              <w:t xml:space="preserve">4.545,30</w:t>
             </w:r>
           </w:p>
         </w:tc>
@@ -14722,12 +15712,10 @@
             </w:pPr>
             <w:r>
               <w:rPr>
-                <w:b/>
-                <w:bCs/>
                 <w:sz w:val="18"/>
                 <w:szCs w:val="18"/>
               </w:rPr>
-              <w:t xml:space="preserve">PRESSUPOST D’EXECUCIÓ PER CONTRACTE (PEC)</w:t>
+              <w:t xml:space="preserve">6 % Benefici industrial</w:t>
             </w:r>
           </w:p>
         </w:tc>
@@ -14754,12 +15742,10 @@
             </w:pPr>
             <w:r>
               <w:rPr>
-                <w:b/>
-                <w:bCs/>
                 <w:sz w:val="18"/>
                 <w:szCs w:val="18"/>
               </w:rPr>
-              <w:t xml:space="preserve">29.048,85</w:t>
+              <w:t xml:space="preserve">2.097,83</w:t>
             </w:r>
           </w:p>
         </w:tc>
@@ -14822,10 +15808,12 @@
             </w:pPr>
             <w:r>
               <w:rPr>
+                <w:b/>
+                <w:bCs/>
                 <w:sz w:val="18"/>
                 <w:szCs w:val="18"/>
               </w:rPr>
-              <w:t xml:space="preserve">21 % IVA</w:t>
+              <w:t xml:space="preserve">PRESSUPOST D’EXECUCIÓ PER CONTRACTE (PEC)</w:t>
             </w:r>
           </w:p>
         </w:tc>
@@ -14852,10 +15840,12 @@
             </w:pPr>
             <w:r>
               <w:rPr>
+                <w:b/>
+                <w:bCs/>
                 <w:sz w:val="18"/>
                 <w:szCs w:val="18"/>
               </w:rPr>
-              <w:t xml:space="preserve">6.100,26</w:t>
+              <w:t xml:space="preserve">41.606,98</w:t>
             </w:r>
           </w:p>
         </w:tc>
@@ -14918,6 +15908,102 @@
             </w:pPr>
             <w:r>
               <w:rPr>
+                <w:sz w:val="18"/>
+                <w:szCs w:val="18"/>
+              </w:rPr>
+              <w:t xml:space="preserve">21 % IVA</w:t>
+            </w:r>
+          </w:p>
+        </w:tc>
+        <w:tc>
+          <w:tcPr>
+            <w:tcW w:type="dxa" w:w="2400"/>
+            <w:tcBorders>
+              <w:top w:val="single" w:color="999999" w:sz="4"/>
+              <w:left w:val="single" w:color="999999" w:sz="4"/>
+              <w:bottom w:val="single" w:color="999999" w:sz="4"/>
+              <w:right w:val="single" w:color="999999" w:sz="4"/>
+            </w:tcBorders>
+            <w:tcMar>
+              <w:top w:type="dxa" w:w="50"/>
+              <w:left w:type="dxa" w:w="90"/>
+              <w:bottom w:type="dxa" w:w="50"/>
+              <w:right w:type="dxa" w:w="90"/>
+            </w:tcMar>
+            <w:vAlign w:val="center"/>
+          </w:tcPr>
+          <w:p>
+            <w:pPr>
+              <w:jc w:val="right"/>
+            </w:pPr>
+            <w:r>
+              <w:rPr>
+                <w:sz w:val="18"/>
+                <w:szCs w:val="18"/>
+              </w:rPr>
+              <w:t xml:space="preserve">8.737,47</w:t>
+            </w:r>
+          </w:p>
+        </w:tc>
+      </w:tr>
+      <w:tr>
+        <w:trPr>
+          <w:cantSplit/>
+          <w:tblHeader w:val="false"/>
+        </w:trPr>
+        <w:tc>
+          <w:tcPr>
+            <w:tcW w:type="dxa" w:w="1000"/>
+            <w:tcBorders>
+              <w:top w:val="single" w:color="999999" w:sz="4"/>
+              <w:left w:val="single" w:color="999999" w:sz="4"/>
+              <w:bottom w:val="single" w:color="999999" w:sz="4"/>
+              <w:right w:val="single" w:color="999999" w:sz="4"/>
+            </w:tcBorders>
+            <w:tcMar>
+              <w:top w:type="dxa" w:w="50"/>
+              <w:left w:type="dxa" w:w="90"/>
+              <w:bottom w:type="dxa" w:w="50"/>
+              <w:right w:type="dxa" w:w="90"/>
+            </w:tcMar>
+            <w:vAlign w:val="center"/>
+          </w:tcPr>
+          <w:p>
+            <w:pPr>
+              <w:jc w:val="left"/>
+            </w:pPr>
+            <w:r>
+              <w:rPr>
+                <w:sz w:val="18"/>
+                <w:szCs w:val="18"/>
+              </w:rPr>
+              <w:t xml:space="preserve"/>
+            </w:r>
+          </w:p>
+        </w:tc>
+        <w:tc>
+          <w:tcPr>
+            <w:tcW w:type="dxa" w:w="5600"/>
+            <w:tcBorders>
+              <w:top w:val="single" w:color="999999" w:sz="4"/>
+              <w:left w:val="single" w:color="999999" w:sz="4"/>
+              <w:bottom w:val="single" w:color="999999" w:sz="4"/>
+              <w:right w:val="single" w:color="999999" w:sz="4"/>
+            </w:tcBorders>
+            <w:tcMar>
+              <w:top w:type="dxa" w:w="50"/>
+              <w:left w:type="dxa" w:w="90"/>
+              <w:bottom w:type="dxa" w:w="50"/>
+              <w:right w:type="dxa" w:w="90"/>
+            </w:tcMar>
+            <w:vAlign w:val="center"/>
+          </w:tcPr>
+          <w:p>
+            <w:pPr>
+              <w:jc w:val="left"/>
+            </w:pPr>
+            <w:r>
+              <w:rPr>
                 <w:b/>
                 <w:bCs/>
                 <w:sz w:val="18"/>
@@ -14955,7 +16041,7 @@
                 <w:sz w:val="18"/>
                 <w:szCs w:val="18"/>
               </w:rPr>
-              <w:t xml:space="preserve">35.149,11</w:t>
+              <w:t xml:space="preserve">50.344,45</w:t>
             </w:r>
           </w:p>
         </w:tc>
@@ -14980,7 +16066,7 @@
           <w:b/>
           <w:bCs/>
         </w:rPr>
-        <w:t xml:space="preserve">El pressupost d’execució material (base imposable de l’ICIO) puja a 24.410,80 €.</w:t>
+        <w:t xml:space="preserve">El pressupost d’execució material (base imposable de l’ICIO) puja a 34.963,85 €.</w:t>
       </w:r>
     </w:p>
     <w:p>
@@ -14989,13 +16075,7 @@
         <w:jc w:val="both"/>
       </w:pPr>
       <w:r>
-        <w:t xml:space="preserve">Si l’oferta de l’industrial ja inclou desmuntatge, fonamentació o transport de residus, s’han d’eliminar les partides corresponents d’aquest pressupost per no comptar-les dues vegades. </w:t>
-      </w:r>
-      <w:r>
-        <w:rPr>
-          <w:highlight w:val="yellow"/>
-        </w:rPr>
-        <w:t xml:space="preserve">[Pendent de revisar amb l’oferta ref. 74666]</w:t>
+        <w:t xml:space="preserve">L’oferta de l’industrial exclou expressament el desmuntatge d’instal·lacions i estructures i la intervenció de paletes, i no esmenta la retirada de les portes existents. Per això aquestes feines s’inclouen als capítols 02 i 05.05 d’aquest pressupost i no es compten dues vegades.</w:t>
       </w:r>
     </w:p>
     <w:p>
@@ -15032,7 +16112,7 @@
         <w:jc w:val="both"/>
       </w:pPr>
       <w:r>
-        <w:t xml:space="preserve">Termini d’execució previst: 6 setmanes des de l’adjudicació, de les quals 4 corresponen a la fabricació a taller. La durada de les obres in situ, amb el recinte tancat provisionalment, és d’unes 3 setmanes.</w:t>
+        <w:t xml:space="preserve">Termini d’execució previst: 6 setmanes des de l’adjudicació, de les quals unes 4 corresponen a la fabricació a taller (termini a confirmar amb Mansergas, que el fixa segons la càrrega de treball). La durada de les obres in situ, amb el recinte tancat provisionalment, és d’unes 3 setmanes.</w:t>
       </w:r>
     </w:p>
     <w:tbl>
@@ -15324,7 +16404,7 @@
                 <w:sz w:val="18"/>
                 <w:szCs w:val="18"/>
               </w:rPr>
-              <w:t xml:space="preserve">Fabricació a taller de portes i pilars</w:t>
+              <w:t xml:space="preserve">Fabricació a taller de portes (Mansergas)</w:t>
             </w:r>
           </w:p>
         </w:tc>
@@ -16196,7 +17276,7 @@
                 <w:sz w:val="18"/>
                 <w:szCs w:val="18"/>
               </w:rPr>
-              <w:t xml:space="preserve">Muntatge de pilars, portes i carril</w:t>
+              <w:t xml:space="preserve">Muntatge de portes, kit antipànic i guia</w:t>
             </w:r>
           </w:p>
         </w:tc>
@@ -16348,6 +17428,223 @@
                 <w:szCs w:val="18"/>
               </w:rPr>
               <w:t xml:space="preserve">■</w:t>
+            </w:r>
+          </w:p>
+        </w:tc>
+        <w:tc>
+          <w:tcPr>
+            <w:tcW w:type="dxa" w:w="800"/>
+            <w:tcBorders>
+              <w:top w:val="single" w:color="999999" w:sz="4"/>
+              <w:left w:val="single" w:color="999999" w:sz="4"/>
+              <w:bottom w:val="single" w:color="999999" w:sz="4"/>
+              <w:right w:val="single" w:color="999999" w:sz="4"/>
+            </w:tcBorders>
+            <w:shd w:fill="9DB4CC" w:color="auto" w:val="clear"/>
+            <w:tcMar>
+              <w:top w:type="dxa" w:w="50"/>
+              <w:left w:type="dxa" w:w="90"/>
+              <w:bottom w:type="dxa" w:w="50"/>
+              <w:right w:type="dxa" w:w="90"/>
+            </w:tcMar>
+            <w:vAlign w:val="center"/>
+          </w:tcPr>
+          <w:p>
+            <w:pPr>
+              <w:jc w:val="center"/>
+            </w:pPr>
+            <w:r>
+              <w:rPr>
+                <w:sz w:val="18"/>
+                <w:szCs w:val="18"/>
+              </w:rPr>
+              <w:t xml:space="preserve">■</w:t>
+            </w:r>
+          </w:p>
+        </w:tc>
+      </w:tr>
+      <w:tr>
+        <w:trPr>
+          <w:cantSplit/>
+          <w:tblHeader w:val="false"/>
+        </w:trPr>
+        <w:tc>
+          <w:tcPr>
+            <w:tcW w:type="dxa" w:w="4200"/>
+            <w:tcBorders>
+              <w:top w:val="single" w:color="999999" w:sz="4"/>
+              <w:left w:val="single" w:color="999999" w:sz="4"/>
+              <w:bottom w:val="single" w:color="999999" w:sz="4"/>
+              <w:right w:val="single" w:color="999999" w:sz="4"/>
+            </w:tcBorders>
+            <w:tcMar>
+              <w:top w:type="dxa" w:w="50"/>
+              <w:left w:type="dxa" w:w="90"/>
+              <w:bottom w:type="dxa" w:w="50"/>
+              <w:right w:type="dxa" w:w="90"/>
+            </w:tcMar>
+            <w:vAlign w:val="center"/>
+          </w:tcPr>
+          <w:p>
+            <w:pPr>
+              <w:jc w:val="left"/>
+            </w:pPr>
+            <w:r>
+              <w:rPr>
+                <w:sz w:val="18"/>
+                <w:szCs w:val="18"/>
+              </w:rPr>
+              <w:t xml:space="preserve">Alimentació elèctrica, motor i posada en marxa</w:t>
+            </w:r>
+          </w:p>
+        </w:tc>
+        <w:tc>
+          <w:tcPr>
+            <w:tcW w:type="dxa" w:w="800"/>
+            <w:tcBorders>
+              <w:top w:val="single" w:color="999999" w:sz="4"/>
+              <w:left w:val="single" w:color="999999" w:sz="4"/>
+              <w:bottom w:val="single" w:color="999999" w:sz="4"/>
+              <w:right w:val="single" w:color="999999" w:sz="4"/>
+            </w:tcBorders>
+            <w:tcMar>
+              <w:top w:type="dxa" w:w="50"/>
+              <w:left w:type="dxa" w:w="90"/>
+              <w:bottom w:type="dxa" w:w="50"/>
+              <w:right w:type="dxa" w:w="90"/>
+            </w:tcMar>
+            <w:vAlign w:val="center"/>
+          </w:tcPr>
+          <w:p>
+            <w:pPr>
+              <w:jc w:val="center"/>
+            </w:pPr>
+            <w:r>
+              <w:rPr>
+                <w:sz w:val="18"/>
+                <w:szCs w:val="18"/>
+              </w:rPr>
+              <w:t xml:space="preserve"/>
+            </w:r>
+          </w:p>
+        </w:tc>
+        <w:tc>
+          <w:tcPr>
+            <w:tcW w:type="dxa" w:w="800"/>
+            <w:tcBorders>
+              <w:top w:val="single" w:color="999999" w:sz="4"/>
+              <w:left w:val="single" w:color="999999" w:sz="4"/>
+              <w:bottom w:val="single" w:color="999999" w:sz="4"/>
+              <w:right w:val="single" w:color="999999" w:sz="4"/>
+            </w:tcBorders>
+            <w:tcMar>
+              <w:top w:type="dxa" w:w="50"/>
+              <w:left w:type="dxa" w:w="90"/>
+              <w:bottom w:type="dxa" w:w="50"/>
+              <w:right w:type="dxa" w:w="90"/>
+            </w:tcMar>
+            <w:vAlign w:val="center"/>
+          </w:tcPr>
+          <w:p>
+            <w:pPr>
+              <w:jc w:val="center"/>
+            </w:pPr>
+            <w:r>
+              <w:rPr>
+                <w:sz w:val="18"/>
+                <w:szCs w:val="18"/>
+              </w:rPr>
+              <w:t xml:space="preserve"/>
+            </w:r>
+          </w:p>
+        </w:tc>
+        <w:tc>
+          <w:tcPr>
+            <w:tcW w:type="dxa" w:w="800"/>
+            <w:tcBorders>
+              <w:top w:val="single" w:color="999999" w:sz="4"/>
+              <w:left w:val="single" w:color="999999" w:sz="4"/>
+              <w:bottom w:val="single" w:color="999999" w:sz="4"/>
+              <w:right w:val="single" w:color="999999" w:sz="4"/>
+            </w:tcBorders>
+            <w:tcMar>
+              <w:top w:type="dxa" w:w="50"/>
+              <w:left w:type="dxa" w:w="90"/>
+              <w:bottom w:type="dxa" w:w="50"/>
+              <w:right w:type="dxa" w:w="90"/>
+            </w:tcMar>
+            <w:vAlign w:val="center"/>
+          </w:tcPr>
+          <w:p>
+            <w:pPr>
+              <w:jc w:val="center"/>
+            </w:pPr>
+            <w:r>
+              <w:rPr>
+                <w:sz w:val="18"/>
+                <w:szCs w:val="18"/>
+              </w:rPr>
+              <w:t xml:space="preserve"/>
+            </w:r>
+          </w:p>
+        </w:tc>
+        <w:tc>
+          <w:tcPr>
+            <w:tcW w:type="dxa" w:w="800"/>
+            <w:tcBorders>
+              <w:top w:val="single" w:color="999999" w:sz="4"/>
+              <w:left w:val="single" w:color="999999" w:sz="4"/>
+              <w:bottom w:val="single" w:color="999999" w:sz="4"/>
+              <w:right w:val="single" w:color="999999" w:sz="4"/>
+            </w:tcBorders>
+            <w:tcMar>
+              <w:top w:type="dxa" w:w="50"/>
+              <w:left w:type="dxa" w:w="90"/>
+              <w:bottom w:type="dxa" w:w="50"/>
+              <w:right w:type="dxa" w:w="90"/>
+            </w:tcMar>
+            <w:vAlign w:val="center"/>
+          </w:tcPr>
+          <w:p>
+            <w:pPr>
+              <w:jc w:val="center"/>
+            </w:pPr>
+            <w:r>
+              <w:rPr>
+                <w:sz w:val="18"/>
+                <w:szCs w:val="18"/>
+              </w:rPr>
+              <w:t xml:space="preserve"/>
+            </w:r>
+          </w:p>
+        </w:tc>
+        <w:tc>
+          <w:tcPr>
+            <w:tcW w:type="dxa" w:w="800"/>
+            <w:tcBorders>
+              <w:top w:val="single" w:color="999999" w:sz="4"/>
+              <w:left w:val="single" w:color="999999" w:sz="4"/>
+              <w:bottom w:val="single" w:color="999999" w:sz="4"/>
+              <w:right w:val="single" w:color="999999" w:sz="4"/>
+            </w:tcBorders>
+            <w:tcMar>
+              <w:top w:type="dxa" w:w="50"/>
+              <w:left w:type="dxa" w:w="90"/>
+              <w:bottom w:type="dxa" w:w="50"/>
+              <w:right w:type="dxa" w:w="90"/>
+            </w:tcMar>
+            <w:vAlign w:val="center"/>
+          </w:tcPr>
+          <w:p>
+            <w:pPr>
+              <w:jc w:val="center"/>
+            </w:pPr>
+            <w:r>
+              <w:rPr>
+                <w:sz w:val="18"/>
+                <w:szCs w:val="18"/>
+              </w:rPr>
+              <w:t xml:space="preserve"/>
             </w:r>
           </w:p>
         </w:tc>
@@ -16946,7 +18243,7 @@
         <w:jc w:val="both"/>
       </w:pPr>
       <w:r>
-        <w:t xml:space="preserve">Pressupost d’execució material: 24.410,80 €.</w:t>
+        <w:t xml:space="preserve">Pressupost d’execució material: 34.963,85 €.</w:t>
       </w:r>
     </w:p>
     <w:p>
@@ -17531,6 +18828,72 @@
                 <w:szCs w:val="17"/>
               </w:rPr>
               <w:t xml:space="preserve">Manipulació mecànica d’elements de més de 25 kg; treball en equip.</w:t>
+            </w:r>
+          </w:p>
+        </w:tc>
+      </w:tr>
+      <w:tr>
+        <w:trPr>
+          <w:cantSplit/>
+          <w:tblHeader w:val="false"/>
+        </w:trPr>
+        <w:tc>
+          <w:tcPr>
+            <w:tcW w:type="dxa" w:w="3000"/>
+            <w:tcBorders>
+              <w:top w:val="single" w:color="999999" w:sz="4"/>
+              <w:left w:val="single" w:color="999999" w:sz="4"/>
+              <w:bottom w:val="single" w:color="999999" w:sz="4"/>
+              <w:right w:val="single" w:color="999999" w:sz="4"/>
+            </w:tcBorders>
+            <w:tcMar>
+              <w:top w:type="dxa" w:w="50"/>
+              <w:left w:type="dxa" w:w="90"/>
+              <w:bottom w:type="dxa" w:w="50"/>
+              <w:right w:type="dxa" w:w="90"/>
+            </w:tcMar>
+            <w:vAlign w:val="center"/>
+          </w:tcPr>
+          <w:p>
+            <w:pPr>
+              <w:jc w:val="left"/>
+            </w:pPr>
+            <w:r>
+              <w:rPr>
+                <w:sz w:val="17"/>
+                <w:szCs w:val="17"/>
+              </w:rPr>
+              <w:t xml:space="preserve">Contacte elèctric en la connexió del motor</w:t>
+            </w:r>
+          </w:p>
+        </w:tc>
+        <w:tc>
+          <w:tcPr>
+            <w:tcW w:type="dxa" w:w="6000"/>
+            <w:tcBorders>
+              <w:top w:val="single" w:color="999999" w:sz="4"/>
+              <w:left w:val="single" w:color="999999" w:sz="4"/>
+              <w:bottom w:val="single" w:color="999999" w:sz="4"/>
+              <w:right w:val="single" w:color="999999" w:sz="4"/>
+            </w:tcBorders>
+            <w:tcMar>
+              <w:top w:type="dxa" w:w="50"/>
+              <w:left w:type="dxa" w:w="90"/>
+              <w:bottom w:type="dxa" w:w="50"/>
+              <w:right w:type="dxa" w:w="90"/>
+            </w:tcMar>
+            <w:vAlign w:val="center"/>
+          </w:tcPr>
+          <w:p>
+            <w:pPr>
+              <w:jc w:val="left"/>
+            </w:pPr>
+            <w:r>
+              <w:rPr>
+                <w:sz w:val="17"/>
+                <w:szCs w:val="17"/>
+              </w:rPr>
+              <w:t xml:space="preserve">Treballs sense tensió, amb consignació del circuit al quadre i comprovació d’absència de tensió; per instal·lador autoritzat.</w:t>
             </w:r>
           </w:p>
         </w:tc>
@@ -18645,7 +20008,7 @@
                 <w:sz w:val="17"/>
                 <w:szCs w:val="17"/>
               </w:rPr>
-              <w:t xml:space="preserve">Comprovació d’aplomat (≤ 1/500), anivellament, llums de pas (≥ 2,30 m per porta peatonal i ≥ 15,00 m de llum útil total), funcionament de panys i retenidors i lliscament de la corredissa.</w:t>
+              <w:t xml:space="preserve">Comprovació d’aplomat (≤ 1/500), anivellament i llums de pas (≥ 2,30 m per porta peatonal i ≥ 15,00 m de llum útil total).</w:t>
             </w:r>
           </w:p>
         </w:tc>
@@ -18681,7 +20044,7 @@
                 <w:sz w:val="17"/>
                 <w:szCs w:val="17"/>
               </w:rPr>
-              <w:t xml:space="preserve">Protecció de la línia soterrada</w:t>
+              <w:t xml:space="preserve">Dispositius antipànic</w:t>
             </w:r>
           </w:p>
         </w:tc>
@@ -18711,6 +20074,204 @@
                 <w:sz w:val="17"/>
                 <w:szCs w:val="17"/>
               </w:rPr>
+              <w:t xml:space="preserve">Certificat UNE-EN 1125 i marcat CE. Prova d’obertura de cada porta des de l’interior amb la porta tancada amb clau: força d’accionament ≤ 80 N i obertura de les dues fulles.</w:t>
+            </w:r>
+          </w:p>
+        </w:tc>
+      </w:tr>
+      <w:tr>
+        <w:trPr>
+          <w:cantSplit/>
+          <w:tblHeader w:val="false"/>
+        </w:trPr>
+        <w:tc>
+          <w:tcPr>
+            <w:tcW w:type="dxa" w:w="3200"/>
+            <w:tcBorders>
+              <w:top w:val="single" w:color="999999" w:sz="4"/>
+              <w:left w:val="single" w:color="999999" w:sz="4"/>
+              <w:bottom w:val="single" w:color="999999" w:sz="4"/>
+              <w:right w:val="single" w:color="999999" w:sz="4"/>
+            </w:tcBorders>
+            <w:tcMar>
+              <w:top w:type="dxa" w:w="50"/>
+              <w:left w:type="dxa" w:w="90"/>
+              <w:bottom w:type="dxa" w:w="50"/>
+              <w:right w:type="dxa" w:w="90"/>
+            </w:tcMar>
+            <w:vAlign w:val="center"/>
+          </w:tcPr>
+          <w:p>
+            <w:pPr>
+              <w:jc w:val="left"/>
+            </w:pPr>
+            <w:r>
+              <w:rPr>
+                <w:sz w:val="17"/>
+                <w:szCs w:val="17"/>
+              </w:rPr>
+              <w:t xml:space="preserve">Porta corredissa motoritzada</w:t>
+            </w:r>
+          </w:p>
+        </w:tc>
+        <w:tc>
+          <w:tcPr>
+            <w:tcW w:type="dxa" w:w="5800"/>
+            <w:tcBorders>
+              <w:top w:val="single" w:color="999999" w:sz="4"/>
+              <w:left w:val="single" w:color="999999" w:sz="4"/>
+              <w:bottom w:val="single" w:color="999999" w:sz="4"/>
+              <w:right w:val="single" w:color="999999" w:sz="4"/>
+            </w:tcBorders>
+            <w:tcMar>
+              <w:top w:type="dxa" w:w="50"/>
+              <w:left w:type="dxa" w:w="90"/>
+              <w:bottom w:type="dxa" w:w="50"/>
+              <w:right w:type="dxa" w:w="90"/>
+            </w:tcMar>
+            <w:vAlign w:val="center"/>
+          </w:tcPr>
+          <w:p>
+            <w:pPr>
+              <w:jc w:val="left"/>
+            </w:pPr>
+            <w:r>
+              <w:rPr>
+                <w:sz w:val="17"/>
+                <w:szCs w:val="17"/>
+              </w:rPr>
+              <w:t xml:space="preserve">Declaració CE, expedient tècnic, manual d’ús i llibre de manteniment (UNE-EN 13241). Assaig de forces segons UNE-EN 12445 i prova de fotocèl·lula, banda de seguretat i desbloqueig manual.</w:t>
+            </w:r>
+          </w:p>
+        </w:tc>
+      </w:tr>
+      <w:tr>
+        <w:trPr>
+          <w:cantSplit/>
+          <w:tblHeader w:val="false"/>
+        </w:trPr>
+        <w:tc>
+          <w:tcPr>
+            <w:tcW w:type="dxa" w:w="3200"/>
+            <w:tcBorders>
+              <w:top w:val="single" w:color="999999" w:sz="4"/>
+              <w:left w:val="single" w:color="999999" w:sz="4"/>
+              <w:bottom w:val="single" w:color="999999" w:sz="4"/>
+              <w:right w:val="single" w:color="999999" w:sz="4"/>
+            </w:tcBorders>
+            <w:tcMar>
+              <w:top w:type="dxa" w:w="50"/>
+              <w:left w:type="dxa" w:w="90"/>
+              <w:bottom w:type="dxa" w:w="50"/>
+              <w:right w:type="dxa" w:w="90"/>
+            </w:tcMar>
+            <w:vAlign w:val="center"/>
+          </w:tcPr>
+          <w:p>
+            <w:pPr>
+              <w:jc w:val="left"/>
+            </w:pPr>
+            <w:r>
+              <w:rPr>
+                <w:sz w:val="17"/>
+                <w:szCs w:val="17"/>
+              </w:rPr>
+              <w:t xml:space="preserve">Instal·lació elèctrica</w:t>
+            </w:r>
+          </w:p>
+        </w:tc>
+        <w:tc>
+          <w:tcPr>
+            <w:tcW w:type="dxa" w:w="5800"/>
+            <w:tcBorders>
+              <w:top w:val="single" w:color="999999" w:sz="4"/>
+              <w:left w:val="single" w:color="999999" w:sz="4"/>
+              <w:bottom w:val="single" w:color="999999" w:sz="4"/>
+              <w:right w:val="single" w:color="999999" w:sz="4"/>
+            </w:tcBorders>
+            <w:tcMar>
+              <w:top w:type="dxa" w:w="50"/>
+              <w:left w:type="dxa" w:w="90"/>
+              <w:bottom w:type="dxa" w:w="50"/>
+              <w:right w:type="dxa" w:w="90"/>
+            </w:tcMar>
+            <w:vAlign w:val="center"/>
+          </w:tcPr>
+          <w:p>
+            <w:pPr>
+              <w:jc w:val="left"/>
+            </w:pPr>
+            <w:r>
+              <w:rPr>
+                <w:sz w:val="17"/>
+                <w:szCs w:val="17"/>
+              </w:rPr>
+              <w:t xml:space="preserve">Verificació del diferencial de 30 mA i lliurament del butlletí.</w:t>
+            </w:r>
+          </w:p>
+        </w:tc>
+      </w:tr>
+      <w:tr>
+        <w:trPr>
+          <w:cantSplit/>
+          <w:tblHeader w:val="false"/>
+        </w:trPr>
+        <w:tc>
+          <w:tcPr>
+            <w:tcW w:type="dxa" w:w="3200"/>
+            <w:tcBorders>
+              <w:top w:val="single" w:color="999999" w:sz="4"/>
+              <w:left w:val="single" w:color="999999" w:sz="4"/>
+              <w:bottom w:val="single" w:color="999999" w:sz="4"/>
+              <w:right w:val="single" w:color="999999" w:sz="4"/>
+            </w:tcBorders>
+            <w:tcMar>
+              <w:top w:type="dxa" w:w="50"/>
+              <w:left w:type="dxa" w:w="90"/>
+              <w:bottom w:type="dxa" w:w="50"/>
+              <w:right w:type="dxa" w:w="90"/>
+            </w:tcMar>
+            <w:vAlign w:val="center"/>
+          </w:tcPr>
+          <w:p>
+            <w:pPr>
+              <w:jc w:val="left"/>
+            </w:pPr>
+            <w:r>
+              <w:rPr>
+                <w:sz w:val="17"/>
+                <w:szCs w:val="17"/>
+              </w:rPr>
+              <w:t xml:space="preserve">Protecció de la línia soterrada</w:t>
+            </w:r>
+          </w:p>
+        </w:tc>
+        <w:tc>
+          <w:tcPr>
+            <w:tcW w:type="dxa" w:w="5800"/>
+            <w:tcBorders>
+              <w:top w:val="single" w:color="999999" w:sz="4"/>
+              <w:left w:val="single" w:color="999999" w:sz="4"/>
+              <w:bottom w:val="single" w:color="999999" w:sz="4"/>
+              <w:right w:val="single" w:color="999999" w:sz="4"/>
+            </w:tcBorders>
+            <w:tcMar>
+              <w:top w:type="dxa" w:w="50"/>
+              <w:left w:type="dxa" w:w="90"/>
+              <w:bottom w:type="dxa" w:w="50"/>
+              <w:right w:type="dxa" w:w="90"/>
+            </w:tcMar>
+            <w:vAlign w:val="center"/>
+          </w:tcPr>
+          <w:p>
+            <w:pPr>
+              <w:jc w:val="left"/>
+            </w:pPr>
+            <w:r>
+              <w:rPr>
+                <w:sz w:val="17"/>
+                <w:szCs w:val="17"/>
+              </w:rPr>
               <w:t xml:space="preserve">Informe de detecció de serveis abans d’excavar i acta de replanteig dels daus signada per la direcció facultativa.</w:t>
             </w:r>
           </w:p>
@@ -18736,7 +20297,894 @@
         <w:jc w:val="both"/>
       </w:pPr>
       <w:r>
-        <w:t xml:space="preserve">S’adjunta l’oferta de l’industrial per al subministrament i la col·locació de les portes, les reixes i els pilars (document ref. 74666).</w:t>
+        <w:t xml:space="preserve">Pressupost núm. 74666/26 de J.A. Mansergas, SA (CIF A58075250, Rubí), de 23 de setembre de 2026, amb referència “Recinte 3 Xemeneies”.</w:t>
+      </w:r>
+    </w:p>
+    <w:tbl>
+      <w:tblPr>
+        <w:tblW w:type="dxa" w:w="9000"/>
+        <w:tblBorders>
+          <w:top w:val="single" w:color="auto" w:sz="4"/>
+          <w:left w:val="single" w:color="auto" w:sz="4"/>
+          <w:bottom w:val="single" w:color="auto" w:sz="4"/>
+          <w:right w:val="single" w:color="auto" w:sz="4"/>
+          <w:insideH w:val="single" w:color="auto" w:sz="4"/>
+          <w:insideV w:val="single" w:color="auto" w:sz="4"/>
+        </w:tblBorders>
+      </w:tblPr>
+      <w:tblGrid>
+        <w:gridCol w:w="1800"/>
+        <w:gridCol w:w="900"/>
+        <w:gridCol w:w="4300"/>
+        <w:gridCol w:w="2000"/>
+      </w:tblGrid>
+      <w:tr>
+        <w:trPr>
+          <w:cantSplit/>
+          <w:tblHeader/>
+        </w:trPr>
+        <w:tc>
+          <w:tcPr>
+            <w:tcW w:type="dxa" w:w="1800"/>
+            <w:tcBorders>
+              <w:top w:val="single" w:color="999999" w:sz="4"/>
+              <w:left w:val="single" w:color="999999" w:sz="4"/>
+              <w:bottom w:val="single" w:color="999999" w:sz="4"/>
+              <w:right w:val="single" w:color="999999" w:sz="4"/>
+            </w:tcBorders>
+            <w:shd w:fill="D9E2EC" w:color="auto" w:val="clear"/>
+            <w:tcMar>
+              <w:top w:type="dxa" w:w="50"/>
+              <w:left w:type="dxa" w:w="90"/>
+              <w:bottom w:type="dxa" w:w="50"/>
+              <w:right w:type="dxa" w:w="90"/>
+            </w:tcMar>
+            <w:vAlign w:val="center"/>
+          </w:tcPr>
+          <w:p>
+            <w:pPr>
+              <w:jc w:val="left"/>
+            </w:pPr>
+            <w:r>
+              <w:rPr>
+                <w:b/>
+                <w:bCs/>
+                <w:sz w:val="17"/>
+                <w:szCs w:val="17"/>
+              </w:rPr>
+              <w:t xml:space="preserve">Codi</w:t>
+            </w:r>
+          </w:p>
+        </w:tc>
+        <w:tc>
+          <w:tcPr>
+            <w:tcW w:type="dxa" w:w="900"/>
+            <w:tcBorders>
+              <w:top w:val="single" w:color="999999" w:sz="4"/>
+              <w:left w:val="single" w:color="999999" w:sz="4"/>
+              <w:bottom w:val="single" w:color="999999" w:sz="4"/>
+              <w:right w:val="single" w:color="999999" w:sz="4"/>
+            </w:tcBorders>
+            <w:shd w:fill="D9E2EC" w:color="auto" w:val="clear"/>
+            <w:tcMar>
+              <w:top w:type="dxa" w:w="50"/>
+              <w:left w:type="dxa" w:w="90"/>
+              <w:bottom w:type="dxa" w:w="50"/>
+              <w:right w:type="dxa" w:w="90"/>
+            </w:tcMar>
+            <w:vAlign w:val="center"/>
+          </w:tcPr>
+          <w:p>
+            <w:pPr>
+              <w:jc w:val="left"/>
+            </w:pPr>
+            <w:r>
+              <w:rPr>
+                <w:b/>
+                <w:bCs/>
+                <w:sz w:val="17"/>
+                <w:szCs w:val="17"/>
+              </w:rPr>
+              <w:t xml:space="preserve">Ud</w:t>
+            </w:r>
+          </w:p>
+        </w:tc>
+        <w:tc>
+          <w:tcPr>
+            <w:tcW w:type="dxa" w:w="4300"/>
+            <w:tcBorders>
+              <w:top w:val="single" w:color="999999" w:sz="4"/>
+              <w:left w:val="single" w:color="999999" w:sz="4"/>
+              <w:bottom w:val="single" w:color="999999" w:sz="4"/>
+              <w:right w:val="single" w:color="999999" w:sz="4"/>
+            </w:tcBorders>
+            <w:shd w:fill="D9E2EC" w:color="auto" w:val="clear"/>
+            <w:tcMar>
+              <w:top w:type="dxa" w:w="50"/>
+              <w:left w:type="dxa" w:w="90"/>
+              <w:bottom w:type="dxa" w:w="50"/>
+              <w:right w:type="dxa" w:w="90"/>
+            </w:tcMar>
+            <w:vAlign w:val="center"/>
+          </w:tcPr>
+          <w:p>
+            <w:pPr>
+              <w:jc w:val="left"/>
+            </w:pPr>
+            <w:r>
+              <w:rPr>
+                <w:b/>
+                <w:bCs/>
+                <w:sz w:val="17"/>
+                <w:szCs w:val="17"/>
+              </w:rPr>
+              <w:t xml:space="preserve">Descripció</w:t>
+            </w:r>
+          </w:p>
+        </w:tc>
+        <w:tc>
+          <w:tcPr>
+            <w:tcW w:type="dxa" w:w="2000"/>
+            <w:tcBorders>
+              <w:top w:val="single" w:color="999999" w:sz="4"/>
+              <w:left w:val="single" w:color="999999" w:sz="4"/>
+              <w:bottom w:val="single" w:color="999999" w:sz="4"/>
+              <w:right w:val="single" w:color="999999" w:sz="4"/>
+            </w:tcBorders>
+            <w:shd w:fill="D9E2EC" w:color="auto" w:val="clear"/>
+            <w:tcMar>
+              <w:top w:type="dxa" w:w="50"/>
+              <w:left w:type="dxa" w:w="90"/>
+              <w:bottom w:type="dxa" w:w="50"/>
+              <w:right w:type="dxa" w:w="90"/>
+            </w:tcMar>
+            <w:vAlign w:val="center"/>
+          </w:tcPr>
+          <w:p>
+            <w:pPr>
+              <w:jc w:val="left"/>
+            </w:pPr>
+            <w:r>
+              <w:rPr>
+                <w:b/>
+                <w:bCs/>
+                <w:sz w:val="17"/>
+                <w:szCs w:val="17"/>
+              </w:rPr>
+              <w:t xml:space="preserve">Import (€)</w:t>
+            </w:r>
+          </w:p>
+        </w:tc>
+      </w:tr>
+      <w:tr>
+        <w:trPr>
+          <w:cantSplit/>
+          <w:tblHeader w:val="false"/>
+        </w:trPr>
+        <w:tc>
+          <w:tcPr>
+            <w:tcW w:type="dxa" w:w="1800"/>
+            <w:tcBorders>
+              <w:top w:val="single" w:color="999999" w:sz="4"/>
+              <w:left w:val="single" w:color="999999" w:sz="4"/>
+              <w:bottom w:val="single" w:color="999999" w:sz="4"/>
+              <w:right w:val="single" w:color="999999" w:sz="4"/>
+            </w:tcBorders>
+            <w:tcMar>
+              <w:top w:type="dxa" w:w="50"/>
+              <w:left w:type="dxa" w:w="90"/>
+              <w:bottom w:type="dxa" w:w="50"/>
+              <w:right w:type="dxa" w:w="90"/>
+            </w:tcMar>
+            <w:vAlign w:val="center"/>
+          </w:tcPr>
+          <w:p>
+            <w:pPr>
+              <w:jc w:val="left"/>
+            </w:pPr>
+            <w:r>
+              <w:rPr>
+                <w:sz w:val="17"/>
+                <w:szCs w:val="17"/>
+              </w:rPr>
+              <w:t xml:space="preserve">PTOCORREJAM</w:t>
+            </w:r>
+          </w:p>
+        </w:tc>
+        <w:tc>
+          <w:tcPr>
+            <w:tcW w:type="dxa" w:w="900"/>
+            <w:tcBorders>
+              <w:top w:val="single" w:color="999999" w:sz="4"/>
+              <w:left w:val="single" w:color="999999" w:sz="4"/>
+              <w:bottom w:val="single" w:color="999999" w:sz="4"/>
+              <w:right w:val="single" w:color="999999" w:sz="4"/>
+            </w:tcBorders>
+            <w:tcMar>
+              <w:top w:type="dxa" w:w="50"/>
+              <w:left w:type="dxa" w:w="90"/>
+              <w:bottom w:type="dxa" w:w="50"/>
+              <w:right w:type="dxa" w:w="90"/>
+            </w:tcMar>
+            <w:vAlign w:val="center"/>
+          </w:tcPr>
+          <w:p>
+            <w:pPr>
+              <w:jc w:val="right"/>
+            </w:pPr>
+            <w:r>
+              <w:rPr>
+                <w:sz w:val="17"/>
+                <w:szCs w:val="17"/>
+              </w:rPr>
+              <w:t xml:space="preserve">1</w:t>
+            </w:r>
+          </w:p>
+        </w:tc>
+        <w:tc>
+          <w:tcPr>
+            <w:tcW w:type="dxa" w:w="4300"/>
+            <w:tcBorders>
+              <w:top w:val="single" w:color="999999" w:sz="4"/>
+              <w:left w:val="single" w:color="999999" w:sz="4"/>
+              <w:bottom w:val="single" w:color="999999" w:sz="4"/>
+              <w:right w:val="single" w:color="999999" w:sz="4"/>
+            </w:tcBorders>
+            <w:tcMar>
+              <w:top w:type="dxa" w:w="50"/>
+              <w:left w:type="dxa" w:w="90"/>
+              <w:bottom w:type="dxa" w:w="50"/>
+              <w:right w:type="dxa" w:w="90"/>
+            </w:tcMar>
+            <w:vAlign w:val="center"/>
+          </w:tcPr>
+          <w:p>
+            <w:pPr>
+              <w:jc w:val="left"/>
+            </w:pPr>
+            <w:r>
+              <w:rPr>
+                <w:sz w:val="17"/>
+                <w:szCs w:val="17"/>
+              </w:rPr>
+              <w:t xml:space="preserve">Porta corredissa JAM de 5.770×3.000 mm, galvanitzada, motoritzada (BK-1200)</w:t>
+            </w:r>
+          </w:p>
+        </w:tc>
+        <w:tc>
+          <w:tcPr>
+            <w:tcW w:type="dxa" w:w="2000"/>
+            <w:tcBorders>
+              <w:top w:val="single" w:color="999999" w:sz="4"/>
+              <w:left w:val="single" w:color="999999" w:sz="4"/>
+              <w:bottom w:val="single" w:color="999999" w:sz="4"/>
+              <w:right w:val="single" w:color="999999" w:sz="4"/>
+            </w:tcBorders>
+            <w:tcMar>
+              <w:top w:type="dxa" w:w="50"/>
+              <w:left w:type="dxa" w:w="90"/>
+              <w:bottom w:type="dxa" w:w="50"/>
+              <w:right w:type="dxa" w:w="90"/>
+            </w:tcMar>
+            <w:vAlign w:val="center"/>
+          </w:tcPr>
+          <w:p>
+            <w:pPr>
+              <w:jc w:val="right"/>
+            </w:pPr>
+            <w:r>
+              <w:rPr>
+                <w:sz w:val="17"/>
+                <w:szCs w:val="17"/>
+              </w:rPr>
+              <w:t xml:space="preserve">8.552,41</w:t>
+            </w:r>
+          </w:p>
+        </w:tc>
+      </w:tr>
+      <w:tr>
+        <w:trPr>
+          <w:cantSplit/>
+          <w:tblHeader w:val="false"/>
+        </w:trPr>
+        <w:tc>
+          <w:tcPr>
+            <w:tcW w:type="dxa" w:w="1800"/>
+            <w:tcBorders>
+              <w:top w:val="single" w:color="999999" w:sz="4"/>
+              <w:left w:val="single" w:color="999999" w:sz="4"/>
+              <w:bottom w:val="single" w:color="999999" w:sz="4"/>
+              <w:right w:val="single" w:color="999999" w:sz="4"/>
+            </w:tcBorders>
+            <w:tcMar>
+              <w:top w:type="dxa" w:w="50"/>
+              <w:left w:type="dxa" w:w="90"/>
+              <w:bottom w:type="dxa" w:w="50"/>
+              <w:right w:type="dxa" w:w="90"/>
+            </w:tcMar>
+            <w:vAlign w:val="center"/>
+          </w:tcPr>
+          <w:p>
+            <w:pPr>
+              <w:jc w:val="left"/>
+            </w:pPr>
+            <w:r>
+              <w:rPr>
+                <w:sz w:val="17"/>
+                <w:szCs w:val="17"/>
+              </w:rPr>
+              <w:t xml:space="preserve">PTOCANCJAM</w:t>
+            </w:r>
+          </w:p>
+        </w:tc>
+        <w:tc>
+          <w:tcPr>
+            <w:tcW w:type="dxa" w:w="900"/>
+            <w:tcBorders>
+              <w:top w:val="single" w:color="999999" w:sz="4"/>
+              <w:left w:val="single" w:color="999999" w:sz="4"/>
+              <w:bottom w:val="single" w:color="999999" w:sz="4"/>
+              <w:right w:val="single" w:color="999999" w:sz="4"/>
+            </w:tcBorders>
+            <w:tcMar>
+              <w:top w:type="dxa" w:w="50"/>
+              <w:left w:type="dxa" w:w="90"/>
+              <w:bottom w:type="dxa" w:w="50"/>
+              <w:right w:type="dxa" w:w="90"/>
+            </w:tcMar>
+            <w:vAlign w:val="center"/>
+          </w:tcPr>
+          <w:p>
+            <w:pPr>
+              <w:jc w:val="right"/>
+            </w:pPr>
+            <w:r>
+              <w:rPr>
+                <w:sz w:val="17"/>
+                <w:szCs w:val="17"/>
+              </w:rPr>
+              <w:t xml:space="preserve">4</w:t>
+            </w:r>
+          </w:p>
+        </w:tc>
+        <w:tc>
+          <w:tcPr>
+            <w:tcW w:type="dxa" w:w="4300"/>
+            <w:tcBorders>
+              <w:top w:val="single" w:color="999999" w:sz="4"/>
+              <w:left w:val="single" w:color="999999" w:sz="4"/>
+              <w:bottom w:val="single" w:color="999999" w:sz="4"/>
+              <w:right w:val="single" w:color="999999" w:sz="4"/>
+            </w:tcBorders>
+            <w:tcMar>
+              <w:top w:type="dxa" w:w="50"/>
+              <w:left w:type="dxa" w:w="90"/>
+              <w:bottom w:type="dxa" w:w="50"/>
+              <w:right w:type="dxa" w:w="90"/>
+            </w:tcMar>
+            <w:vAlign w:val="center"/>
+          </w:tcPr>
+          <w:p>
+            <w:pPr>
+              <w:jc w:val="left"/>
+            </w:pPr>
+            <w:r>
+              <w:rPr>
+                <w:sz w:val="17"/>
+                <w:szCs w:val="17"/>
+              </w:rPr>
+              <w:t xml:space="preserve">Cancel·la JAM de 2 fulles de 2.500×3.000 mm, galvanitzada (3.857,84 €/u)</w:t>
+            </w:r>
+          </w:p>
+        </w:tc>
+        <w:tc>
+          <w:tcPr>
+            <w:tcW w:type="dxa" w:w="2000"/>
+            <w:tcBorders>
+              <w:top w:val="single" w:color="999999" w:sz="4"/>
+              <w:left w:val="single" w:color="999999" w:sz="4"/>
+              <w:bottom w:val="single" w:color="999999" w:sz="4"/>
+              <w:right w:val="single" w:color="999999" w:sz="4"/>
+            </w:tcBorders>
+            <w:tcMar>
+              <w:top w:type="dxa" w:w="50"/>
+              <w:left w:type="dxa" w:w="90"/>
+              <w:bottom w:type="dxa" w:w="50"/>
+              <w:right w:type="dxa" w:w="90"/>
+            </w:tcMar>
+            <w:vAlign w:val="center"/>
+          </w:tcPr>
+          <w:p>
+            <w:pPr>
+              <w:jc w:val="right"/>
+            </w:pPr>
+            <w:r>
+              <w:rPr>
+                <w:sz w:val="17"/>
+                <w:szCs w:val="17"/>
+              </w:rPr>
+              <w:t xml:space="preserve">15.431,36</w:t>
+            </w:r>
+          </w:p>
+        </w:tc>
+      </w:tr>
+      <w:tr>
+        <w:trPr>
+          <w:cantSplit/>
+          <w:tblHeader w:val="false"/>
+        </w:trPr>
+        <w:tc>
+          <w:tcPr>
+            <w:tcW w:type="dxa" w:w="1800"/>
+            <w:tcBorders>
+              <w:top w:val="single" w:color="999999" w:sz="4"/>
+              <w:left w:val="single" w:color="999999" w:sz="4"/>
+              <w:bottom w:val="single" w:color="999999" w:sz="4"/>
+              <w:right w:val="single" w:color="999999" w:sz="4"/>
+            </w:tcBorders>
+            <w:tcMar>
+              <w:top w:type="dxa" w:w="50"/>
+              <w:left w:type="dxa" w:w="90"/>
+              <w:bottom w:type="dxa" w:w="50"/>
+              <w:right w:type="dxa" w:w="90"/>
+            </w:tcMar>
+            <w:vAlign w:val="center"/>
+          </w:tcPr>
+          <w:p>
+            <w:pPr>
+              <w:jc w:val="left"/>
+            </w:pPr>
+            <w:r>
+              <w:rPr>
+                <w:sz w:val="17"/>
+                <w:szCs w:val="17"/>
+              </w:rPr>
+              <w:t xml:space="preserve"/>
+            </w:r>
+          </w:p>
+        </w:tc>
+        <w:tc>
+          <w:tcPr>
+            <w:tcW w:type="dxa" w:w="900"/>
+            <w:tcBorders>
+              <w:top w:val="single" w:color="999999" w:sz="4"/>
+              <w:left w:val="single" w:color="999999" w:sz="4"/>
+              <w:bottom w:val="single" w:color="999999" w:sz="4"/>
+              <w:right w:val="single" w:color="999999" w:sz="4"/>
+            </w:tcBorders>
+            <w:tcMar>
+              <w:top w:type="dxa" w:w="50"/>
+              <w:left w:type="dxa" w:w="90"/>
+              <w:bottom w:type="dxa" w:w="50"/>
+              <w:right w:type="dxa" w:w="90"/>
+            </w:tcMar>
+            <w:vAlign w:val="center"/>
+          </w:tcPr>
+          <w:p>
+            <w:pPr>
+              <w:jc w:val="left"/>
+            </w:pPr>
+            <w:r>
+              <w:rPr>
+                <w:sz w:val="17"/>
+                <w:szCs w:val="17"/>
+              </w:rPr>
+              <w:t xml:space="preserve"/>
+            </w:r>
+          </w:p>
+        </w:tc>
+        <w:tc>
+          <w:tcPr>
+            <w:tcW w:type="dxa" w:w="4300"/>
+            <w:tcBorders>
+              <w:top w:val="single" w:color="999999" w:sz="4"/>
+              <w:left w:val="single" w:color="999999" w:sz="4"/>
+              <w:bottom w:val="single" w:color="999999" w:sz="4"/>
+              <w:right w:val="single" w:color="999999" w:sz="4"/>
+            </w:tcBorders>
+            <w:tcMar>
+              <w:top w:type="dxa" w:w="50"/>
+              <w:left w:type="dxa" w:w="90"/>
+              <w:bottom w:type="dxa" w:w="50"/>
+              <w:right w:type="dxa" w:w="90"/>
+            </w:tcMar>
+            <w:vAlign w:val="center"/>
+          </w:tcPr>
+          <w:p>
+            <w:pPr>
+              <w:jc w:val="left"/>
+            </w:pPr>
+            <w:r>
+              <w:rPr>
+                <w:b/>
+                <w:bCs/>
+                <w:sz w:val="17"/>
+                <w:szCs w:val="17"/>
+              </w:rPr>
+              <w:t xml:space="preserve">Base imposable</w:t>
+            </w:r>
+          </w:p>
+        </w:tc>
+        <w:tc>
+          <w:tcPr>
+            <w:tcW w:type="dxa" w:w="2000"/>
+            <w:tcBorders>
+              <w:top w:val="single" w:color="999999" w:sz="4"/>
+              <w:left w:val="single" w:color="999999" w:sz="4"/>
+              <w:bottom w:val="single" w:color="999999" w:sz="4"/>
+              <w:right w:val="single" w:color="999999" w:sz="4"/>
+            </w:tcBorders>
+            <w:tcMar>
+              <w:top w:type="dxa" w:w="50"/>
+              <w:left w:type="dxa" w:w="90"/>
+              <w:bottom w:type="dxa" w:w="50"/>
+              <w:right w:type="dxa" w:w="90"/>
+            </w:tcMar>
+            <w:vAlign w:val="center"/>
+          </w:tcPr>
+          <w:p>
+            <w:pPr>
+              <w:jc w:val="right"/>
+            </w:pPr>
+            <w:r>
+              <w:rPr>
+                <w:b/>
+                <w:bCs/>
+                <w:sz w:val="17"/>
+                <w:szCs w:val="17"/>
+              </w:rPr>
+              <w:t xml:space="preserve">23.983,77</w:t>
+            </w:r>
+          </w:p>
+        </w:tc>
+      </w:tr>
+      <w:tr>
+        <w:trPr>
+          <w:cantSplit/>
+          <w:tblHeader w:val="false"/>
+        </w:trPr>
+        <w:tc>
+          <w:tcPr>
+            <w:tcW w:type="dxa" w:w="1800"/>
+            <w:tcBorders>
+              <w:top w:val="single" w:color="999999" w:sz="4"/>
+              <w:left w:val="single" w:color="999999" w:sz="4"/>
+              <w:bottom w:val="single" w:color="999999" w:sz="4"/>
+              <w:right w:val="single" w:color="999999" w:sz="4"/>
+            </w:tcBorders>
+            <w:tcMar>
+              <w:top w:type="dxa" w:w="50"/>
+              <w:left w:type="dxa" w:w="90"/>
+              <w:bottom w:type="dxa" w:w="50"/>
+              <w:right w:type="dxa" w:w="90"/>
+            </w:tcMar>
+            <w:vAlign w:val="center"/>
+          </w:tcPr>
+          <w:p>
+            <w:pPr>
+              <w:jc w:val="left"/>
+            </w:pPr>
+            <w:r>
+              <w:rPr>
+                <w:sz w:val="17"/>
+                <w:szCs w:val="17"/>
+              </w:rPr>
+              <w:t xml:space="preserve"/>
+            </w:r>
+          </w:p>
+        </w:tc>
+        <w:tc>
+          <w:tcPr>
+            <w:tcW w:type="dxa" w:w="900"/>
+            <w:tcBorders>
+              <w:top w:val="single" w:color="999999" w:sz="4"/>
+              <w:left w:val="single" w:color="999999" w:sz="4"/>
+              <w:bottom w:val="single" w:color="999999" w:sz="4"/>
+              <w:right w:val="single" w:color="999999" w:sz="4"/>
+            </w:tcBorders>
+            <w:tcMar>
+              <w:top w:type="dxa" w:w="50"/>
+              <w:left w:type="dxa" w:w="90"/>
+              <w:bottom w:type="dxa" w:w="50"/>
+              <w:right w:type="dxa" w:w="90"/>
+            </w:tcMar>
+            <w:vAlign w:val="center"/>
+          </w:tcPr>
+          <w:p>
+            <w:pPr>
+              <w:jc w:val="left"/>
+            </w:pPr>
+            <w:r>
+              <w:rPr>
+                <w:sz w:val="17"/>
+                <w:szCs w:val="17"/>
+              </w:rPr>
+              <w:t xml:space="preserve"/>
+            </w:r>
+          </w:p>
+        </w:tc>
+        <w:tc>
+          <w:tcPr>
+            <w:tcW w:type="dxa" w:w="4300"/>
+            <w:tcBorders>
+              <w:top w:val="single" w:color="999999" w:sz="4"/>
+              <w:left w:val="single" w:color="999999" w:sz="4"/>
+              <w:bottom w:val="single" w:color="999999" w:sz="4"/>
+              <w:right w:val="single" w:color="999999" w:sz="4"/>
+            </w:tcBorders>
+            <w:tcMar>
+              <w:top w:type="dxa" w:w="50"/>
+              <w:left w:type="dxa" w:w="90"/>
+              <w:bottom w:type="dxa" w:w="50"/>
+              <w:right w:type="dxa" w:w="90"/>
+            </w:tcMar>
+            <w:vAlign w:val="center"/>
+          </w:tcPr>
+          <w:p>
+            <w:pPr>
+              <w:jc w:val="left"/>
+            </w:pPr>
+            <w:r>
+              <w:rPr>
+                <w:sz w:val="17"/>
+                <w:szCs w:val="17"/>
+              </w:rPr>
+              <w:t xml:space="preserve">IVA 21 %</w:t>
+            </w:r>
+          </w:p>
+        </w:tc>
+        <w:tc>
+          <w:tcPr>
+            <w:tcW w:type="dxa" w:w="2000"/>
+            <w:tcBorders>
+              <w:top w:val="single" w:color="999999" w:sz="4"/>
+              <w:left w:val="single" w:color="999999" w:sz="4"/>
+              <w:bottom w:val="single" w:color="999999" w:sz="4"/>
+              <w:right w:val="single" w:color="999999" w:sz="4"/>
+            </w:tcBorders>
+            <w:tcMar>
+              <w:top w:type="dxa" w:w="50"/>
+              <w:left w:type="dxa" w:w="90"/>
+              <w:bottom w:type="dxa" w:w="50"/>
+              <w:right w:type="dxa" w:w="90"/>
+            </w:tcMar>
+            <w:vAlign w:val="center"/>
+          </w:tcPr>
+          <w:p>
+            <w:pPr>
+              <w:jc w:val="right"/>
+            </w:pPr>
+            <w:r>
+              <w:rPr>
+                <w:sz w:val="17"/>
+                <w:szCs w:val="17"/>
+              </w:rPr>
+              <w:t xml:space="preserve">5.036,59</w:t>
+            </w:r>
+          </w:p>
+        </w:tc>
+      </w:tr>
+      <w:tr>
+        <w:trPr>
+          <w:cantSplit/>
+          <w:tblHeader w:val="false"/>
+        </w:trPr>
+        <w:tc>
+          <w:tcPr>
+            <w:tcW w:type="dxa" w:w="1800"/>
+            <w:tcBorders>
+              <w:top w:val="single" w:color="999999" w:sz="4"/>
+              <w:left w:val="single" w:color="999999" w:sz="4"/>
+              <w:bottom w:val="single" w:color="999999" w:sz="4"/>
+              <w:right w:val="single" w:color="999999" w:sz="4"/>
+            </w:tcBorders>
+            <w:tcMar>
+              <w:top w:type="dxa" w:w="50"/>
+              <w:left w:type="dxa" w:w="90"/>
+              <w:bottom w:type="dxa" w:w="50"/>
+              <w:right w:type="dxa" w:w="90"/>
+            </w:tcMar>
+            <w:vAlign w:val="center"/>
+          </w:tcPr>
+          <w:p>
+            <w:pPr>
+              <w:jc w:val="left"/>
+            </w:pPr>
+            <w:r>
+              <w:rPr>
+                <w:sz w:val="17"/>
+                <w:szCs w:val="17"/>
+              </w:rPr>
+              <w:t xml:space="preserve"/>
+            </w:r>
+          </w:p>
+        </w:tc>
+        <w:tc>
+          <w:tcPr>
+            <w:tcW w:type="dxa" w:w="900"/>
+            <w:tcBorders>
+              <w:top w:val="single" w:color="999999" w:sz="4"/>
+              <w:left w:val="single" w:color="999999" w:sz="4"/>
+              <w:bottom w:val="single" w:color="999999" w:sz="4"/>
+              <w:right w:val="single" w:color="999999" w:sz="4"/>
+            </w:tcBorders>
+            <w:tcMar>
+              <w:top w:type="dxa" w:w="50"/>
+              <w:left w:type="dxa" w:w="90"/>
+              <w:bottom w:type="dxa" w:w="50"/>
+              <w:right w:type="dxa" w:w="90"/>
+            </w:tcMar>
+            <w:vAlign w:val="center"/>
+          </w:tcPr>
+          <w:p>
+            <w:pPr>
+              <w:jc w:val="left"/>
+            </w:pPr>
+            <w:r>
+              <w:rPr>
+                <w:sz w:val="17"/>
+                <w:szCs w:val="17"/>
+              </w:rPr>
+              <w:t xml:space="preserve"/>
+            </w:r>
+          </w:p>
+        </w:tc>
+        <w:tc>
+          <w:tcPr>
+            <w:tcW w:type="dxa" w:w="4300"/>
+            <w:tcBorders>
+              <w:top w:val="single" w:color="999999" w:sz="4"/>
+              <w:left w:val="single" w:color="999999" w:sz="4"/>
+              <w:bottom w:val="single" w:color="999999" w:sz="4"/>
+              <w:right w:val="single" w:color="999999" w:sz="4"/>
+            </w:tcBorders>
+            <w:tcMar>
+              <w:top w:type="dxa" w:w="50"/>
+              <w:left w:type="dxa" w:w="90"/>
+              <w:bottom w:type="dxa" w:w="50"/>
+              <w:right w:type="dxa" w:w="90"/>
+            </w:tcMar>
+            <w:vAlign w:val="center"/>
+          </w:tcPr>
+          <w:p>
+            <w:pPr>
+              <w:jc w:val="left"/>
+            </w:pPr>
+            <w:r>
+              <w:rPr>
+                <w:b/>
+                <w:bCs/>
+                <w:sz w:val="17"/>
+                <w:szCs w:val="17"/>
+              </w:rPr>
+              <w:t xml:space="preserve">Total oferta</w:t>
+            </w:r>
+          </w:p>
+        </w:tc>
+        <w:tc>
+          <w:tcPr>
+            <w:tcW w:type="dxa" w:w="2000"/>
+            <w:tcBorders>
+              <w:top w:val="single" w:color="999999" w:sz="4"/>
+              <w:left w:val="single" w:color="999999" w:sz="4"/>
+              <w:bottom w:val="single" w:color="999999" w:sz="4"/>
+              <w:right w:val="single" w:color="999999" w:sz="4"/>
+            </w:tcBorders>
+            <w:tcMar>
+              <w:top w:type="dxa" w:w="50"/>
+              <w:left w:type="dxa" w:w="90"/>
+              <w:bottom w:type="dxa" w:w="50"/>
+              <w:right w:type="dxa" w:w="90"/>
+            </w:tcMar>
+            <w:vAlign w:val="center"/>
+          </w:tcPr>
+          <w:p>
+            <w:pPr>
+              <w:jc w:val="right"/>
+            </w:pPr>
+            <w:r>
+              <w:rPr>
+                <w:b/>
+                <w:bCs/>
+                <w:sz w:val="17"/>
+                <w:szCs w:val="17"/>
+              </w:rPr>
+              <w:t xml:space="preserve">29.020,36</w:t>
+            </w:r>
+          </w:p>
+        </w:tc>
+      </w:tr>
+    </w:tbl>
+    <w:p>
+      <w:pPr>
+        <w:spacing w:after="60" w:before="0" w:line="300"/>
+        <w:jc w:val="both"/>
+      </w:pPr>
+      <w:r>
+        <w:t xml:space="preserve"/>
+      </w:r>
+    </w:p>
+    <w:p>
+      <w:pPr>
+        <w:spacing w:after="120" w:before="0" w:line="300"/>
+        <w:jc w:val="both"/>
+      </w:pPr>
+      <w:r>
+        <w:rPr>
+          <w:b/>
+          <w:bCs/>
+        </w:rPr>
+        <w:t xml:space="preserve">Condicions rellevants de l’oferta:</w:t>
+      </w:r>
+    </w:p>
+    <w:p>
+      <w:pPr>
+        <w:pStyle w:val="ListParagraph"/>
+        <w:numPr>
+          <w:ilvl w:val="0"/>
+          <w:numId w:val="4"/>
+        </w:numPr>
+        <w:spacing w:after="60" w:line="300"/>
+        <w:jc w:val="both"/>
+      </w:pPr>
+      <w:r>
+        <w:t xml:space="preserve">Inclou el desplaçament per comprovar mides, i el subministrament i la col·locació de les portes.</w:t>
+      </w:r>
+    </w:p>
+    <w:p>
+      <w:pPr>
+        <w:pStyle w:val="ListParagraph"/>
+        <w:numPr>
+          <w:ilvl w:val="0"/>
+          <w:numId w:val="4"/>
+        </w:numPr>
+        <w:spacing w:after="60" w:line="300"/>
+        <w:jc w:val="both"/>
+      </w:pPr>
+      <w:r>
+        <w:t xml:space="preserve">Exclou el desmuntatge d’instal·lacions i estructures i la intervenció de paletes.</w:t>
+      </w:r>
+    </w:p>
+    <w:p>
+      <w:pPr>
+        <w:pStyle w:val="ListParagraph"/>
+        <w:numPr>
+          <w:ilvl w:val="0"/>
+          <w:numId w:val="4"/>
+        </w:numPr>
+        <w:spacing w:after="60" w:line="300"/>
+        <w:jc w:val="both"/>
+      </w:pPr>
+      <w:r>
+        <w:t xml:space="preserve">La presa de corrent per al motor, la maniobra i els sistemes de seguretat ha d’estar al punt previst quan es munti la porta.</w:t>
+      </w:r>
+    </w:p>
+    <w:p>
+      <w:pPr>
+        <w:pStyle w:val="ListParagraph"/>
+        <w:numPr>
+          <w:ilvl w:val="0"/>
+          <w:numId w:val="4"/>
+        </w:numPr>
+        <w:spacing w:after="60" w:line="300"/>
+        <w:jc w:val="both"/>
+      </w:pPr>
+      <w:r>
+        <w:t xml:space="preserve">No inclou dispositius antipànic. Les portes peatonals del projecte els han d’incorporar (UNE-EN 1125).</w:t>
+      </w:r>
+    </w:p>
+    <w:p>
+      <w:pPr>
+        <w:pStyle w:val="ListParagraph"/>
+        <w:numPr>
+          <w:ilvl w:val="0"/>
+          <w:numId w:val="4"/>
+        </w:numPr>
+        <w:spacing w:after="60" w:line="300"/>
+        <w:jc w:val="both"/>
+      </w:pPr>
+      <w:r>
+        <w:t xml:space="preserve">Validesa de 15 dies. Pagament: 40 % de bestreta i la resta en acabar l’obra.</w:t>
       </w:r>
     </w:p>
     <w:p>
@@ -18748,7 +21196,7 @@
         <w:rPr>
           <w:highlight w:val="yellow"/>
         </w:rPr>
-        <w:t xml:space="preserve">[Adjuntar el PDF “74666 IGNASI TUTZÓ.pdf” en compondre el document final]</w:t>
+        <w:t xml:space="preserve">Adjuntar el PDF original “74666 IGNASI TUTZÓ.pdf” en compondre el document final, i demanar a Mansergas una oferta complementària amb el kit antipànic i la confirmació del gir cap a l’exterior.</w:t>
       </w:r>
     </w:p>
     <w:p>

</xml_diff>

<commit_message>
Memòria: fotos i fotogrames de l'estat actual, resolució 178/26, portes obrint cap a l'exterior amb antipànic i alimentació del motor des del quadre 7
Co-Authored-By: Claude Opus 5.5 <noreply@anthropic.com>
Claude-Session: https://claude.ai/code/session_01LriNJKpLsMik4TbQD5oKzn
</commit_message>
<xml_diff>
--- a/memoria/20261005 - Memòria substitució portes accés Nau Turbines.docx
+++ b/memoria/20261005 - Memòria substitució portes accés Nau Turbines.docx
@@ -558,7 +558,7 @@
         <w:jc w:val="both"/>
       </w:pPr>
       <w:r>
-        <w:t xml:space="preserve">No intervé cap altre tècnic en la redacció d’aquest projecte.</w:t>
+        <w:t xml:space="preserve">No intervé cap altre tècnic en la redacció d’aquest projecte. El mateix tècnic té encarregades la direcció d’obra i la coordinació de seguretat i salut.</w:t>
       </w:r>
     </w:p>
     <w:p>
@@ -606,16 +606,7 @@
         <w:t xml:space="preserve">Encàrrec: </w:t>
       </w:r>
       <w:r>
-        <w:t xml:space="preserve">Resolució del Consorci del Besòs núm. 178/26 </w:t>
-      </w:r>
-      <w:r>
-        <w:rPr>
-          <w:highlight w:val="yellow"/>
-        </w:rPr>
-        <w:t xml:space="preserve">(data: [··/··/2026])</w:t>
-      </w:r>
-      <w:r>
-        <w:t xml:space="preserve">.</w:t>
+        <w:t xml:space="preserve">Resolució del Consorci del Besòs de 15 de setembre de 2026 (expedient 178/26, codi 26XF0019), d’adjudicació del contracte menor de serveis de redacció de projecte, direcció d’obres i coordinació de seguretat i salut per a la renovació de la porta d’accés al recinte de la Nau de Turbines des de l’Av. d’Eduard Maristany.</w:t>
       </w:r>
     </w:p>
     <w:p>
@@ -796,7 +787,7 @@
         <w:jc w:val="both"/>
       </w:pPr>
       <w:r>
-        <w:t xml:space="preserve">Actualment aquest tancament es troba malmès per l’impacte de vehicles: hi ha fulles deformades i desplomades, pilars desplaçats i elements de tancament i maniobra que no funcionen correctament, de manera que el recinte no queda tancat amb garanties i les fulles no es poden obrir i fixar adequadament (vegeu l’Annex 1, reportatge fotogràfic). A més, la configuració de quatre portes batents de gran format no permet el pas còmode de vehicles de manteniment i de servei al recinte, que és precisament l’origen dels impactes.</w:t>
+        <w:t xml:space="preserve">Actualment aquest tancament es troba malmès per l’impacte de vehicles (vegeu l’Annex 1, reportatge fotogràfic): el pòrtic superior d’acer que lliga els muntants està deformat; diverses fulles estan desplomades i fora de pla; els muntants centrals s’han hagut d’apuntalar provisionalment amb tornapuntes; i alguna fulla s’ha hagut de tancar amb cadena perquè els panys i forrellats no funcionen. L’accés està abalisat amb cinta, i el recinte no queda tancat amb garanties ni les portes es poden obrir i tancar amb normalitat. Les portes existents obren cap a l’exterior (sentit de l’evacuació) i tenen barres antipànic, que s’han de mantenir a la nova solució. A més, la configuració de quatre portes batents de gran format no permet el pas còmode de vehicles de manteniment i de servei, que és precisament l’origen dels impactes.</w:t>
       </w:r>
     </w:p>
     <w:p>
@@ -831,7 +822,7 @@
         <w:t xml:space="preserve">Línia elèctrica soterrada. </w:t>
       </w:r>
       <w:r>
-        <w:t xml:space="preserve">Al llarg de la base de la tanca discorre una línia elèctrica soterrada (vegeu plànols, element 8), que no es pot afectar. Aquest condicionant determina la posició, la mida i el procediment d’execució de la nova fonamentació (vegeu MC.3 i MC.4).</w:t>
+        <w:t xml:space="preserve">Al llarg de la base de la tanca discorre una línia elèctrica soterrada, que no es pot afectar. Aquest condicionant determina la posició, la mida i el procediment d’execució de la nova fonamentació (vegeu MC.3 i MC.4).</w:t>
       </w:r>
     </w:p>
     <w:p>
@@ -940,7 +931,7 @@
         <w:t xml:space="preserve">Quatre portes peatonals d’accés i evacuació </w:t>
       </w:r>
       <w:r>
-        <w:t xml:space="preserve">de dues fulles batents cadascuna (model JAM), de 2,50 m entre eixos (2,35 m de llum de pas lliure) i 3,00 m d’alçada, que obren en el sentit de l’evacuació (cap a l’avinguda) i porten </w:t>
+        <w:t xml:space="preserve">de dues fulles batents cadascuna (model JAM), de 2,50 m entre eixos (2,35 m de llum de pas lliure) i 3,00 m d’alçada, que obren cap a l’exterior (sentit de l’evacuació), com les actuals, i mantenen les </w:t>
       </w:r>
       <w:r>
         <w:rPr>
@@ -950,7 +941,7 @@
         <w:t xml:space="preserve">barres antipànic segons UNE-EN 1125</w:t>
       </w:r>
       <w:r>
-        <w:t xml:space="preserve"> i comandament exterior amb clau.</w:t>
+        <w:t xml:space="preserve">, amb comandament exterior amb clau.</w:t>
       </w:r>
     </w:p>
     <w:p>
@@ -1006,18 +997,19 @@
     </w:p>
     <w:p>
       <w:pPr>
+        <w:pStyle w:val="Heading3"/>
+      </w:pPr>
+      <w:r>
+        <w:t xml:space="preserve">MD2.2. JUSTIFICACIÓ DEL COMPLIMENT DE LA NORMATIVA URBANÍSTICA I MUNICIPAL</w:t>
+      </w:r>
+    </w:p>
+    <w:p>
+      <w:pPr>
         <w:spacing w:after="120" w:before="0" w:line="300"/>
         <w:jc w:val="both"/>
       </w:pPr>
       <w:r>
-        <w:rPr>
-          <w:b/>
-          <w:bCs/>
-        </w:rPr>
-        <w:t xml:space="preserve">Canvi del sentit d’obertura respecte de l’estat actual. </w:t>
-      </w:r>
-      <w:r>
-        <w:t xml:space="preserve">Les portes existents obren cap a l’interior del recinte. Les noves portes peatonals obriran cap a l’exterior, que és el sentit de l’evacuació, perquè les barres antipànic puguin funcionar (CTE DB SI 3, apartat 6). En obrir-se, les fulles (≈ 1,18 m) escombren l’espai d’accés d’uns 3,80 m de fondària que hi ha entre la línia de portes i l’alineació de l’Avinguda d’Eduard Maristany, sense arribar a la vorera.</w:t>
+        <w:t xml:space="preserve">L’actuació és una substitució d’un element de tancament existent per un altre de característiques i dimensions anàlogues. No altera l’alineació, l’alçada (3,00 m, igual que l’existent), l’ocupació, l’edificabilitat ni l’ús del recinte. És compatible amb el planejament vigent (PDU de les Tres Xemeneies) i amb el règim d’activitats esporàdiques amb què es van tramitar els projectes originals.</w:t>
       </w:r>
     </w:p>
     <w:p>
@@ -1026,36 +1018,7 @@
         <w:jc w:val="both"/>
       </w:pPr>
       <w:r>
-        <w:rPr>
-          <w:highlight w:val="yellow"/>
-        </w:rPr>
-        <w:t xml:space="preserve">Cal comprovar que l’espai d’accés davant de les portes és dins de l’àmbit d’ocupació directa i no és via pública, i actualitzar el plànol 02 amb les portes obrint cap a l’exterior.</w:t>
-      </w:r>
-    </w:p>
-    <w:p>
-      <w:pPr>
-        <w:pStyle w:val="Heading3"/>
-      </w:pPr>
-      <w:r>
-        <w:t xml:space="preserve">MD2.2. JUSTIFICACIÓ DEL COMPLIMENT DE LA NORMATIVA URBANÍSTICA I MUNICIPAL</w:t>
-      </w:r>
-    </w:p>
-    <w:p>
-      <w:pPr>
-        <w:spacing w:after="120" w:before="0" w:line="300"/>
-        <w:jc w:val="both"/>
-      </w:pPr>
-      <w:r>
-        <w:t xml:space="preserve">L’actuació és una substitució d’un element de tancament existent per un altre de característiques i dimensions anàlogues. No altera l’alineació, l’alçada (3,00 m, igual que l’existent), l’ocupació, l’edificabilitat ni l’ús del recinte. És compatible amb el planejament vigent (PDU de les Tres Xemeneies) i amb el règim d’activitats esporàdiques amb què es van tramitar els projectes originals.</w:t>
-      </w:r>
-    </w:p>
-    <w:p>
-      <w:pPr>
-        <w:spacing w:after="120" w:before="0" w:line="300"/>
-        <w:jc w:val="both"/>
-      </w:pPr>
-      <w:r>
-        <w:t xml:space="preserve">Les fulles batents de les portes peatonals obren cap a l’exterior dins l’espai d’accés retranquejat (≈ 3,80 m de fondària), i la porta corredissa llisca per la cara interior. Cap element mòbil envaeix la vorera de l’Avinguda d’Eduard Maristany, d’acord amb les ordenances municipals.</w:t>
+        <w:t xml:space="preserve">Les fulles batents de les portes peatonals obren cap a l’exterior, igual que les actuals, sobre l’espai d’accés davant de les portes (≈ 3,80 m de fondària fins a l’alineació de l’avinguda), i la porta corredissa llisca per la cara interior, darrere de la línia de façana de l’edifici adjacent. Es manté, per tant, la mateixa ocupació de l’espai d’accés que la de les portes existents.</w:t>
       </w:r>
     </w:p>
     <w:p>
@@ -1114,7 +1077,7 @@
         <w:t xml:space="preserve">SUA 2. </w:t>
       </w:r>
       <w:r>
-        <w:t xml:space="preserve">Quan les fulles batents s’obren cap a l’exterior, no envaeixen la vorera. La porta corredissa és motoritzada i compleix UNE-EN 13241, UNE-EN 12453 i UNE-EN 12445: fotocèl·lula, banda de seguretat sensible, avisador òptic, finals de cursa i desbloqueig manual. Els muntants se senyalitzen amb bandes reflectants contra els impactes de vehicles.</w:t>
+        <w:t xml:space="preserve">Les fulles batents obertes no envaeixen cap itinerari. La porta corredissa és motoritzada i compleix UNE-EN 13241, UNE-EN 12453 i UNE-EN 12445: fotocèl·lula, banda de seguretat sensible, avisador òptic, finals de cursa i desbloqueig manual. Els muntants se senyalitzen amb bandes reflectants contra els impactes de vehicles.</w:t>
       </w:r>
     </w:p>
     <w:p>
@@ -1809,7 +1772,7 @@
                 <w:sz w:val="18"/>
                 <w:szCs w:val="18"/>
               </w:rPr>
-              <w:t xml:space="preserve">Cap a l’interior</w:t>
+              <w:t xml:space="preserve">Cap a l’exterior (evacuació)</w:t>
             </w:r>
           </w:p>
         </w:tc>
@@ -1905,7 +1868,7 @@
                 <w:sz w:val="18"/>
                 <w:szCs w:val="18"/>
               </w:rPr>
-              <w:t xml:space="preserve">No</w:t>
+              <w:t xml:space="preserve">Sí</w:t>
             </w:r>
           </w:p>
         </w:tc>
@@ -1935,7 +1898,7 @@
                 <w:sz w:val="18"/>
                 <w:szCs w:val="18"/>
               </w:rPr>
-              <w:t xml:space="preserve">Sí, a les 4 portes</w:t>
+              <w:t xml:space="preserve">Sí, a les 4 portes (es mantenen)</w:t>
             </w:r>
           </w:p>
         </w:tc>
@@ -3559,7 +3522,7 @@
         <w:t xml:space="preserve">Sentit d’obertura: </w:t>
       </w:r>
       <w:r>
-        <w:t xml:space="preserve">obren en el sentit de l’evacuació, cap a l’Avinguda d’Eduard Maristany, tal com exigeix SI 3-6.3 per a portes previstes per a més de 100 persones. Això millora la situació actual, on les portes obren cap a l’interior.</w:t>
+        <w:t xml:space="preserve">obren en el sentit de l’evacuació, cap a l’Avinguda d’Eduard Maristany, igual que les portes existents, tal com exigeix SI 3-6.3 per a portes previstes per a més de 100 persones.</w:t>
       </w:r>
     </w:p>
     <w:p>
@@ -3580,7 +3543,7 @@
         <w:t xml:space="preserve">Sistema d’obertura: </w:t>
       </w:r>
       <w:r>
-        <w:t xml:space="preserve">són abatibles amb eix de gir vertical i porten dispositiu antipànic de barra horitzontal d’empenta segons UNE-EN 1125 a totes dues fulles, com exigeix SI 3-6.1 per a l’evacuació de més de 50 persones no familiaritzades amb la porta. Des de l’interior s’obren sempre, sense clau, encara que estiguin tancades. Des de l’exterior s’obren amb maneta i clau.</w:t>
+        <w:t xml:space="preserve">són abatibles amb eix de gir vertical i porten dispositiu antipànic de barra horitzontal d’empenta segons UNE-EN 1125 a totes dues fulles, igual que les portes existents, com exigeix SI 3-6.1 per a l’evacuació de més de 50 persones no familiaritzades amb la porta. Des de l’interior s’obren sempre, sense clau, encara que estiguin tancades. Des de l’exterior s’obren amb maneta i clau. Com que l’oferta de l’industrial no inclou els dispositius antipànic, s’hi afegeixen en una partida específica del pressupost (05.03).</w:t>
       </w:r>
     </w:p>
     <w:p>
@@ -3662,7 +3625,7 @@
         <w:rPr>
           <w:highlight w:val="yellow"/>
         </w:rPr>
-        <w:t xml:space="preserve">Cal demanar a Mansergas que confirmi que les fulles JAM de 2.500 mm donen una llum de pas lliure d’almenys 1,15 m per fulla (≥ 2,30 m per porta) i que el model JAM admet el kit antipànic UNE-EN 1125 i el gir cap a l’exterior.</w:t>
+        <w:t xml:space="preserve">Cal demanar a Mansergas que confirmi que les fulles JAM de 2.500 mm donen una llum de pas lliure d’almenys 1,15 m per fulla (≥ 2,30 m per porta) i que el model JAM admet el kit antipànic UNE-EN 1125.</w:t>
       </w:r>
     </w:p>
     <w:p>
@@ -3678,7 +3641,7 @@
         <w:t xml:space="preserve">Conclusió: </w:t>
       </w:r>
       <w:r>
-        <w:t xml:space="preserve">la nova configuració manté una llum útil de pas de 15,12 m, superior als 15 m previstos als projectes originals, i una capacitat d’evacuació de 9.072 persones amb el mateix criteri (P/600). Com que es manté la mateixa llum total entre paraments, el mateix nombre de portes peatonals i ara, a més, les portes obren en el sentit de l’evacuació i porten barres antipànic, </w:t>
+        <w:t xml:space="preserve">la nova configuració manté una llum útil de pas de 15,12 m, superior als 15 m previstos als projectes originals, i una capacitat d’evacuació de 9.072 persones amb el mateix criteri (P/600). Com que es manté la mateixa llum total entre paraments, el mateix nombre de portes peatonals i es mantenen el sentit d’obertura cap a l’exterior i les barres antipànic de les portes actuals, </w:t>
       </w:r>
       <w:r>
         <w:rPr>
@@ -3918,7 +3881,7 @@
         <w:t xml:space="preserve">Portes peatonals (4 u), cancel·la model JAM de 2.500×3.000 mm, de dues fulles: </w:t>
       </w:r>
       <w:r>
-        <w:t xml:space="preserve">fulla d’armadura tubular d’acer amb travessers rigiditzadors, folrada amb perfil especial JAM galvanitzat; gir amb cassoleta superior i pivot inferior amb rodaments de boles, allotjat en muntant lateral; acabat galvanitzat. Obertura cap a l’exterior.</w:t>
+        <w:t xml:space="preserve">fulla d’armadura tubular d’acer amb travessers rigiditzadors, folrada amb perfil especial JAM galvanitzat; gir amb cassoleta superior i pivot inferior amb rodaments de boles, allotjat en muntant lateral; acabat galvanitzat. Obertura cap a l’exterior, com les existents.</w:t>
       </w:r>
     </w:p>
     <w:p>
@@ -4015,7 +3978,7 @@
         <w:jc w:val="both"/>
       </w:pPr>
       <w:r>
-        <w:t xml:space="preserve">El motor de la porta corredissa necessita alimentació monofàsica de 230 V, que l’oferta de l’industrial no inclou. Es preveu una línia nova des del quadre existent més proper, amb cable RZ1-K 3G2,5 mm² en tub muntat superficialment pels paraments existents (mur de l’edifici adjacent), protegida amb magnetotèrmic de 10 A i diferencial de 30 mA. Així no cal obrir cap rasa a la zona de la línia elèctrica soterrada. Es farà d’acord amb el REBT i es lliurarà el butlletí corresponent.</w:t>
+        <w:t xml:space="preserve">El motor de la porta corredissa necessita alimentació monofàsica de 230 V (380 W), que l’oferta de l’industrial no inclou. S’alimentarà des del quadre elèctric existent a l’extrem esquerre de la tanca (element 7 dels plànols), amb una línia nova de cable RZ1-K 3G2,5 mm² protegida al quadre amb magnetotèrmic de 10 A i diferencial de 30 mA. Per arribar al motor, a l’extrem dret, la línia es passarà pel conducte soterrat existent Ø 50 mm (element 8), que ja creua tot el front de la tanca, fent-hi passar només el nou cable amb guia i sense manipular ni desconnectar els cables existents, de manera que no cal obrir cap rasa a la zona de la línia elèctrica soterrada. Es farà d’acord amb el REBT i es lliurarà el butlletí corresponent.</w:t>
       </w:r>
     </w:p>
     <w:p>
@@ -4027,7 +3990,7 @@
         <w:rPr>
           <w:highlight w:val="yellow"/>
         </w:rPr>
-        <w:t xml:space="preserve">Cal que la propietat indiqui el punt de subministrament (quadre) per a l’alimentació del motor.</w:t>
+        <w:t xml:space="preserve">Abans de l’obra cal comprovar que el conducte existent (element 8) té secció lliure suficient per passar-hi la nova línia, i que el quadre 7 té capacitat per a un circuit addicional. Si no en té, la línia s’haurà de passar per un tub nou, que es col·locarà sense afectar la línia existent i amb l’autorització de la direcció facultativa.</w:t>
       </w:r>
     </w:p>
     <w:p>
@@ -14113,7 +14076,7 @@
                 <w:sz w:val="15"/>
                 <w:szCs w:val="15"/>
               </w:rPr>
-              <w:t xml:space="preserve">Alimentació elèctrica monofàsica 230 V al motor de la porta corredissa (380 W), des del quadre existent més proper (punt a definir per la propietat): línia de cable RZ1-K 3G2,5 mm² en tub d’acer o de PVC rígid muntat superficialment per paraments existents (sense obrir rasa a la zona de la línia soterrada), protecció magnetotèrmica de 10 A i diferencial de 30 mA, caixa de connexió al costat del motor i connexió del quadre de maniobra. Inclou el butlletí de la instal·lació elèctrica.</w:t>
+              <w:t xml:space="preserve">Alimentació elèctrica monofàsica 230 V al motor de la porta corredissa (380 W), des del quadre elèctric existent a l’extrem esquerre de la tanca (element 7 dels plànols): línia de cable RZ1-K 3G2,5 mm² passada pel conducte soterrat existent Ø 50 mm (element 8), sense obrir rasa nova, protecció magnetotèrmica de 10 A i diferencial de 30 mA al quadre 7, caixa de connexió al costat del motor i connexió del quadre de maniobra. Inclou el butlletí de la instal·lació elèctrica.</w:t>
             </w:r>
           </w:p>
         </w:tc>
@@ -18134,24 +18097,58 @@
         <w:jc w:val="both"/>
       </w:pPr>
       <w:r>
-        <w:t xml:space="preserve">Fotografies de l’estat actual de les portes d’accés des de l’Avinguda d’Eduard Maristany, preses el 17 de juliol de 2026.</w:t>
-      </w:r>
-    </w:p>
-    <w:p>
-      <w:pPr>
-        <w:spacing w:after="600" w:before="600" w:line="300"/>
+        <w:t xml:space="preserve">Fotografies i fotogrames del vídeo de l’estat actual de les portes d’accés al recinte des de l’Avinguda d’Eduard Maristany (juliol de 2026).</w:t>
+      </w:r>
+    </w:p>
+    <w:p>
+      <w:pPr>
+        <w:spacing w:after="60" w:before="120"/>
         <w:jc w:val="center"/>
       </w:pPr>
       <w:r>
-        <w:rPr>
-          <w:highlight w:val="yellow"/>
-        </w:rPr>
-        <w:t xml:space="preserve">[Inserir aquí la fotografia 20260717_090328.jpg]</w:t>
-      </w:r>
-    </w:p>
-    <w:p>
-      <w:pPr>
-        <w:spacing w:after="120" w:before="0" w:line="300"/>
+        <w:drawing>
+          <wp:inline distT="0" distB="0" distL="0" distR="0">
+            <wp:extent cx="4572000" cy="3429000"/>
+            <wp:effectExtent t="0" r="0" b="0" l="0"/>
+            <wp:docPr id="1" name="" descr="" title=""/>
+            <wp:cNvGraphicFramePr>
+              <a:graphicFrameLocks xmlns:a="http://schemas.openxmlformats.org/drawingml/2006/main" noChangeAspect="1"/>
+            </wp:cNvGraphicFramePr>
+            <a:graphic xmlns:a="http://schemas.openxmlformats.org/drawingml/2006/main">
+              <a:graphicData uri="http://schemas.openxmlformats.org/drawingml/2006/picture">
+                <pic:pic xmlns:pic="http://schemas.openxmlformats.org/drawingml/2006/picture">
+                  <pic:nvPicPr>
+                    <pic:cNvPr id="0" name="" descr=""/>
+                    <pic:cNvPicPr>
+                      <a:picLocks noChangeAspect="1" noChangeArrowheads="1"/>
+                    </pic:cNvPicPr>
+                  </pic:nvPicPr>
+                  <pic:blipFill>
+                    <a:blip r:embed="rId17" cstate="none"/>
+                    <a:srcRect/>
+                    <a:stretch>
+                      <a:fillRect/>
+                    </a:stretch>
+                  </pic:blipFill>
+                  <pic:spPr bwMode="auto">
+                    <a:xfrm>
+                      <a:off x="0" y="0"/>
+                      <a:ext cx="4572000" cy="3429000"/>
+                    </a:xfrm>
+                    <a:prstGeom prst="rect">
+                      <a:avLst/>
+                    </a:prstGeom>
+                  </pic:spPr>
+                </pic:pic>
+              </a:graphicData>
+            </a:graphic>
+          </wp:inline>
+        </w:drawing>
+      </w:r>
+    </w:p>
+    <w:p>
+      <w:pPr>
+        <w:spacing w:after="200" w:before="0" w:line="300"/>
         <w:jc w:val="center"/>
       </w:pPr>
       <w:r>
@@ -18159,24 +18156,58 @@
           <w:i/>
           <w:iCs/>
         </w:rPr>
-        <w:t xml:space="preserve">Fotografia 1. Vista general del conjunt de portes des de l’Avinguda d’Eduard Maristany. Fulles deformades per impacte de vehicles.</w:t>
-      </w:r>
-    </w:p>
-    <w:p>
-      <w:pPr>
-        <w:spacing w:after="600" w:before="600" w:line="300"/>
+        <w:t xml:space="preserve">Fotografia 1. Vista general del conjunt de quatre portes de dues fulles. El pòrtic superior està deformat, les fulles centrals estan desplomades, els muntants estan apuntalats provisionalment amb tornapuntes i l’accés està abalisat amb cinta. Es veuen les barres antipànic de les portes existents.</w:t>
+      </w:r>
+    </w:p>
+    <w:p>
+      <w:pPr>
+        <w:spacing w:after="60" w:before="120"/>
         <w:jc w:val="center"/>
       </w:pPr>
       <w:r>
-        <w:rPr>
-          <w:highlight w:val="yellow"/>
-        </w:rPr>
-        <w:t xml:space="preserve">[Inserir aquí la fotografia 20260717_090346.jpg]</w:t>
-      </w:r>
-    </w:p>
-    <w:p>
-      <w:pPr>
-        <w:spacing w:after="120" w:before="0" w:line="300"/>
+        <w:drawing>
+          <wp:inline distT="0" distB="0" distL="0" distR="0">
+            <wp:extent cx="4572000" cy="3429000"/>
+            <wp:effectExtent t="0" r="0" b="0" l="0"/>
+            <wp:docPr id="1" name="" descr="" title=""/>
+            <wp:cNvGraphicFramePr>
+              <a:graphicFrameLocks xmlns:a="http://schemas.openxmlformats.org/drawingml/2006/main" noChangeAspect="1"/>
+            </wp:cNvGraphicFramePr>
+            <a:graphic xmlns:a="http://schemas.openxmlformats.org/drawingml/2006/main">
+              <a:graphicData uri="http://schemas.openxmlformats.org/drawingml/2006/picture">
+                <pic:pic xmlns:pic="http://schemas.openxmlformats.org/drawingml/2006/picture">
+                  <pic:nvPicPr>
+                    <pic:cNvPr id="0" name="" descr=""/>
+                    <pic:cNvPicPr>
+                      <a:picLocks noChangeAspect="1" noChangeArrowheads="1"/>
+                    </pic:cNvPicPr>
+                  </pic:nvPicPr>
+                  <pic:blipFill>
+                    <a:blip r:embed="rId18" cstate="none"/>
+                    <a:srcRect/>
+                    <a:stretch>
+                      <a:fillRect/>
+                    </a:stretch>
+                  </pic:blipFill>
+                  <pic:spPr bwMode="auto">
+                    <a:xfrm>
+                      <a:off x="0" y="0"/>
+                      <a:ext cx="4572000" cy="3429000"/>
+                    </a:xfrm>
+                    <a:prstGeom prst="rect">
+                      <a:avLst/>
+                    </a:prstGeom>
+                  </pic:spPr>
+                </pic:pic>
+              </a:graphicData>
+            </a:graphic>
+          </wp:inline>
+        </w:drawing>
+      </w:r>
+    </w:p>
+    <w:p>
+      <w:pPr>
+        <w:spacing w:after="200" w:before="0" w:line="300"/>
         <w:jc w:val="center"/>
       </w:pPr>
       <w:r>
@@ -18184,22 +18215,66 @@
           <w:i/>
           <w:iCs/>
         </w:rPr>
-        <w:t xml:space="preserve">Fotografia 2. Detall de fulles i pilars desplaçats.</w:t>
-      </w:r>
-    </w:p>
-    <w:p>
-      <w:pPr>
-        <w:spacing w:after="120" w:before="0" w:line="300"/>
-        <w:jc w:val="both"/>
-      </w:pPr>
-      <w:r>
-        <w:t xml:space="preserve">Es disposa també d’un vídeo de l’accés (Acces_NdT.mp4) a la documentació del projecte. </w:t>
-      </w:r>
+        <w:t xml:space="preserve">Fotografia 2. Vista obliqua de les portes, amb la deformació del pòrtic superior i de les fulles centrals per l’impacte de vehicles. A la dreta, el pilar de fàbrica de maó de l’extrem de la tanca.</w:t>
+      </w:r>
+    </w:p>
+    <w:p>
+      <w:pPr>
+        <w:spacing w:after="60" w:before="120"/>
+        <w:jc w:val="center"/>
+      </w:pPr>
+      <w:r>
+        <w:drawing>
+          <wp:inline distT="0" distB="0" distL="0" distR="0">
+            <wp:extent cx="4476750" cy="3905250"/>
+            <wp:effectExtent t="0" r="0" b="0" l="0"/>
+            <wp:docPr id="1" name="" descr="" title=""/>
+            <wp:cNvGraphicFramePr>
+              <a:graphicFrameLocks xmlns:a="http://schemas.openxmlformats.org/drawingml/2006/main" noChangeAspect="1"/>
+            </wp:cNvGraphicFramePr>
+            <a:graphic xmlns:a="http://schemas.openxmlformats.org/drawingml/2006/main">
+              <a:graphicData uri="http://schemas.openxmlformats.org/drawingml/2006/picture">
+                <pic:pic xmlns:pic="http://schemas.openxmlformats.org/drawingml/2006/picture">
+                  <pic:nvPicPr>
+                    <pic:cNvPr id="0" name="" descr=""/>
+                    <pic:cNvPicPr>
+                      <a:picLocks noChangeAspect="1" noChangeArrowheads="1"/>
+                    </pic:cNvPicPr>
+                  </pic:nvPicPr>
+                  <pic:blipFill>
+                    <a:blip r:embed="rId19" cstate="none"/>
+                    <a:srcRect/>
+                    <a:stretch>
+                      <a:fillRect/>
+                    </a:stretch>
+                  </pic:blipFill>
+                  <pic:spPr bwMode="auto">
+                    <a:xfrm>
+                      <a:off x="0" y="0"/>
+                      <a:ext cx="4476750" cy="3905250"/>
+                    </a:xfrm>
+                    <a:prstGeom prst="rect">
+                      <a:avLst/>
+                    </a:prstGeom>
+                  </pic:spPr>
+                </pic:pic>
+              </a:graphicData>
+            </a:graphic>
+          </wp:inline>
+        </w:drawing>
+      </w:r>
+    </w:p>
+    <w:p>
+      <w:pPr>
+        <w:spacing w:after="200" w:before="0" w:line="300"/>
+        <w:jc w:val="center"/>
+      </w:pPr>
       <w:r>
         <w:rPr>
-          <w:highlight w:val="yellow"/>
+          <w:i/>
+          <w:iCs/>
         </w:rPr>
-        <w:t xml:space="preserve">Revisar els peus de foto segons el contingut real de cada imatge.</w:t>
+        <w:t xml:space="preserve">Fotografies 3 i 4 (fotogrames del vídeo Acces_NdT.mp4). Esquerra: fulla tancada provisionalment amb cadena, barra antipànic existent i muntant desplomat amb tornapunta. Dreta: pòrtic superior deformat i fulles fora de pla.</w:t>
       </w:r>
     </w:p>
     <w:p>
@@ -19642,10 +19717,7 @@
         <w:jc w:val="both"/>
       </w:pPr>
       <w:r>
-        <w:rPr>
-          <w:highlight w:val="yellow"/>
-        </w:rPr>
-        <w:t xml:space="preserve">Calcular la fiança de residus segons l’ordenança municipal de Sant Adrià de Besòs.</w:t>
+        <w:t xml:space="preserve">La fiança de gestió de residus la tramitarà qui faci la tramitació de la llicència, d’acord amb l’ordenança municipal de Sant Adrià de Besòs. No forma part de l’abast d’aquest projecte.</w:t>
       </w:r>
     </w:p>
     <w:p>
@@ -21196,7 +21268,7 @@
         <w:rPr>
           <w:highlight w:val="yellow"/>
         </w:rPr>
-        <w:t xml:space="preserve">Adjuntar el PDF original “74666 IGNASI TUTZÓ.pdf” en compondre el document final, i demanar a Mansergas una oferta complementària amb el kit antipànic i la confirmació del gir cap a l’exterior.</w:t>
+        <w:t xml:space="preserve">Adjuntar el PDF original “74666 IGNASI TUTZÓ.pdf” en compondre el document final, i demanar a Mansergas una oferta complementària amb el kit antipànic.</w:t>
       </w:r>
     </w:p>
     <w:p>

</xml_diff>

<commit_message>
Memòria: afegeix imatge de situació de l'accés (Google Street View 2024) al reportatge fotogràfic
Co-Authored-By: Claude Opus 5.5 <noreply@anthropic.com>
Claude-Session: https://claude.ai/code/session_01LriNJKpLsMik4TbQD5oKzn
</commit_message>
<xml_diff>
--- a/memoria/20261005 - Memòria substitució portes accés Nau Turbines.docx
+++ b/memoria/20261005 - Memòria substitució portes accés Nau Turbines.docx
@@ -18097,7 +18097,7 @@
         <w:jc w:val="both"/>
       </w:pPr>
       <w:r>
-        <w:t xml:space="preserve">Fotografies i fotogrames del vídeo de l’estat actual de les portes d’accés al recinte des de l’Avinguda d’Eduard Maristany (juliol de 2026).</w:t>
+        <w:t xml:space="preserve">Imatge de situació de l’accés (Google Street View, 2024) i fotografies i fotogrames del vídeo de l’estat actual de les portes d’accés al recinte des de l’Avinguda d’Eduard Maristany (juliol de 2026).</w:t>
       </w:r>
     </w:p>
     <w:p>
@@ -18156,7 +18156,7 @@
           <w:i/>
           <w:iCs/>
         </w:rPr>
-        <w:t xml:space="preserve">Fotografia 1. Vista general del conjunt de quatre portes de dues fulles. El pòrtic superior està deformat, les fulles centrals estan desplomades, els muntants estan apuntalats provisionalment amb tornapuntes i l’accés està abalisat amb cinta. Es veuen les barres antipànic de les portes existents.</w:t>
+        <w:t xml:space="preserve">Fotografia 1. Vista de l’accés al recinte des de l’Avinguda d’Eduard Maristany, amb les Tres Xemeneies al fons. Font: Google Maps (Street View), imatge de 2024, anterior als danys actuals.</w:t>
       </w:r>
     </w:p>
     <w:p>
@@ -18215,7 +18215,7 @@
           <w:i/>
           <w:iCs/>
         </w:rPr>
-        <w:t xml:space="preserve">Fotografia 2. Vista obliqua de les portes, amb la deformació del pòrtic superior i de les fulles centrals per l’impacte de vehicles. A la dreta, el pilar de fàbrica de maó de l’extrem de la tanca.</w:t>
+        <w:t xml:space="preserve">Fotografia 2. Vista general del conjunt de quatre portes de dues fulles. El pòrtic superior està deformat, les fulles centrals estan desplomades, els muntants estan apuntalats provisionalment amb tornapuntes i l’accés està abalisat amb cinta. Es veuen les barres antipànic de les portes existents.</w:t>
       </w:r>
     </w:p>
     <w:p>
@@ -18226,7 +18226,7 @@
       <w:r>
         <w:drawing>
           <wp:inline distT="0" distB="0" distL="0" distR="0">
-            <wp:extent cx="4476750" cy="3905250"/>
+            <wp:extent cx="4572000" cy="3429000"/>
             <wp:effectExtent t="0" r="0" b="0" l="0"/>
             <wp:docPr id="1" name="" descr="" title=""/>
             <wp:cNvGraphicFramePr>
@@ -18251,6 +18251,65 @@
                   <pic:spPr bwMode="auto">
                     <a:xfrm>
                       <a:off x="0" y="0"/>
+                      <a:ext cx="4572000" cy="3429000"/>
+                    </a:xfrm>
+                    <a:prstGeom prst="rect">
+                      <a:avLst/>
+                    </a:prstGeom>
+                  </pic:spPr>
+                </pic:pic>
+              </a:graphicData>
+            </a:graphic>
+          </wp:inline>
+        </w:drawing>
+      </w:r>
+    </w:p>
+    <w:p>
+      <w:pPr>
+        <w:spacing w:after="200" w:before="0" w:line="300"/>
+        <w:jc w:val="center"/>
+      </w:pPr>
+      <w:r>
+        <w:rPr>
+          <w:i/>
+          <w:iCs/>
+        </w:rPr>
+        <w:t xml:space="preserve">Fotografia 3. Vista obliqua de les portes, amb la deformació del pòrtic superior i de les fulles centrals per l’impacte de vehicles. A la dreta, el pilar de fàbrica de maó de l’extrem de la tanca.</w:t>
+      </w:r>
+    </w:p>
+    <w:p>
+      <w:pPr>
+        <w:spacing w:after="60" w:before="120"/>
+        <w:jc w:val="center"/>
+      </w:pPr>
+      <w:r>
+        <w:drawing>
+          <wp:inline distT="0" distB="0" distL="0" distR="0">
+            <wp:extent cx="4476750" cy="3905250"/>
+            <wp:effectExtent t="0" r="0" b="0" l="0"/>
+            <wp:docPr id="1" name="" descr="" title=""/>
+            <wp:cNvGraphicFramePr>
+              <a:graphicFrameLocks xmlns:a="http://schemas.openxmlformats.org/drawingml/2006/main" noChangeAspect="1"/>
+            </wp:cNvGraphicFramePr>
+            <a:graphic xmlns:a="http://schemas.openxmlformats.org/drawingml/2006/main">
+              <a:graphicData uri="http://schemas.openxmlformats.org/drawingml/2006/picture">
+                <pic:pic xmlns:pic="http://schemas.openxmlformats.org/drawingml/2006/picture">
+                  <pic:nvPicPr>
+                    <pic:cNvPr id="0" name="" descr=""/>
+                    <pic:cNvPicPr>
+                      <a:picLocks noChangeAspect="1" noChangeArrowheads="1"/>
+                    </pic:cNvPicPr>
+                  </pic:nvPicPr>
+                  <pic:blipFill>
+                    <a:blip r:embed="rId20" cstate="none"/>
+                    <a:srcRect/>
+                    <a:stretch>
+                      <a:fillRect/>
+                    </a:stretch>
+                  </pic:blipFill>
+                  <pic:spPr bwMode="auto">
+                    <a:xfrm>
+                      <a:off x="0" y="0"/>
                       <a:ext cx="4476750" cy="3905250"/>
                     </a:xfrm>
                     <a:prstGeom prst="rect">
@@ -18274,7 +18333,7 @@
           <w:i/>
           <w:iCs/>
         </w:rPr>
-        <w:t xml:space="preserve">Fotografies 3 i 4 (fotogrames del vídeo Acces_NdT.mp4). Esquerra: fulla tancada provisionalment amb cadena, barra antipànic existent i muntant desplomat amb tornapunta. Dreta: pòrtic superior deformat i fulles fora de pla.</w:t>
+        <w:t xml:space="preserve">Fotografies 4 i 5 (fotogrames del vídeo Acces_NdT.mp4). Esquerra: fulla tancada provisionalment amb cadena, barra antipànic existent i muntant desplomat amb tornapunta. Dreta: pòrtic superior deformat i fulles fora de pla.</w:t>
       </w:r>
     </w:p>
     <w:p>

</xml_diff>

<commit_message>
Memòria: plànol EON núm. 03, muntants 100x200, llum 2,40 m per mòdul, descripcions genèriques per a licitació i sense annex d'oferta
Co-Authored-By: Claude Opus 5.5 <noreply@anthropic.com>
Claude-Session: https://claude.ai/code/session_01LriNJKpLsMik4TbQD5oKzn
</commit_message>
<xml_diff>
--- a/memoria/20261005 - Memòria substitució portes accés Nau Turbines.docx
+++ b/memoria/20261005 - Memòria substitució portes accés Nau Turbines.docx
@@ -331,16 +331,6 @@
       </w:pPr>
       <w:r>
         <w:t xml:space="preserve">4. Pla de control de qualitat</w:t>
-      </w:r>
-    </w:p>
-    <w:p>
-      <w:pPr>
-        <w:spacing w:after="40" w:before="0" w:line="300"/>
-        <w:ind w:left="567"/>
-        <w:jc w:val="both"/>
-      </w:pPr>
-      <w:r>
-        <w:t xml:space="preserve">5. Pressupost de l’industrial (oferta ref. 74666)</w:t>
       </w:r>
     </w:p>
     <w:p>
@@ -571,22 +561,6 @@
           <w:b/>
           <w:bCs/>
         </w:rPr>
-        <w:t xml:space="preserve">Industrial que ha valorat les portes: </w:t>
-      </w:r>
-      <w:r>
-        <w:t xml:space="preserve">J.A. Mansergas, SA, CIF A58075250, Rubí (Barcelona). Pressupost núm. 74666/26, de 23 de setembre de 2026.</w:t>
-      </w:r>
-    </w:p>
-    <w:p>
-      <w:pPr>
-        <w:spacing w:after="120" w:before="0" w:line="300"/>
-        <w:jc w:val="both"/>
-      </w:pPr>
-      <w:r>
-        <w:rPr>
-          <w:b/>
-          <w:bCs/>
-        </w:rPr>
         <w:t xml:space="preserve">Titular dels terrenys: </w:t>
       </w:r>
       <w:r>
@@ -670,20 +644,6 @@
     </w:p>
     <w:p>
       <w:pPr>
-        <w:pStyle w:val="ListParagraph"/>
-        <w:numPr>
-          <w:ilvl w:val="0"/>
-          <w:numId w:val="2"/>
-        </w:numPr>
-        <w:spacing w:after="60" w:line="300"/>
-        <w:jc w:val="both"/>
-      </w:pPr>
-      <w:r>
-        <w:t xml:space="preserve">Pressupost de l’industrial, oferta ref. 74666 (Annex 5).</w:t>
-      </w:r>
-    </w:p>
-    <w:p>
-      <w:pPr>
         <w:spacing w:after="120" w:before="120" w:line="300"/>
         <w:jc w:val="both"/>
       </w:pPr>
@@ -931,7 +891,7 @@
         <w:t xml:space="preserve">Quatre portes peatonals d’accés i evacuació </w:t>
       </w:r>
       <w:r>
-        <w:t xml:space="preserve">de dues fulles batents cadascuna (model JAM), de 2,50 m entre eixos (2,35 m de llum de pas lliure) i 3,00 m d’alçada, que obren cap a l’exterior (sentit de l’evacuació), com les actuals, i mantenen les </w:t>
+        <w:t xml:space="preserve">de dues fulles batents cadascuna, de 2,40 m de llum de pas lliure entre muntants i 3,00 m d’alçada, que obren cap a l’exterior (sentit de l’evacuació), com les actuals, i mantenen les </w:t>
       </w:r>
       <w:r>
         <w:rPr>
@@ -962,7 +922,7 @@
         <w:t xml:space="preserve">Una porta corredissa de vehicles </w:t>
       </w:r>
       <w:r>
-        <w:t xml:space="preserve">d’una fulla (model JAM), de 5,77 m de llum i 3,00 m d’alçada, motoritzada i amb dispositius de seguretat, que en obrir-se es desplaça cap al costat de l’edifici adjacent (costat Badalona), per darrere de la línia de façana, sense envair el pas de vianants ni la via pública.</w:t>
+        <w:t xml:space="preserve">d’una fulla, de 5,77 m de llum i 3,00 m d’alçada, motoritzada i amb dispositius de seguretat, que en obrir-se es desplaça cap al costat de l’edifici adjacent (costat Badalona), per darrere de la línia de façana, sense envair el pas de vianants ni la via pública.</w:t>
       </w:r>
     </w:p>
     <w:p>
@@ -980,10 +940,10 @@
           <w:b/>
           <w:bCs/>
         </w:rPr>
-        <w:t xml:space="preserve">Pilars d’acer galvanitzat de 150×150 mm </w:t>
-      </w:r>
-      <w:r>
-        <w:t xml:space="preserve">(muntants laterals de les cancel·les JAM, en lloc dels muntants originals de 80×80 mm), amb més inèrcia davant d’impactes, sobre nous daus de formigó executats fora del traçat de la línia elèctrica soterrada.</w:t>
+        <w:t xml:space="preserve">Muntants d’acer galvanitzat de 100×200 mm </w:t>
+      </w:r>
+      <w:r>
+        <w:t xml:space="preserve">(en lloc dels muntants originals de 80×80 mm), amb més inèrcia davant d’impactes, sobre nous daus de formigó executats fora del traçat de la línia elèctrica soterrada.</w:t>
       </w:r>
     </w:p>
     <w:p>
@@ -1098,7 +1058,7 @@
         <w:t xml:space="preserve">SUA 9 i Codi d’accessibilitat de Catalunya (Decret 209/2023). </w:t>
       </w:r>
       <w:r>
-        <w:t xml:space="preserve">Cada porta peatonal té 2,35 m de llum (cada fulla 1,10 m o més), molt per sobre del mínim d’0,80 m per a itineraris accessibles. Es manté l’itinerari accessible existent fins al nucli 1, sense desnivells, i a les dues bandes de les portes queda un espai lliure de Ø 1,50 m.</w:t>
+        <w:t xml:space="preserve">Cada porta peatonal té 2,40 m de llum (cada fulla ≈ 1,20 m), molt per sobre del mínim d’0,80 m per a itineraris accessibles. Es manté l’itinerari accessible existent fins al nucli 1, sense desnivells, i a les dues bandes de les portes queda un espai lliure de Ø 1,50 m.</w:t>
       </w:r>
     </w:p>
     <w:p>
@@ -1610,7 +1570,7 @@
                 <w:sz w:val="18"/>
                 <w:szCs w:val="18"/>
               </w:rPr>
-              <w:t xml:space="preserve">4 u de dues fulles (2,50 m entre eixos)</w:t>
+              <w:t xml:space="preserve">4 u de dues fulles (2,40 m de llum lliure)</w:t>
             </w:r>
           </w:p>
         </w:tc>
@@ -1994,7 +1954,7 @@
                 <w:sz w:val="18"/>
                 <w:szCs w:val="18"/>
               </w:rPr>
-              <w:t xml:space="preserve">Muntants laterals JAM (≈ 150×150 mm)</w:t>
+              <w:t xml:space="preserve">Perfil d’acer 100×200 mm</w:t>
             </w:r>
           </w:p>
         </w:tc>
@@ -2223,7 +2183,7 @@
         <w:jc w:val="both"/>
       </w:pPr>
       <w:r>
-        <w:t xml:space="preserve">La llum de pas útil es calcula descomptant de la llum total entre paraments (15,87 m) l’amplada dels pilars que hi queden inclosos. A la proposta hi ha 5 pilars de 0,15 m (4 de les portes peatonals i el de recepció de la corredissa), i els mòduls peatonals tenen 2,50 m entre eixos.</w:t>
+        <w:t xml:space="preserve">La llum de pas útil es calcula descomptant de la llum total entre paraments (15,87 m) l’amplada dels muntants que hi queden inclosos. A la proposta hi ha 5 muntants de 100×200 mm, col·locats amb la cara de 0,10 m en el sentit de la tanca (4 de les portes peatonals i el de recepció de la corredissa). Cada mòdul de dues portes té 2,40 m de llum lliure (2,50 m entre eixos). Comprovació: 4 × 2,40 + 5 × 0,10 + 5,77 = 15,87 m.</w:t>
       </w:r>
     </w:p>
     <w:tbl>
@@ -2535,7 +2495,7 @@
                 <w:sz w:val="18"/>
                 <w:szCs w:val="18"/>
               </w:rPr>
-              <w:t xml:space="preserve">4 × 2 fulles batents (4 × 2,35 m = 9,40 m)</w:t>
+              <w:t xml:space="preserve">4 × 2 fulles batents (4 × 2,40 m = 9,60 m)</w:t>
             </w:r>
           </w:p>
         </w:tc>
@@ -2631,7 +2591,7 @@
                 <w:sz w:val="18"/>
                 <w:szCs w:val="18"/>
               </w:rPr>
-              <w:t xml:space="preserve">5,72 m</w:t>
+              <w:t xml:space="preserve">5,77 m</w:t>
             </w:r>
           </w:p>
         </w:tc>
@@ -2727,7 +2687,7 @@
                 <w:sz w:val="18"/>
                 <w:szCs w:val="18"/>
               </w:rPr>
-              <w:t xml:space="preserve">15,12 m</w:t>
+              <w:t xml:space="preserve">15,37 m</w:t>
             </w:r>
           </w:p>
         </w:tc>
@@ -2823,7 +2783,7 @@
                 <w:sz w:val="18"/>
                 <w:szCs w:val="18"/>
               </w:rPr>
-              <w:t xml:space="preserve">9.072 persones</w:t>
+              <w:t xml:space="preserve">9.222 persones</w:t>
             </w:r>
           </w:p>
         </w:tc>
@@ -2854,7 +2814,7 @@
         <w:rPr>
           <w:highlight w:val="yellow"/>
         </w:rPr>
-        <w:t xml:space="preserve">Les llums de pas s’han obtingut del plànol 02 (proposta). Abans de la fabricació l’industrial les ha de comprovar en obra, i cal mantenir com a mínim una llum útil total de 15,00 m (criteri dels projectes originals) i 2,30 m de llum lliure per a cada porta peatonal.</w:t>
+        <w:t xml:space="preserve">Les llums de pas s’han obtingut del plànol 02 (proposta). Abans de la fabricació el contractista les ha de comprovar en obra, i cal mantenir com a mínim una llum útil total de 15,00 m (criteri dels projectes originals) i 2,40 m de llum lliure per a cada porta peatonal.</w:t>
       </w:r>
     </w:p>
     <w:p>
@@ -2894,7 +2854,7 @@
         <w:jc w:val="both"/>
       </w:pPr>
       <w:r>
-        <w:t xml:space="preserve">Amb una llum útil de 15,12 m, la capacitat és de 9.072 persones. Supera l’amplada mínima de 15 m que fixen els projectes originals i, per tant, la capacitat de 9.000 persones que s’hi va considerar. Encara que se suposin simultanis l’aforament interior i l’exterior (P = 3.610 persones), l’amplada necessària seria de 6,02 m, molt per sota de l’existent.</w:t>
+        <w:t xml:space="preserve">Amb una llum útil de 15,37 m, la capacitat és de 9.222 persones. Supera l’amplada mínima de 15 m que fixen els projectes originals i, per tant, la capacitat de 9.000 persones que s’hi va considerar. Encara que se suposin simultanis l’aforament interior i l’exterior (P = 3.610 persones), l’amplada necessària seria de 6,02 m, molt per sota de l’existent.</w:t>
       </w:r>
     </w:p>
     <w:p>
@@ -2917,7 +2877,7 @@
         <w:jc w:val="both"/>
       </w:pPr>
       <w:r>
-        <w:t xml:space="preserve">Si se suposa inutilitzada la sortida d’emergència a la platja, tota l’ocupació (P = 3.610 persones, hipòtesi conservadora) evacua per l’Avinguda d’Eduard Maristany. Amplada necessària: A ≥ 3.610 / 600 = 6,02 m ≤ 15,12 m. COMPLEIX.</w:t>
+        <w:t xml:space="preserve">Si se suposa inutilitzada la sortida d’emergència a la platja, tota l’ocupació (P = 3.610 persones, hipòtesi conservadora) evacua per l’Avinguda d’Eduard Maristany. Amplada necessària: A ≥ 3.610 / 600 = 6,02 m ≤ 15,37 m. COMPLEIX.</w:t>
       </w:r>
     </w:p>
     <w:p>
@@ -2940,7 +2900,7 @@
         <w:jc w:val="both"/>
       </w:pPr>
       <w:r>
-        <w:t xml:space="preserve">Fins i tot sense comptar la porta de vehicles i aplicant el criteri més restrictiu de portes i passos (A ≥ P/200), les quatre portes peatonals (9,40 m) donen una capacitat de 1.880 persones, superior a l’aforament interior de l’edifici (1.805 persones). Amb el conjunt de la llum útil, la capacitat amb aquest criteri és de 3.024 persones.</w:t>
+        <w:t xml:space="preserve">Fins i tot sense comptar la porta de vehicles i aplicant el criteri més restrictiu de portes i passos (A ≥ P/200), les quatre portes peatonals (9,60 m) donen una capacitat de 1.920 persones, superior a l’aforament interior de l’edifici (1.805 persones). Amb el conjunt de la llum útil, la capacitat amb aquest criteri és de 3.074 persones.</w:t>
       </w:r>
     </w:p>
     <w:tbl>
@@ -3220,7 +3180,7 @@
                 <w:sz w:val="18"/>
                 <w:szCs w:val="18"/>
               </w:rPr>
-              <w:t xml:space="preserve">15,12 m</w:t>
+              <w:t xml:space="preserve">15,37 m</w:t>
             </w:r>
           </w:p>
         </w:tc>
@@ -3346,7 +3306,7 @@
                 <w:sz w:val="18"/>
                 <w:szCs w:val="18"/>
               </w:rPr>
-              <w:t xml:space="preserve">15,12 m</w:t>
+              <w:t xml:space="preserve">15,37 m</w:t>
             </w:r>
           </w:p>
         </w:tc>
@@ -3472,7 +3432,7 @@
                 <w:sz w:val="18"/>
                 <w:szCs w:val="18"/>
               </w:rPr>
-              <w:t xml:space="preserve">9,40 m</w:t>
+              <w:t xml:space="preserve">9,60 m</w:t>
             </w:r>
           </w:p>
         </w:tc>
@@ -3543,7 +3503,7 @@
         <w:t xml:space="preserve">Sistema d’obertura: </w:t>
       </w:r>
       <w:r>
-        <w:t xml:space="preserve">són abatibles amb eix de gir vertical i porten dispositiu antipànic de barra horitzontal d’empenta segons UNE-EN 1125 a totes dues fulles, igual que les portes existents, com exigeix SI 3-6.1 per a l’evacuació de més de 50 persones no familiaritzades amb la porta. Des de l’interior s’obren sempre, sense clau, encara que estiguin tancades. Des de l’exterior s’obren amb maneta i clau. Com que l’oferta de l’industrial no inclou els dispositius antipànic, s’hi afegeixen en una partida específica del pressupost (05.03).</w:t>
+        <w:t xml:space="preserve">són abatibles amb eix de gir vertical i porten dispositiu antipànic de barra horitzontal d’empenta segons UNE-EN 1125 a totes dues fulles, igual que les portes existents, com exigeix SI 3-6.1 per a l’evacuació de més de 50 persones no familiaritzades amb la porta. Des de l’interior s’obren sempre, sense clau, encara que estiguin tancades. Des de l’exterior s’obren amb maneta i clau. Els dispositius antipànic es valoren en una partida específica del pressupost (05.03).</w:t>
       </w:r>
     </w:p>
     <w:p>
@@ -3564,7 +3524,7 @@
         <w:t xml:space="preserve">Amplada de les fulles: </w:t>
       </w:r>
       <w:r>
-        <w:t xml:space="preserve">cada fulla ha de tenir una amplada de pas entre 0,60 i 1,23 m (SI 3-4.2). Amb 2,35 m de llum per porta, cada fulla fa ≈ 1,18 m. COMPLEIX.</w:t>
+        <w:t xml:space="preserve">cada fulla ha de tenir una amplada de pas entre 0,60 i 1,23 m (SI 3-4.2). Amb 2,40 m de llum per porta, cada fulla fa ≈ 1,20 m. COMPLEIX.</w:t>
       </w:r>
     </w:p>
     <w:p>
@@ -3623,25 +3583,13 @@
       </w:pPr>
       <w:r>
         <w:rPr>
-          <w:highlight w:val="yellow"/>
-        </w:rPr>
-        <w:t xml:space="preserve">Cal demanar a Mansergas que confirmi que les fulles JAM de 2.500 mm donen una llum de pas lliure d’almenys 1,15 m per fulla (≥ 2,30 m per porta) i que el model JAM admet el kit antipànic UNE-EN 1125.</w:t>
-      </w:r>
-    </w:p>
-    <w:p>
-      <w:pPr>
-        <w:spacing w:after="120" w:before="0" w:line="300"/>
-        <w:jc w:val="both"/>
-      </w:pPr>
-      <w:r>
-        <w:rPr>
           <w:b/>
           <w:bCs/>
         </w:rPr>
         <w:t xml:space="preserve">Conclusió: </w:t>
       </w:r>
       <w:r>
-        <w:t xml:space="preserve">la nova configuració manté una llum útil de pas de 15,12 m, superior als 15 m previstos als projectes originals, i una capacitat d’evacuació de 9.072 persones amb el mateix criteri (P/600). Com que es manté la mateixa llum total entre paraments, el mateix nombre de portes peatonals i es mantenen el sentit d’obertura cap a l’exterior i les barres antipànic de les portes actuals, </w:t>
+        <w:t xml:space="preserve">la nova configuració manté una llum útil de pas de 15,37 m, superior als 15 m previstos als projectes originals, i una capacitat d’evacuació de 9.222 persones amb el mateix criteri (P/600). Com que es manté la mateixa llum total entre paraments, el mateix nombre de portes peatonals i es mantenen el sentit d’obertura cap a l’exterior i les barres antipànic de les portes actuals, </w:t>
       </w:r>
       <w:r>
         <w:rPr>
@@ -3732,7 +3680,7 @@
         <w:jc w:val="both"/>
       </w:pPr>
       <w:r>
-        <w:t xml:space="preserve">Cala manual de comprovació a cada posició de pilar nou, abans d’excavar.</w:t>
+        <w:t xml:space="preserve">Cala manual de comprovació a cada posició de muntant nou, abans d’excavar.</w:t>
       </w:r>
     </w:p>
     <w:p>
@@ -3746,7 +3694,7 @@
         <w:jc w:val="both"/>
       </w:pPr>
       <w:r>
-        <w:t xml:space="preserve">Replanteig dels nous daus fora del traçat detectat, amb una distància lliure mínima de 0,30 m entre la cara del dau i el tub o cable. Si la posició teòrica d’un pilar coincideix amb la línia, el dau es desplaçarà en sentit perpendicular a la tanca (cap a l’interior del recinte) i el pilar s’hi ancorarà amb una placa excèntrica, amb validació prèvia de la direcció facultativa.</w:t>
+        <w:t xml:space="preserve">Replanteig dels nous daus fora del traçat detectat, amb una distància lliure mínima de 0,30 m entre la cara del dau i el tub o cable. Si la posició teòrica d’un muntant coincideix amb la línia, el dau es desplaçarà en sentit perpendicular a la tanca (cap a l’interior del recinte) i el muntant s’hi ancorarà amb una placa excèntrica, amb validació prèvia de la direcció facultativa.</w:t>
       </w:r>
     </w:p>
     <w:p>
@@ -3774,7 +3722,7 @@
         <w:jc w:val="both"/>
       </w:pPr>
       <w:r>
-        <w:t xml:space="preserve">La porta corredissa no requereix rasa. La guia inferior de l’industrial (Ø 20 mm soldada sobre platines amb grapes) no s’encastarà al terra: les platines s’ancoraran al paviment existent amb tacs químics de longitud limitada (≤ 100 mm). Si cal formigonar una franja de suport, no farà més de 0,20 m de fondària i només es farà després de la detecció i amb l’autorització de la direcció facultativa. Els daus es concentren només als muntants i a la torreta.</w:t>
+        <w:t xml:space="preserve">La porta corredissa no requereix rasa. La guia inferior de la porta (Ø 20 mm soldada sobre platines) no s’encastarà al terra: les platines s’ancoraran al paviment existent amb tacs químics de longitud limitada (≤ 100 mm). Si cal formigonar una franja de suport, no farà més de 0,20 m de fondària i només es farà després de la detecció i amb l’autorització de la direcció facultativa. Els daus es concentren només als muntants i a la torreta.</w:t>
       </w:r>
     </w:p>
     <w:p>
@@ -3805,7 +3753,7 @@
         <w:jc w:val="both"/>
       </w:pPr>
       <w:r>
-        <w:t xml:space="preserve">Es desmuntaran les quatre portes de dues fulles existents i els seus pilars, amb mitjans manuals i camió grua. Es tallaran les frontisses i els panys i es carregaran els elements sobre camió per portar-los a un gestor de residus metàl·lics. Els daus de formigó existents s’enderrocaran amb mitjans manuals; si algun és a menys de 0,30 m de la línia elèctrica, es tallarà el pilar a ran del dau i aquest es deixarà soterrat, sense enderrocar-lo. Es retirarà el paviment de panot de l’entorn dels nous pilars.</w:t>
+        <w:t xml:space="preserve">Es desmuntaran les quatre portes de dues fulles existents i els seus pilars, amb mitjans manuals i camió grua. Es tallaran les frontisses i els panys i es carregaran els elements sobre camió per portar-los a un gestor de residus metàl·lics. Els daus de formigó existents s’enderrocaran amb mitjans manuals; si algun és a menys de 0,30 m de la línia elèctrica, es tallarà el pilar a ran del dau i aquest es deixarà soterrat, sense enderrocar-lo. Es retirarà el paviment de panot de l’entorn dels nous muntants.</w:t>
       </w:r>
     </w:p>
     <w:p>
@@ -3822,7 +3770,7 @@
         <w:jc w:val="both"/>
       </w:pPr>
       <w:r>
-        <w:t xml:space="preserve">Els nous pilars es fonamenten en daus aïllats de formigó en massa HA-25/B/20/IIa de 0,60×0,60×0,80 m, sobre una capa de neteja de 5 cm, amb una placa d’ancoratge de 300×300×15 mm i quatre perns Ø16 mm de B500S, galvanitzats. Es preveuen 7 daus: 5 per als muntants de les portes peatonals (un dels quals també és el de recepció de la porta corredissa), i 2 per a la torreta de suport i el motor de la corredissa. L’oferta de l’industrial no inclou l’obra civil, que es valora als capítols 03 i 04.</w:t>
+        <w:t xml:space="preserve">Els nous muntants es fonamenten en daus aïllats de formigó en massa HA-25/B/20/IIa de 0,60×0,60×0,80 m, sobre una capa de neteja de 5 cm, amb una placa d’ancoratge de 250×350×15 mm per al muntant de 100×200 mm, i quatre perns Ø16 mm de B500S, galvanitzats. Es preveuen 7 daus: 5 per als muntants de les portes peatonals (un dels quals també és el de recepció de la porta corredissa), i 2 per a la torreta de suport i el motor de la corredissa.</w:t>
       </w:r>
     </w:p>
     <w:p>
@@ -3843,7 +3791,7 @@
         <w:rPr>
           <w:highlight w:val="yellow"/>
         </w:rPr>
-        <w:t xml:space="preserve">Mansergas ha de confirmar les dimensions dels muntants, de les plaques i de la torreta, i les reaccions de la porta corredissa (pes i bolcada), abans de formigonar. La direcció facultativa pot ajustar les dimensions dels daus segons el terreny que es trobi.</w:t>
+        <w:t xml:space="preserve">El fabricant de les portes que resulti adjudicatari ha de confirmar les dimensions de les plaques i de la torreta, i les reaccions de la porta corredissa (pes i bolcada), abans de formigonar. La direcció facultativa pot ajustar les dimensions dels daus segons el terreny que es trobi.</w:t>
       </w:r>
     </w:p>
     <w:p>
@@ -3852,15 +3800,6 @@
       </w:pPr>
       <w:r>
         <w:t xml:space="preserve">MC5. TANCAMENTS PRACTICABLES: PORTES</w:t>
-      </w:r>
-    </w:p>
-    <w:p>
-      <w:pPr>
-        <w:spacing w:after="120" w:before="0" w:line="300"/>
-        <w:jc w:val="both"/>
-      </w:pPr>
-      <w:r>
-        <w:t xml:space="preserve">Les portes són les del pressupost de J.A. Mansergas, SA, núm. 74666/26 (Annex 5), complementades amb els dispositius antipànic que exigeix aquest projecte.</w:t>
       </w:r>
     </w:p>
     <w:p>
@@ -3878,10 +3817,10 @@
           <w:b/>
           <w:bCs/>
         </w:rPr>
-        <w:t xml:space="preserve">Portes peatonals (4 u), cancel·la model JAM de 2.500×3.000 mm, de dues fulles: </w:t>
-      </w:r>
-      <w:r>
-        <w:t xml:space="preserve">fulla d’armadura tubular d’acer amb travessers rigiditzadors, folrada amb perfil especial JAM galvanitzat; gir amb cassoleta superior i pivot inferior amb rodaments de boles, allotjat en muntant lateral; acabat galvanitzat. Obertura cap a l’exterior, com les existents.</w:t>
+        <w:t xml:space="preserve">Muntants: </w:t>
+      </w:r>
+      <w:r>
+        <w:t xml:space="preserve">perfil d’acer de 100×200 mm galvanitzat en calent (UNE-EN ISO 1461), col·locat amb la cara de 100 mm en el sentit de la tanca, cargolat a la placa d’ancoratge del dau.</w:t>
       </w:r>
     </w:p>
     <w:p>
@@ -3899,10 +3838,10 @@
           <w:b/>
           <w:bCs/>
         </w:rPr>
-        <w:t xml:space="preserve">Dispositius antipànic (4 jocs, no inclosos a l’oferta de l’industrial): </w:t>
-      </w:r>
-      <w:r>
-        <w:t xml:space="preserve">barra horitzontal d’empenta UNE-EN 1125 amb pany de cop a la fulla activa; barra de dos punts (tancament superior i inferior) a la fulla passiva, que substitueix el forrellat manual; comandament exterior amb maneta i cilindre de clau; acabat per a exterior. Marcat CE.</w:t>
+        <w:t xml:space="preserve">Portes peatonals (4 u), de dues fulles batents de 2.500×3.000 mm (2,40 m de llum lliure): </w:t>
+      </w:r>
+      <w:r>
+        <w:t xml:space="preserve">fulla d’armadura tubular d’acer amb travessers rigiditzadors, folrada amb perfils d’acer galvanitzat; gir amb cassoleta superior i pivot inferior amb rodaments de boles, allotjat al muntant lateral; acabat galvanitzat. Obertura cap a l’exterior, com les existents. Tipus JAM o equivalent.</w:t>
       </w:r>
     </w:p>
     <w:p>
@@ -3920,10 +3859,10 @@
           <w:b/>
           <w:bCs/>
         </w:rPr>
-        <w:t xml:space="preserve">Porta corredissa de vehicles (1 u), model JAM de 5.770×3.000 mm: </w:t>
-      </w:r>
-      <w:r>
-        <w:t xml:space="preserve">fulla folrada amb perfils d’acer galvanitzat laminats en fred, rodes d’acer amb rodaments, guia inferior calibrada de Ø 20 mm, torreta de suport amb rodaments de niló i perfil en “U” de tancament. Motor BK-1200 (230 V, 380 W, 850 N, 10 m/min, IP54) amb fotocèl·lula, banda de seguretat, avisador òptic, finals de cursa mecànics i desbloqueig manual. Marcat CE i expedient tècnic segons UNE-EN 13241, UNE-EN 12453 i UNE-EN 12445.</w:t>
+        <w:t xml:space="preserve">Dispositius antipànic (4 jocs): </w:t>
+      </w:r>
+      <w:r>
+        <w:t xml:space="preserve">barra horitzontal d’empenta UNE-EN 1125 amb pany de cop a la fulla activa; barra de dos punts (tancament superior i inferior) a la fulla passiva; comandament exterior amb maneta i cilindre de clau; acabat per a exterior. Marcat CE.</w:t>
       </w:r>
     </w:p>
     <w:p>
@@ -3941,18 +3880,31 @@
           <w:b/>
           <w:bCs/>
         </w:rPr>
+        <w:t xml:space="preserve">Porta corredissa de vehicles (1 u), de 5.770×3.000 mm: </w:t>
+      </w:r>
+      <w:r>
+        <w:t xml:space="preserve">fulla folrada amb perfils d’acer galvanitzat laminats en fred, rodes d’acer amb rodaments, guia inferior calibrada de Ø 20 mm, torreta de suport amb rodaments de niló i perfil en “U” de tancament. Motor electromecànic de 230 V per a fulles de fins a 1.100 kg, amb maniobra incorporada, fotocèl·lula, banda de seguretat, avisador òptic, finals de cursa i desbloqueig manual. Marcat CE i expedient tècnic segons UNE-EN 13241, UNE-EN 12453 i UNE-EN 12445. Tipus JAM o equivalent.</w:t>
+      </w:r>
+    </w:p>
+    <w:p>
+      <w:pPr>
+        <w:pStyle w:val="ListParagraph"/>
+        <w:numPr>
+          <w:ilvl w:val="0"/>
+          <w:numId w:val="4"/>
+        </w:numPr>
+        <w:spacing w:after="60" w:line="300"/>
+        <w:jc w:val="both"/>
+      </w:pPr>
+      <w:r>
+        <w:rPr>
+          <w:b/>
+          <w:bCs/>
+        </w:rPr>
         <w:t xml:space="preserve">Senyalització: </w:t>
       </w:r>
       <w:r>
         <w:t xml:space="preserve">bandes reflectants als muntants contra els impactes de vehicles i rètol fotoluminescent de “Sortida d’emergència” a cada porta peatonal.</w:t>
-      </w:r>
-    </w:p>
-    <w:p>
-      <w:pPr>
-        <w:pStyle w:val="Heading2"/>
-      </w:pPr>
-      <w:r>
-        <w:t xml:space="preserve">MC6. PAVIMENTS I REPOSICIONS</w:t>
       </w:r>
     </w:p>
     <w:p>
@@ -3961,7 +3913,7 @@
         <w:jc w:val="both"/>
       </w:pPr>
       <w:r>
-        <w:t xml:space="preserve">Es reposarà el paviment a l’entorn dels pilars amb panot igual a l’existent (o formigó raspallat), enrasat amb el paviment adjacent i sense ressalts, i se segellarà el contorn dels pilars amb massilla de poliuretà.</w:t>
+        <w:t xml:space="preserve">Les característiques i els preus de les portes s’han definit a partir d’una consulta de mercat a un fabricant especialitzat. Les referències a models comercials són orientatives: el contractista podrà oferir productes equivalents que compleixin les prestacions d’aquest projecte (dimensions, llum de pas, sentit d’obertura, antipànic, marcat CE i acabat galvanitzat).</w:t>
       </w:r>
     </w:p>
     <w:p>
@@ -3969,7 +3921,7 @@
         <w:pStyle w:val="Heading2"/>
       </w:pPr>
       <w:r>
-        <w:t xml:space="preserve">MC7. INSTAL·LACIONS</w:t>
+        <w:t xml:space="preserve">MC6. PAVIMENTS I REPOSICIONS</w:t>
       </w:r>
     </w:p>
     <w:p>
@@ -3978,7 +3930,24 @@
         <w:jc w:val="both"/>
       </w:pPr>
       <w:r>
-        <w:t xml:space="preserve">El motor de la porta corredissa necessita alimentació monofàsica de 230 V (380 W), que l’oferta de l’industrial no inclou. S’alimentarà des del quadre elèctric existent a l’extrem esquerre de la tanca (element 7 dels plànols), amb una línia nova de cable RZ1-K 3G2,5 mm² protegida al quadre amb magnetotèrmic de 10 A i diferencial de 30 mA. Per arribar al motor, a l’extrem dret, la línia es passarà pel conducte soterrat existent Ø 50 mm (element 8), que ja creua tot el front de la tanca, fent-hi passar només el nou cable amb guia i sense manipular ni desconnectar els cables existents, de manera que no cal obrir cap rasa a la zona de la línia elèctrica soterrada. Es farà d’acord amb el REBT i es lliurarà el butlletí corresponent.</w:t>
+        <w:t xml:space="preserve">Es reposarà el paviment a l’entorn dels muntants amb panot igual a l’existent (o formigó raspallat), enrasat amb el paviment adjacent i sense ressalts, i se segellarà el contorn dels muntants amb massilla de poliuretà.</w:t>
+      </w:r>
+    </w:p>
+    <w:p>
+      <w:pPr>
+        <w:pStyle w:val="Heading2"/>
+      </w:pPr>
+      <w:r>
+        <w:t xml:space="preserve">MC7. INSTAL·LACIONS</w:t>
+      </w:r>
+    </w:p>
+    <w:p>
+      <w:pPr>
+        <w:spacing w:after="120" w:before="0" w:line="300"/>
+        <w:jc w:val="both"/>
+      </w:pPr>
+      <w:r>
+        <w:t xml:space="preserve">El motor de la porta corredissa necessita alimentació monofàsica de 230 V (380 W), que es valora al capítol 09. S’alimentarà des del quadre elèctric existent a l’extrem esquerre de la tanca (element 7 dels plànols), amb una línia nova de cable RZ1-K 3G2,5 mm² protegida al quadre amb magnetotèrmic de 10 A i diferencial de 30 mA. Per arribar al motor, a l’extrem dret, la línia es passarà pel conducte soterrat existent Ø 50 mm (element 8), que ja creua tot el front de la tanca, fent-hi passar només el nou cable amb guia i sense manipular ni desconnectar els cables existents, de manera que no cal obrir cap rasa a la zona de la línia elèctrica soterrada. Es farà d’acord amb el REBT i es lliurarà el butlletí corresponent.</w:t>
       </w:r>
     </w:p>
     <w:p>
@@ -4826,28 +4795,6 @@
       </w:pPr>
       <w:r>
         <w:t xml:space="preserve"/>
-      </w:r>
-    </w:p>
-    <w:p>
-      <w:pPr>
-        <w:spacing w:after="120" w:before="0" w:line="300"/>
-        <w:jc w:val="both"/>
-      </w:pPr>
-      <w:r>
-        <w:rPr>
-          <w:b/>
-          <w:bCs/>
-        </w:rPr>
-        <w:t xml:space="preserve">Nota: </w:t>
-      </w:r>
-      <w:r>
-        <w:t xml:space="preserve">el plànol d’enderroc i obra nova consta al joc de plànols amb el número 01. </w:t>
-      </w:r>
-      <w:r>
-        <w:rPr>
-          <w:highlight w:val="yellow"/>
-        </w:rPr>
-        <w:t xml:space="preserve">Es recomana renumerar-lo com a 03 perquè no coincideixi amb el d’estat actual.</w:t>
       </w:r>
     </w:p>
     <w:p>
@@ -5151,23 +5098,7 @@
         <w:jc w:val="both"/>
       </w:pPr>
       <w:r>
-        <w:t xml:space="preserve">Els preus de les portes del capítol 05 (partides 05.01 i 05.02) són els del pressupost de J.A. Mansergas, SA, núm. 74666/26, de 23/09/2026 (</w:t>
-      </w:r>
-      <w:r>
-        <w:rPr>
-          <w:b/>
-          <w:bCs/>
-        </w:rPr>
-        <w:t xml:space="preserve">23.983,77 € sense IVA</w:t>
-      </w:r>
-      <w:r>
-        <w:t xml:space="preserve">). L’oferta no inclou les barres antipànic, l’obra civil, el desmuntatge de les portes existents ni l’alimentació elèctrica del motor, i per això s’han valorat a part amb preus de referència de mercat (base ITeC 2026). </w:t>
-      </w:r>
-      <w:r>
-        <w:rPr>
-          <w:highlight w:val="yellow"/>
-        </w:rPr>
-        <w:t xml:space="preserve">El preu de la partida 05.03 (antipànic) és una estimació: s’ha de substituir pel preu que doni Mansergas.</w:t>
+        <w:t xml:space="preserve">Els preus de les portes (partides 05.01 i 05.02) s’han obtingut d’una consulta de mercat a un fabricant especialitzat de portes metàl·liques. La resta de partides s’han valorat amb preus de referència de mercat (base ITeC 2026). L’obra s’adjudicarà per licitació.</w:t>
       </w:r>
     </w:p>
     <w:tbl>
@@ -5992,7 +5923,7 @@
                 <w:sz w:val="15"/>
                 <w:szCs w:val="15"/>
               </w:rPr>
-              <w:t xml:space="preserve">1 cala per pilar nou: 7 u</w:t>
+              <w:t xml:space="preserve">1 cala per muntant nou: 7 u</w:t>
             </w:r>
           </w:p>
         </w:tc>
@@ -7705,7 +7636,7 @@
                 <w:sz w:val="15"/>
                 <w:szCs w:val="15"/>
               </w:rPr>
-              <w:t xml:space="preserve">Arrencada de paviment de panot o formigó existent a l’entorn dels nous pilars, amb mitjans manuals, i càrrega de runa.</w:t>
+              <w:t xml:space="preserve">Arrencada de paviment de panot o formigó existent a l’entorn dels nous muntants, amb mitjans manuals, i càrrega de runa.</w:t>
             </w:r>
           </w:p>
         </w:tc>
@@ -9247,7 +9178,7 @@
                 <w:sz w:val="15"/>
                 <w:szCs w:val="15"/>
               </w:rPr>
-              <w:t xml:space="preserve">Placa d’ancoratge d’acer S275JR de 300×300×15 mm amb 4 perns d’acer corrugat B500S de Ø16 mm i 50 cm de longitud amb patilla, galvanitzada en calent, col·locada anivellada abans del formigonat.</w:t>
+              <w:t xml:space="preserve">Placa d’ancoratge d’acer S275JR de 250×350×15 mm amb 4 perns d’acer corrugat B500S de Ø16 mm i 50 cm de longitud amb patilla, galvanitzada en calent, col·locada anivellada abans del formigonat.</w:t>
             </w:r>
           </w:p>
         </w:tc>
@@ -9690,7 +9621,7 @@
                 <w:sz w:val="15"/>
                 <w:szCs w:val="15"/>
               </w:rPr>
-              <w:t xml:space="preserve">TANCAMENTS PRACTICABLES: PORTES (OFERTA J.A. MANSERGAS, SA, PRESSUPOST 74666/26)</w:t>
+              <w:t xml:space="preserve">TANCAMENTS PRACTICABLES: PORTES</w:t>
             </w:r>
           </w:p>
         </w:tc>
@@ -9910,7 +9841,7 @@
                 <w:sz w:val="15"/>
                 <w:szCs w:val="15"/>
               </w:rPr>
-              <w:t xml:space="preserve">Porta batent de dues fulles (cancel·la) model JAM de J.A. Mansergas, de 2.500×3.000 mm, acabat galvanitzat. Fulla d’armadura tubular d’acer amb travessers rigiditzadors, folrada amb perfil especial tipus JAM galvanitzat; gir amb cassoleta superior i pivot inferior amb rodaments de boles, allotjat en muntant lateral dimensionat segons el pes i les dimensions de la fulla. Subministrament i col·locació. (Pressupost 74666/26, codi PTOCANCJAM.)</w:t>
+              <w:t xml:space="preserve">Porta batent de dues fulles d’acer galvanitzat en calent, de 2.500×3.000 mm (2,40 m de llum de pas lliure entre muntants), amb fulles d’armadura tubular d’acer amb travessers rigiditzadors i folrat de perfils d’acer galvanitzat; gir amb cassoleta superior i pivot inferior amb rodaments de boles, allotjat en muntants laterals de perfil d’acer de 100×200 mm dimensionats segons el pes i les dimensions de les fulles. Obertura cap a l’exterior. Tipus JAM o equivalent. Subministrament i col·locació.</w:t>
             </w:r>
           </w:p>
         </w:tc>
@@ -10126,7 +10057,7 @@
                 <w:sz w:val="15"/>
                 <w:szCs w:val="15"/>
               </w:rPr>
-              <w:t xml:space="preserve">Porta corredissa model JAM de J.A. Mansergas, de 5.770×3.000 mm, acabat galvanitzat. Fulla d’armadura tubular d’acer amb travessers rigiditzadors, folrada amb perfils d’acer galvanitzat laminats en fred model JAM; rodes d’acer tornejades amb rodaments registrables; guia inferior calibrada de Ø 20 mm soldada sobre platines amb grapes per fixar-la al terra; torreta de suport amb rodaments de niló a la part superior; perfil en “U” de tancament. Motoritzada amb motor BK-1200 amb fotocèl·lula, banda de seguretat, avisador òptic, maniobra incorporada, finals de cursa mecànics, cremallera i desbloqueig manual en cas de tall de subministrament elèctric. Subministrament i col·locació. (Pressupost 74666/26, codi PTOCORREJAM.)</w:t>
+              <w:t xml:space="preserve">Porta corredissa d’una fulla d’acer galvanitzat en calent, de 5.770×3.000 mm, amb fulla d’armadura tubular d’acer amb travessers rigiditzadors i folrat de perfils d’acer galvanitzat laminats en fred; rodes d’acer tornejades amb rodaments registrables; guia inferior calibrada de Ø 20 mm sobre platines ancorades al paviment; torreta de suport amb rodaments de niló a la part superior; perfil en “U” de tancament. Motoritzada amb motor electromecànic de 230 V per a fulles de fins a 1.100 kg, amb maniobra incorporada, finals de cursa, cremallera, fotocèl·lula, banda de seguretat, avisador òptic i desbloqueig manual en cas de tall de subministrament elèctric. Marcat CE segons UNE-EN 13241. Tipus JAM o equivalent. Subministrament i col·locació.</w:t>
             </w:r>
           </w:p>
         </w:tc>
@@ -10342,7 +10273,7 @@
                 <w:sz w:val="15"/>
                 <w:szCs w:val="15"/>
               </w:rPr>
-              <w:t xml:space="preserve">Kit antipànic per a porta exterior de dues fulles batents, segons UNE-EN 1125, NO INCLÒS a l’oferta de l’industrial: barra horitzontal d’empenta amb pany de cop a la fulla activa, barra antipànic de dos punts (tancament superior i inferior) a la fulla passiva, comandament exterior amb maneta i cilindre de clau, acabat apte per a exterior (inox o galvanitzat), inclosa l’adaptació del bastidor JAM i la regulació. Col·locat.</w:t>
+              <w:t xml:space="preserve">Kit antipànic per a porta exterior de dues fulles batents, segons UNE-EN 1125: barra horitzontal d’empenta amb pany de cop a la fulla activa, barra antipànic de dos punts (tancament superior i inferior) a la fulla passiva, comandament exterior amb maneta i cilindre de clau, acabat apte per a exterior (inox o galvanitzat), inclosa l’adaptació del bastidor de la porta i la regulació. Col·locat.</w:t>
             </w:r>
           </w:p>
         </w:tc>
@@ -10431,7 +10362,6 @@
               <w:rPr>
                 <w:sz w:val="15"/>
                 <w:szCs w:val="15"/>
-                <w:highlight w:val="yellow"/>
               </w:rPr>
               <w:t xml:space="preserve">980,00</w:t>
             </w:r>
@@ -10462,7 +10392,6 @@
               <w:rPr>
                 <w:sz w:val="15"/>
                 <w:szCs w:val="15"/>
-                <w:highlight w:val="yellow"/>
               </w:rPr>
               <w:t xml:space="preserve">3.920,00</w:t>
             </w:r>
@@ -10776,7 +10705,7 @@
                 <w:sz w:val="15"/>
                 <w:szCs w:val="15"/>
               </w:rPr>
-              <w:t xml:space="preserve">Ajudes de ram de paleta a l’industrial (excloses a l’oferta 74666/26): recepció i aplomat de muntants i torreta, fixació de la guia inferior de la corredissa amb tacs químics sobre el paviment existent i reblert de juntes.</w:t>
+              <w:t xml:space="preserve">Ajudes de ram de paleta al muntatge de les portes: recepció i aplomat de muntants i torreta, fixació de la guia inferior de la corredissa amb tacs químics sobre el paviment existent i reblert de juntes.</w:t>
             </w:r>
           </w:p>
         </w:tc>
@@ -11439,7 +11368,7 @@
                 <w:sz w:val="15"/>
                 <w:szCs w:val="15"/>
               </w:rPr>
-              <w:t xml:space="preserve">Reposició de paviment de panot igual a l’existent (o formigó raspallat HM-20 de 15 cm), a l’entorn dels nous pilars, inclosa base de morter i acord amb el paviment existent.</w:t>
+              <w:t xml:space="preserve">Reposició de paviment de panot igual a l’existent (o formigó raspallat HM-20 de 15 cm), a l’entorn dels nous muntants, inclosa base de morter i acord amb el paviment existent.</w:t>
             </w:r>
           </w:p>
         </w:tc>
@@ -15002,7 +14931,7 @@
                 <w:sz w:val="18"/>
                 <w:szCs w:val="18"/>
               </w:rPr>
-              <w:t xml:space="preserve">TANCAMENTS PRACTICABLES: PORTES (OFERTA J.A. MANSERGAS, SA, PRESSUPOST 74666/26)</w:t>
+              <w:t xml:space="preserve">TANCAMENTS PRACTICABLES: PORTES</w:t>
             </w:r>
           </w:p>
         </w:tc>
@@ -16030,15 +15959,6 @@
           <w:bCs/>
         </w:rPr>
         <w:t xml:space="preserve">El pressupost d’execució material (base imposable de l’ICIO) puja a 34.963,85 €.</w:t>
-      </w:r>
-    </w:p>
-    <w:p>
-      <w:pPr>
-        <w:spacing w:after="120" w:before="0" w:line="300"/>
-        <w:jc w:val="both"/>
-      </w:pPr>
-      <w:r>
-        <w:t xml:space="preserve">L’oferta de l’industrial exclou expressament el desmuntatge d’instal·lacions i estructures i la intervenció de paletes, i no esmenta la retirada de les portes existents. Per això aquestes feines s’inclouen als capítols 02 i 05.05 d’aquest pressupost i no es compten dues vegades.</w:t>
       </w:r>
     </w:p>
     <w:p>
@@ -16075,7 +15995,7 @@
         <w:jc w:val="both"/>
       </w:pPr>
       <w:r>
-        <w:t xml:space="preserve">Termini d’execució previst: 6 setmanes des de l’adjudicació, de les quals unes 4 corresponen a la fabricació a taller (termini a confirmar amb Mansergas, que el fixa segons la càrrega de treball). La durada de les obres in situ, amb el recinte tancat provisionalment, és d’unes 3 setmanes.</w:t>
+        <w:t xml:space="preserve">Termini d’execució previst: 6 setmanes des de l’adjudicació, de les quals unes 4 corresponen a la fabricació a taller (termini a confirmar per l’adjudicatari). La durada de les obres in situ, amb el recinte tancat provisionalment, és d’unes 3 setmanes.</w:t>
       </w:r>
     </w:p>
     <w:tbl>
@@ -16367,7 +16287,7 @@
                 <w:sz w:val="18"/>
                 <w:szCs w:val="18"/>
               </w:rPr>
-              <w:t xml:space="preserve">Fabricació a taller de portes (Mansergas)</w:t>
+              <w:t xml:space="preserve">Fabricació a taller de portes</w:t>
             </w:r>
           </w:p>
         </w:tc>
@@ -20139,7 +20059,7 @@
                 <w:sz w:val="17"/>
                 <w:szCs w:val="17"/>
               </w:rPr>
-              <w:t xml:space="preserve">Comprovació d’aplomat (≤ 1/500), anivellament i llums de pas (≥ 2,30 m per porta peatonal i ≥ 15,00 m de llum útil total).</w:t>
+              <w:t xml:space="preserve">Comprovació d’aplomat (≤ 1/500), anivellament i llums de pas (≥ 2,40 m per porta peatonal i ≥ 15,00 m de llum útil total).</w:t>
             </w:r>
           </w:p>
         </w:tc>
@@ -20412,922 +20332,6 @@
     <w:p>
       <w:r>
         <w:br w:type="page"/>
-      </w:r>
-    </w:p>
-    <w:p>
-      <w:pPr>
-        <w:pStyle w:val="Heading1"/>
-      </w:pPr>
-      <w:r>
-        <w:t xml:space="preserve">ANNEX 5. PRESSUPOST DE L’INDUSTRIAL</w:t>
-      </w:r>
-    </w:p>
-    <w:p>
-      <w:pPr>
-        <w:spacing w:after="120" w:before="0" w:line="300"/>
-        <w:jc w:val="both"/>
-      </w:pPr>
-      <w:r>
-        <w:t xml:space="preserve">Pressupost núm. 74666/26 de J.A. Mansergas, SA (CIF A58075250, Rubí), de 23 de setembre de 2026, amb referència “Recinte 3 Xemeneies”.</w:t>
-      </w:r>
-    </w:p>
-    <w:tbl>
-      <w:tblPr>
-        <w:tblW w:type="dxa" w:w="9000"/>
-        <w:tblBorders>
-          <w:top w:val="single" w:color="auto" w:sz="4"/>
-          <w:left w:val="single" w:color="auto" w:sz="4"/>
-          <w:bottom w:val="single" w:color="auto" w:sz="4"/>
-          <w:right w:val="single" w:color="auto" w:sz="4"/>
-          <w:insideH w:val="single" w:color="auto" w:sz="4"/>
-          <w:insideV w:val="single" w:color="auto" w:sz="4"/>
-        </w:tblBorders>
-      </w:tblPr>
-      <w:tblGrid>
-        <w:gridCol w:w="1800"/>
-        <w:gridCol w:w="900"/>
-        <w:gridCol w:w="4300"/>
-        <w:gridCol w:w="2000"/>
-      </w:tblGrid>
-      <w:tr>
-        <w:trPr>
-          <w:cantSplit/>
-          <w:tblHeader/>
-        </w:trPr>
-        <w:tc>
-          <w:tcPr>
-            <w:tcW w:type="dxa" w:w="1800"/>
-            <w:tcBorders>
-              <w:top w:val="single" w:color="999999" w:sz="4"/>
-              <w:left w:val="single" w:color="999999" w:sz="4"/>
-              <w:bottom w:val="single" w:color="999999" w:sz="4"/>
-              <w:right w:val="single" w:color="999999" w:sz="4"/>
-            </w:tcBorders>
-            <w:shd w:fill="D9E2EC" w:color="auto" w:val="clear"/>
-            <w:tcMar>
-              <w:top w:type="dxa" w:w="50"/>
-              <w:left w:type="dxa" w:w="90"/>
-              <w:bottom w:type="dxa" w:w="50"/>
-              <w:right w:type="dxa" w:w="90"/>
-            </w:tcMar>
-            <w:vAlign w:val="center"/>
-          </w:tcPr>
-          <w:p>
-            <w:pPr>
-              <w:jc w:val="left"/>
-            </w:pPr>
-            <w:r>
-              <w:rPr>
-                <w:b/>
-                <w:bCs/>
-                <w:sz w:val="17"/>
-                <w:szCs w:val="17"/>
-              </w:rPr>
-              <w:t xml:space="preserve">Codi</w:t>
-            </w:r>
-          </w:p>
-        </w:tc>
-        <w:tc>
-          <w:tcPr>
-            <w:tcW w:type="dxa" w:w="900"/>
-            <w:tcBorders>
-              <w:top w:val="single" w:color="999999" w:sz="4"/>
-              <w:left w:val="single" w:color="999999" w:sz="4"/>
-              <w:bottom w:val="single" w:color="999999" w:sz="4"/>
-              <w:right w:val="single" w:color="999999" w:sz="4"/>
-            </w:tcBorders>
-            <w:shd w:fill="D9E2EC" w:color="auto" w:val="clear"/>
-            <w:tcMar>
-              <w:top w:type="dxa" w:w="50"/>
-              <w:left w:type="dxa" w:w="90"/>
-              <w:bottom w:type="dxa" w:w="50"/>
-              <w:right w:type="dxa" w:w="90"/>
-            </w:tcMar>
-            <w:vAlign w:val="center"/>
-          </w:tcPr>
-          <w:p>
-            <w:pPr>
-              <w:jc w:val="left"/>
-            </w:pPr>
-            <w:r>
-              <w:rPr>
-                <w:b/>
-                <w:bCs/>
-                <w:sz w:val="17"/>
-                <w:szCs w:val="17"/>
-              </w:rPr>
-              <w:t xml:space="preserve">Ud</w:t>
-            </w:r>
-          </w:p>
-        </w:tc>
-        <w:tc>
-          <w:tcPr>
-            <w:tcW w:type="dxa" w:w="4300"/>
-            <w:tcBorders>
-              <w:top w:val="single" w:color="999999" w:sz="4"/>
-              <w:left w:val="single" w:color="999999" w:sz="4"/>
-              <w:bottom w:val="single" w:color="999999" w:sz="4"/>
-              <w:right w:val="single" w:color="999999" w:sz="4"/>
-            </w:tcBorders>
-            <w:shd w:fill="D9E2EC" w:color="auto" w:val="clear"/>
-            <w:tcMar>
-              <w:top w:type="dxa" w:w="50"/>
-              <w:left w:type="dxa" w:w="90"/>
-              <w:bottom w:type="dxa" w:w="50"/>
-              <w:right w:type="dxa" w:w="90"/>
-            </w:tcMar>
-            <w:vAlign w:val="center"/>
-          </w:tcPr>
-          <w:p>
-            <w:pPr>
-              <w:jc w:val="left"/>
-            </w:pPr>
-            <w:r>
-              <w:rPr>
-                <w:b/>
-                <w:bCs/>
-                <w:sz w:val="17"/>
-                <w:szCs w:val="17"/>
-              </w:rPr>
-              <w:t xml:space="preserve">Descripció</w:t>
-            </w:r>
-          </w:p>
-        </w:tc>
-        <w:tc>
-          <w:tcPr>
-            <w:tcW w:type="dxa" w:w="2000"/>
-            <w:tcBorders>
-              <w:top w:val="single" w:color="999999" w:sz="4"/>
-              <w:left w:val="single" w:color="999999" w:sz="4"/>
-              <w:bottom w:val="single" w:color="999999" w:sz="4"/>
-              <w:right w:val="single" w:color="999999" w:sz="4"/>
-            </w:tcBorders>
-            <w:shd w:fill="D9E2EC" w:color="auto" w:val="clear"/>
-            <w:tcMar>
-              <w:top w:type="dxa" w:w="50"/>
-              <w:left w:type="dxa" w:w="90"/>
-              <w:bottom w:type="dxa" w:w="50"/>
-              <w:right w:type="dxa" w:w="90"/>
-            </w:tcMar>
-            <w:vAlign w:val="center"/>
-          </w:tcPr>
-          <w:p>
-            <w:pPr>
-              <w:jc w:val="left"/>
-            </w:pPr>
-            <w:r>
-              <w:rPr>
-                <w:b/>
-                <w:bCs/>
-                <w:sz w:val="17"/>
-                <w:szCs w:val="17"/>
-              </w:rPr>
-              <w:t xml:space="preserve">Import (€)</w:t>
-            </w:r>
-          </w:p>
-        </w:tc>
-      </w:tr>
-      <w:tr>
-        <w:trPr>
-          <w:cantSplit/>
-          <w:tblHeader w:val="false"/>
-        </w:trPr>
-        <w:tc>
-          <w:tcPr>
-            <w:tcW w:type="dxa" w:w="1800"/>
-            <w:tcBorders>
-              <w:top w:val="single" w:color="999999" w:sz="4"/>
-              <w:left w:val="single" w:color="999999" w:sz="4"/>
-              <w:bottom w:val="single" w:color="999999" w:sz="4"/>
-              <w:right w:val="single" w:color="999999" w:sz="4"/>
-            </w:tcBorders>
-            <w:tcMar>
-              <w:top w:type="dxa" w:w="50"/>
-              <w:left w:type="dxa" w:w="90"/>
-              <w:bottom w:type="dxa" w:w="50"/>
-              <w:right w:type="dxa" w:w="90"/>
-            </w:tcMar>
-            <w:vAlign w:val="center"/>
-          </w:tcPr>
-          <w:p>
-            <w:pPr>
-              <w:jc w:val="left"/>
-            </w:pPr>
-            <w:r>
-              <w:rPr>
-                <w:sz w:val="17"/>
-                <w:szCs w:val="17"/>
-              </w:rPr>
-              <w:t xml:space="preserve">PTOCORREJAM</w:t>
-            </w:r>
-          </w:p>
-        </w:tc>
-        <w:tc>
-          <w:tcPr>
-            <w:tcW w:type="dxa" w:w="900"/>
-            <w:tcBorders>
-              <w:top w:val="single" w:color="999999" w:sz="4"/>
-              <w:left w:val="single" w:color="999999" w:sz="4"/>
-              <w:bottom w:val="single" w:color="999999" w:sz="4"/>
-              <w:right w:val="single" w:color="999999" w:sz="4"/>
-            </w:tcBorders>
-            <w:tcMar>
-              <w:top w:type="dxa" w:w="50"/>
-              <w:left w:type="dxa" w:w="90"/>
-              <w:bottom w:type="dxa" w:w="50"/>
-              <w:right w:type="dxa" w:w="90"/>
-            </w:tcMar>
-            <w:vAlign w:val="center"/>
-          </w:tcPr>
-          <w:p>
-            <w:pPr>
-              <w:jc w:val="right"/>
-            </w:pPr>
-            <w:r>
-              <w:rPr>
-                <w:sz w:val="17"/>
-                <w:szCs w:val="17"/>
-              </w:rPr>
-              <w:t xml:space="preserve">1</w:t>
-            </w:r>
-          </w:p>
-        </w:tc>
-        <w:tc>
-          <w:tcPr>
-            <w:tcW w:type="dxa" w:w="4300"/>
-            <w:tcBorders>
-              <w:top w:val="single" w:color="999999" w:sz="4"/>
-              <w:left w:val="single" w:color="999999" w:sz="4"/>
-              <w:bottom w:val="single" w:color="999999" w:sz="4"/>
-              <w:right w:val="single" w:color="999999" w:sz="4"/>
-            </w:tcBorders>
-            <w:tcMar>
-              <w:top w:type="dxa" w:w="50"/>
-              <w:left w:type="dxa" w:w="90"/>
-              <w:bottom w:type="dxa" w:w="50"/>
-              <w:right w:type="dxa" w:w="90"/>
-            </w:tcMar>
-            <w:vAlign w:val="center"/>
-          </w:tcPr>
-          <w:p>
-            <w:pPr>
-              <w:jc w:val="left"/>
-            </w:pPr>
-            <w:r>
-              <w:rPr>
-                <w:sz w:val="17"/>
-                <w:szCs w:val="17"/>
-              </w:rPr>
-              <w:t xml:space="preserve">Porta corredissa JAM de 5.770×3.000 mm, galvanitzada, motoritzada (BK-1200)</w:t>
-            </w:r>
-          </w:p>
-        </w:tc>
-        <w:tc>
-          <w:tcPr>
-            <w:tcW w:type="dxa" w:w="2000"/>
-            <w:tcBorders>
-              <w:top w:val="single" w:color="999999" w:sz="4"/>
-              <w:left w:val="single" w:color="999999" w:sz="4"/>
-              <w:bottom w:val="single" w:color="999999" w:sz="4"/>
-              <w:right w:val="single" w:color="999999" w:sz="4"/>
-            </w:tcBorders>
-            <w:tcMar>
-              <w:top w:type="dxa" w:w="50"/>
-              <w:left w:type="dxa" w:w="90"/>
-              <w:bottom w:type="dxa" w:w="50"/>
-              <w:right w:type="dxa" w:w="90"/>
-            </w:tcMar>
-            <w:vAlign w:val="center"/>
-          </w:tcPr>
-          <w:p>
-            <w:pPr>
-              <w:jc w:val="right"/>
-            </w:pPr>
-            <w:r>
-              <w:rPr>
-                <w:sz w:val="17"/>
-                <w:szCs w:val="17"/>
-              </w:rPr>
-              <w:t xml:space="preserve">8.552,41</w:t>
-            </w:r>
-          </w:p>
-        </w:tc>
-      </w:tr>
-      <w:tr>
-        <w:trPr>
-          <w:cantSplit/>
-          <w:tblHeader w:val="false"/>
-        </w:trPr>
-        <w:tc>
-          <w:tcPr>
-            <w:tcW w:type="dxa" w:w="1800"/>
-            <w:tcBorders>
-              <w:top w:val="single" w:color="999999" w:sz="4"/>
-              <w:left w:val="single" w:color="999999" w:sz="4"/>
-              <w:bottom w:val="single" w:color="999999" w:sz="4"/>
-              <w:right w:val="single" w:color="999999" w:sz="4"/>
-            </w:tcBorders>
-            <w:tcMar>
-              <w:top w:type="dxa" w:w="50"/>
-              <w:left w:type="dxa" w:w="90"/>
-              <w:bottom w:type="dxa" w:w="50"/>
-              <w:right w:type="dxa" w:w="90"/>
-            </w:tcMar>
-            <w:vAlign w:val="center"/>
-          </w:tcPr>
-          <w:p>
-            <w:pPr>
-              <w:jc w:val="left"/>
-            </w:pPr>
-            <w:r>
-              <w:rPr>
-                <w:sz w:val="17"/>
-                <w:szCs w:val="17"/>
-              </w:rPr>
-              <w:t xml:space="preserve">PTOCANCJAM</w:t>
-            </w:r>
-          </w:p>
-        </w:tc>
-        <w:tc>
-          <w:tcPr>
-            <w:tcW w:type="dxa" w:w="900"/>
-            <w:tcBorders>
-              <w:top w:val="single" w:color="999999" w:sz="4"/>
-              <w:left w:val="single" w:color="999999" w:sz="4"/>
-              <w:bottom w:val="single" w:color="999999" w:sz="4"/>
-              <w:right w:val="single" w:color="999999" w:sz="4"/>
-            </w:tcBorders>
-            <w:tcMar>
-              <w:top w:type="dxa" w:w="50"/>
-              <w:left w:type="dxa" w:w="90"/>
-              <w:bottom w:type="dxa" w:w="50"/>
-              <w:right w:type="dxa" w:w="90"/>
-            </w:tcMar>
-            <w:vAlign w:val="center"/>
-          </w:tcPr>
-          <w:p>
-            <w:pPr>
-              <w:jc w:val="right"/>
-            </w:pPr>
-            <w:r>
-              <w:rPr>
-                <w:sz w:val="17"/>
-                <w:szCs w:val="17"/>
-              </w:rPr>
-              <w:t xml:space="preserve">4</w:t>
-            </w:r>
-          </w:p>
-        </w:tc>
-        <w:tc>
-          <w:tcPr>
-            <w:tcW w:type="dxa" w:w="4300"/>
-            <w:tcBorders>
-              <w:top w:val="single" w:color="999999" w:sz="4"/>
-              <w:left w:val="single" w:color="999999" w:sz="4"/>
-              <w:bottom w:val="single" w:color="999999" w:sz="4"/>
-              <w:right w:val="single" w:color="999999" w:sz="4"/>
-            </w:tcBorders>
-            <w:tcMar>
-              <w:top w:type="dxa" w:w="50"/>
-              <w:left w:type="dxa" w:w="90"/>
-              <w:bottom w:type="dxa" w:w="50"/>
-              <w:right w:type="dxa" w:w="90"/>
-            </w:tcMar>
-            <w:vAlign w:val="center"/>
-          </w:tcPr>
-          <w:p>
-            <w:pPr>
-              <w:jc w:val="left"/>
-            </w:pPr>
-            <w:r>
-              <w:rPr>
-                <w:sz w:val="17"/>
-                <w:szCs w:val="17"/>
-              </w:rPr>
-              <w:t xml:space="preserve">Cancel·la JAM de 2 fulles de 2.500×3.000 mm, galvanitzada (3.857,84 €/u)</w:t>
-            </w:r>
-          </w:p>
-        </w:tc>
-        <w:tc>
-          <w:tcPr>
-            <w:tcW w:type="dxa" w:w="2000"/>
-            <w:tcBorders>
-              <w:top w:val="single" w:color="999999" w:sz="4"/>
-              <w:left w:val="single" w:color="999999" w:sz="4"/>
-              <w:bottom w:val="single" w:color="999999" w:sz="4"/>
-              <w:right w:val="single" w:color="999999" w:sz="4"/>
-            </w:tcBorders>
-            <w:tcMar>
-              <w:top w:type="dxa" w:w="50"/>
-              <w:left w:type="dxa" w:w="90"/>
-              <w:bottom w:type="dxa" w:w="50"/>
-              <w:right w:type="dxa" w:w="90"/>
-            </w:tcMar>
-            <w:vAlign w:val="center"/>
-          </w:tcPr>
-          <w:p>
-            <w:pPr>
-              <w:jc w:val="right"/>
-            </w:pPr>
-            <w:r>
-              <w:rPr>
-                <w:sz w:val="17"/>
-                <w:szCs w:val="17"/>
-              </w:rPr>
-              <w:t xml:space="preserve">15.431,36</w:t>
-            </w:r>
-          </w:p>
-        </w:tc>
-      </w:tr>
-      <w:tr>
-        <w:trPr>
-          <w:cantSplit/>
-          <w:tblHeader w:val="false"/>
-        </w:trPr>
-        <w:tc>
-          <w:tcPr>
-            <w:tcW w:type="dxa" w:w="1800"/>
-            <w:tcBorders>
-              <w:top w:val="single" w:color="999999" w:sz="4"/>
-              <w:left w:val="single" w:color="999999" w:sz="4"/>
-              <w:bottom w:val="single" w:color="999999" w:sz="4"/>
-              <w:right w:val="single" w:color="999999" w:sz="4"/>
-            </w:tcBorders>
-            <w:tcMar>
-              <w:top w:type="dxa" w:w="50"/>
-              <w:left w:type="dxa" w:w="90"/>
-              <w:bottom w:type="dxa" w:w="50"/>
-              <w:right w:type="dxa" w:w="90"/>
-            </w:tcMar>
-            <w:vAlign w:val="center"/>
-          </w:tcPr>
-          <w:p>
-            <w:pPr>
-              <w:jc w:val="left"/>
-            </w:pPr>
-            <w:r>
-              <w:rPr>
-                <w:sz w:val="17"/>
-                <w:szCs w:val="17"/>
-              </w:rPr>
-              <w:t xml:space="preserve"/>
-            </w:r>
-          </w:p>
-        </w:tc>
-        <w:tc>
-          <w:tcPr>
-            <w:tcW w:type="dxa" w:w="900"/>
-            <w:tcBorders>
-              <w:top w:val="single" w:color="999999" w:sz="4"/>
-              <w:left w:val="single" w:color="999999" w:sz="4"/>
-              <w:bottom w:val="single" w:color="999999" w:sz="4"/>
-              <w:right w:val="single" w:color="999999" w:sz="4"/>
-            </w:tcBorders>
-            <w:tcMar>
-              <w:top w:type="dxa" w:w="50"/>
-              <w:left w:type="dxa" w:w="90"/>
-              <w:bottom w:type="dxa" w:w="50"/>
-              <w:right w:type="dxa" w:w="90"/>
-            </w:tcMar>
-            <w:vAlign w:val="center"/>
-          </w:tcPr>
-          <w:p>
-            <w:pPr>
-              <w:jc w:val="left"/>
-            </w:pPr>
-            <w:r>
-              <w:rPr>
-                <w:sz w:val="17"/>
-                <w:szCs w:val="17"/>
-              </w:rPr>
-              <w:t xml:space="preserve"/>
-            </w:r>
-          </w:p>
-        </w:tc>
-        <w:tc>
-          <w:tcPr>
-            <w:tcW w:type="dxa" w:w="4300"/>
-            <w:tcBorders>
-              <w:top w:val="single" w:color="999999" w:sz="4"/>
-              <w:left w:val="single" w:color="999999" w:sz="4"/>
-              <w:bottom w:val="single" w:color="999999" w:sz="4"/>
-              <w:right w:val="single" w:color="999999" w:sz="4"/>
-            </w:tcBorders>
-            <w:tcMar>
-              <w:top w:type="dxa" w:w="50"/>
-              <w:left w:type="dxa" w:w="90"/>
-              <w:bottom w:type="dxa" w:w="50"/>
-              <w:right w:type="dxa" w:w="90"/>
-            </w:tcMar>
-            <w:vAlign w:val="center"/>
-          </w:tcPr>
-          <w:p>
-            <w:pPr>
-              <w:jc w:val="left"/>
-            </w:pPr>
-            <w:r>
-              <w:rPr>
-                <w:b/>
-                <w:bCs/>
-                <w:sz w:val="17"/>
-                <w:szCs w:val="17"/>
-              </w:rPr>
-              <w:t xml:space="preserve">Base imposable</w:t>
-            </w:r>
-          </w:p>
-        </w:tc>
-        <w:tc>
-          <w:tcPr>
-            <w:tcW w:type="dxa" w:w="2000"/>
-            <w:tcBorders>
-              <w:top w:val="single" w:color="999999" w:sz="4"/>
-              <w:left w:val="single" w:color="999999" w:sz="4"/>
-              <w:bottom w:val="single" w:color="999999" w:sz="4"/>
-              <w:right w:val="single" w:color="999999" w:sz="4"/>
-            </w:tcBorders>
-            <w:tcMar>
-              <w:top w:type="dxa" w:w="50"/>
-              <w:left w:type="dxa" w:w="90"/>
-              <w:bottom w:type="dxa" w:w="50"/>
-              <w:right w:type="dxa" w:w="90"/>
-            </w:tcMar>
-            <w:vAlign w:val="center"/>
-          </w:tcPr>
-          <w:p>
-            <w:pPr>
-              <w:jc w:val="right"/>
-            </w:pPr>
-            <w:r>
-              <w:rPr>
-                <w:b/>
-                <w:bCs/>
-                <w:sz w:val="17"/>
-                <w:szCs w:val="17"/>
-              </w:rPr>
-              <w:t xml:space="preserve">23.983,77</w:t>
-            </w:r>
-          </w:p>
-        </w:tc>
-      </w:tr>
-      <w:tr>
-        <w:trPr>
-          <w:cantSplit/>
-          <w:tblHeader w:val="false"/>
-        </w:trPr>
-        <w:tc>
-          <w:tcPr>
-            <w:tcW w:type="dxa" w:w="1800"/>
-            <w:tcBorders>
-              <w:top w:val="single" w:color="999999" w:sz="4"/>
-              <w:left w:val="single" w:color="999999" w:sz="4"/>
-              <w:bottom w:val="single" w:color="999999" w:sz="4"/>
-              <w:right w:val="single" w:color="999999" w:sz="4"/>
-            </w:tcBorders>
-            <w:tcMar>
-              <w:top w:type="dxa" w:w="50"/>
-              <w:left w:type="dxa" w:w="90"/>
-              <w:bottom w:type="dxa" w:w="50"/>
-              <w:right w:type="dxa" w:w="90"/>
-            </w:tcMar>
-            <w:vAlign w:val="center"/>
-          </w:tcPr>
-          <w:p>
-            <w:pPr>
-              <w:jc w:val="left"/>
-            </w:pPr>
-            <w:r>
-              <w:rPr>
-                <w:sz w:val="17"/>
-                <w:szCs w:val="17"/>
-              </w:rPr>
-              <w:t xml:space="preserve"/>
-            </w:r>
-          </w:p>
-        </w:tc>
-        <w:tc>
-          <w:tcPr>
-            <w:tcW w:type="dxa" w:w="900"/>
-            <w:tcBorders>
-              <w:top w:val="single" w:color="999999" w:sz="4"/>
-              <w:left w:val="single" w:color="999999" w:sz="4"/>
-              <w:bottom w:val="single" w:color="999999" w:sz="4"/>
-              <w:right w:val="single" w:color="999999" w:sz="4"/>
-            </w:tcBorders>
-            <w:tcMar>
-              <w:top w:type="dxa" w:w="50"/>
-              <w:left w:type="dxa" w:w="90"/>
-              <w:bottom w:type="dxa" w:w="50"/>
-              <w:right w:type="dxa" w:w="90"/>
-            </w:tcMar>
-            <w:vAlign w:val="center"/>
-          </w:tcPr>
-          <w:p>
-            <w:pPr>
-              <w:jc w:val="left"/>
-            </w:pPr>
-            <w:r>
-              <w:rPr>
-                <w:sz w:val="17"/>
-                <w:szCs w:val="17"/>
-              </w:rPr>
-              <w:t xml:space="preserve"/>
-            </w:r>
-          </w:p>
-        </w:tc>
-        <w:tc>
-          <w:tcPr>
-            <w:tcW w:type="dxa" w:w="4300"/>
-            <w:tcBorders>
-              <w:top w:val="single" w:color="999999" w:sz="4"/>
-              <w:left w:val="single" w:color="999999" w:sz="4"/>
-              <w:bottom w:val="single" w:color="999999" w:sz="4"/>
-              <w:right w:val="single" w:color="999999" w:sz="4"/>
-            </w:tcBorders>
-            <w:tcMar>
-              <w:top w:type="dxa" w:w="50"/>
-              <w:left w:type="dxa" w:w="90"/>
-              <w:bottom w:type="dxa" w:w="50"/>
-              <w:right w:type="dxa" w:w="90"/>
-            </w:tcMar>
-            <w:vAlign w:val="center"/>
-          </w:tcPr>
-          <w:p>
-            <w:pPr>
-              <w:jc w:val="left"/>
-            </w:pPr>
-            <w:r>
-              <w:rPr>
-                <w:sz w:val="17"/>
-                <w:szCs w:val="17"/>
-              </w:rPr>
-              <w:t xml:space="preserve">IVA 21 %</w:t>
-            </w:r>
-          </w:p>
-        </w:tc>
-        <w:tc>
-          <w:tcPr>
-            <w:tcW w:type="dxa" w:w="2000"/>
-            <w:tcBorders>
-              <w:top w:val="single" w:color="999999" w:sz="4"/>
-              <w:left w:val="single" w:color="999999" w:sz="4"/>
-              <w:bottom w:val="single" w:color="999999" w:sz="4"/>
-              <w:right w:val="single" w:color="999999" w:sz="4"/>
-            </w:tcBorders>
-            <w:tcMar>
-              <w:top w:type="dxa" w:w="50"/>
-              <w:left w:type="dxa" w:w="90"/>
-              <w:bottom w:type="dxa" w:w="50"/>
-              <w:right w:type="dxa" w:w="90"/>
-            </w:tcMar>
-            <w:vAlign w:val="center"/>
-          </w:tcPr>
-          <w:p>
-            <w:pPr>
-              <w:jc w:val="right"/>
-            </w:pPr>
-            <w:r>
-              <w:rPr>
-                <w:sz w:val="17"/>
-                <w:szCs w:val="17"/>
-              </w:rPr>
-              <w:t xml:space="preserve">5.036,59</w:t>
-            </w:r>
-          </w:p>
-        </w:tc>
-      </w:tr>
-      <w:tr>
-        <w:trPr>
-          <w:cantSplit/>
-          <w:tblHeader w:val="false"/>
-        </w:trPr>
-        <w:tc>
-          <w:tcPr>
-            <w:tcW w:type="dxa" w:w="1800"/>
-            <w:tcBorders>
-              <w:top w:val="single" w:color="999999" w:sz="4"/>
-              <w:left w:val="single" w:color="999999" w:sz="4"/>
-              <w:bottom w:val="single" w:color="999999" w:sz="4"/>
-              <w:right w:val="single" w:color="999999" w:sz="4"/>
-            </w:tcBorders>
-            <w:tcMar>
-              <w:top w:type="dxa" w:w="50"/>
-              <w:left w:type="dxa" w:w="90"/>
-              <w:bottom w:type="dxa" w:w="50"/>
-              <w:right w:type="dxa" w:w="90"/>
-            </w:tcMar>
-            <w:vAlign w:val="center"/>
-          </w:tcPr>
-          <w:p>
-            <w:pPr>
-              <w:jc w:val="left"/>
-            </w:pPr>
-            <w:r>
-              <w:rPr>
-                <w:sz w:val="17"/>
-                <w:szCs w:val="17"/>
-              </w:rPr>
-              <w:t xml:space="preserve"/>
-            </w:r>
-          </w:p>
-        </w:tc>
-        <w:tc>
-          <w:tcPr>
-            <w:tcW w:type="dxa" w:w="900"/>
-            <w:tcBorders>
-              <w:top w:val="single" w:color="999999" w:sz="4"/>
-              <w:left w:val="single" w:color="999999" w:sz="4"/>
-              <w:bottom w:val="single" w:color="999999" w:sz="4"/>
-              <w:right w:val="single" w:color="999999" w:sz="4"/>
-            </w:tcBorders>
-            <w:tcMar>
-              <w:top w:type="dxa" w:w="50"/>
-              <w:left w:type="dxa" w:w="90"/>
-              <w:bottom w:type="dxa" w:w="50"/>
-              <w:right w:type="dxa" w:w="90"/>
-            </w:tcMar>
-            <w:vAlign w:val="center"/>
-          </w:tcPr>
-          <w:p>
-            <w:pPr>
-              <w:jc w:val="left"/>
-            </w:pPr>
-            <w:r>
-              <w:rPr>
-                <w:sz w:val="17"/>
-                <w:szCs w:val="17"/>
-              </w:rPr>
-              <w:t xml:space="preserve"/>
-            </w:r>
-          </w:p>
-        </w:tc>
-        <w:tc>
-          <w:tcPr>
-            <w:tcW w:type="dxa" w:w="4300"/>
-            <w:tcBorders>
-              <w:top w:val="single" w:color="999999" w:sz="4"/>
-              <w:left w:val="single" w:color="999999" w:sz="4"/>
-              <w:bottom w:val="single" w:color="999999" w:sz="4"/>
-              <w:right w:val="single" w:color="999999" w:sz="4"/>
-            </w:tcBorders>
-            <w:tcMar>
-              <w:top w:type="dxa" w:w="50"/>
-              <w:left w:type="dxa" w:w="90"/>
-              <w:bottom w:type="dxa" w:w="50"/>
-              <w:right w:type="dxa" w:w="90"/>
-            </w:tcMar>
-            <w:vAlign w:val="center"/>
-          </w:tcPr>
-          <w:p>
-            <w:pPr>
-              <w:jc w:val="left"/>
-            </w:pPr>
-            <w:r>
-              <w:rPr>
-                <w:b/>
-                <w:bCs/>
-                <w:sz w:val="17"/>
-                <w:szCs w:val="17"/>
-              </w:rPr>
-              <w:t xml:space="preserve">Total oferta</w:t>
-            </w:r>
-          </w:p>
-        </w:tc>
-        <w:tc>
-          <w:tcPr>
-            <w:tcW w:type="dxa" w:w="2000"/>
-            <w:tcBorders>
-              <w:top w:val="single" w:color="999999" w:sz="4"/>
-              <w:left w:val="single" w:color="999999" w:sz="4"/>
-              <w:bottom w:val="single" w:color="999999" w:sz="4"/>
-              <w:right w:val="single" w:color="999999" w:sz="4"/>
-            </w:tcBorders>
-            <w:tcMar>
-              <w:top w:type="dxa" w:w="50"/>
-              <w:left w:type="dxa" w:w="90"/>
-              <w:bottom w:type="dxa" w:w="50"/>
-              <w:right w:type="dxa" w:w="90"/>
-            </w:tcMar>
-            <w:vAlign w:val="center"/>
-          </w:tcPr>
-          <w:p>
-            <w:pPr>
-              <w:jc w:val="right"/>
-            </w:pPr>
-            <w:r>
-              <w:rPr>
-                <w:b/>
-                <w:bCs/>
-                <w:sz w:val="17"/>
-                <w:szCs w:val="17"/>
-              </w:rPr>
-              <w:t xml:space="preserve">29.020,36</w:t>
-            </w:r>
-          </w:p>
-        </w:tc>
-      </w:tr>
-    </w:tbl>
-    <w:p>
-      <w:pPr>
-        <w:spacing w:after="60" w:before="0" w:line="300"/>
-        <w:jc w:val="both"/>
-      </w:pPr>
-      <w:r>
-        <w:t xml:space="preserve"/>
-      </w:r>
-    </w:p>
-    <w:p>
-      <w:pPr>
-        <w:spacing w:after="120" w:before="0" w:line="300"/>
-        <w:jc w:val="both"/>
-      </w:pPr>
-      <w:r>
-        <w:rPr>
-          <w:b/>
-          <w:bCs/>
-        </w:rPr>
-        <w:t xml:space="preserve">Condicions rellevants de l’oferta:</w:t>
-      </w:r>
-    </w:p>
-    <w:p>
-      <w:pPr>
-        <w:pStyle w:val="ListParagraph"/>
-        <w:numPr>
-          <w:ilvl w:val="0"/>
-          <w:numId w:val="4"/>
-        </w:numPr>
-        <w:spacing w:after="60" w:line="300"/>
-        <w:jc w:val="both"/>
-      </w:pPr>
-      <w:r>
-        <w:t xml:space="preserve">Inclou el desplaçament per comprovar mides, i el subministrament i la col·locació de les portes.</w:t>
-      </w:r>
-    </w:p>
-    <w:p>
-      <w:pPr>
-        <w:pStyle w:val="ListParagraph"/>
-        <w:numPr>
-          <w:ilvl w:val="0"/>
-          <w:numId w:val="4"/>
-        </w:numPr>
-        <w:spacing w:after="60" w:line="300"/>
-        <w:jc w:val="both"/>
-      </w:pPr>
-      <w:r>
-        <w:t xml:space="preserve">Exclou el desmuntatge d’instal·lacions i estructures i la intervenció de paletes.</w:t>
-      </w:r>
-    </w:p>
-    <w:p>
-      <w:pPr>
-        <w:pStyle w:val="ListParagraph"/>
-        <w:numPr>
-          <w:ilvl w:val="0"/>
-          <w:numId w:val="4"/>
-        </w:numPr>
-        <w:spacing w:after="60" w:line="300"/>
-        <w:jc w:val="both"/>
-      </w:pPr>
-      <w:r>
-        <w:t xml:space="preserve">La presa de corrent per al motor, la maniobra i els sistemes de seguretat ha d’estar al punt previst quan es munti la porta.</w:t>
-      </w:r>
-    </w:p>
-    <w:p>
-      <w:pPr>
-        <w:pStyle w:val="ListParagraph"/>
-        <w:numPr>
-          <w:ilvl w:val="0"/>
-          <w:numId w:val="4"/>
-        </w:numPr>
-        <w:spacing w:after="60" w:line="300"/>
-        <w:jc w:val="both"/>
-      </w:pPr>
-      <w:r>
-        <w:t xml:space="preserve">No inclou dispositius antipànic. Les portes peatonals del projecte els han d’incorporar (UNE-EN 1125).</w:t>
-      </w:r>
-    </w:p>
-    <w:p>
-      <w:pPr>
-        <w:pStyle w:val="ListParagraph"/>
-        <w:numPr>
-          <w:ilvl w:val="0"/>
-          <w:numId w:val="4"/>
-        </w:numPr>
-        <w:spacing w:after="60" w:line="300"/>
-        <w:jc w:val="both"/>
-      </w:pPr>
-      <w:r>
-        <w:t xml:space="preserve">Validesa de 15 dies. Pagament: 40 % de bestreta i la resta en acabar l’obra.</w:t>
-      </w:r>
-    </w:p>
-    <w:p>
-      <w:pPr>
-        <w:spacing w:after="120" w:before="0" w:line="300"/>
-        <w:jc w:val="both"/>
-      </w:pPr>
-      <w:r>
-        <w:rPr>
-          <w:highlight w:val="yellow"/>
-        </w:rPr>
-        <w:t xml:space="preserve">Adjuntar el PDF original “74666 IGNASI TUTZÓ.pdf” en compondre el document final, i demanar a Mansergas una oferta complementària amb el kit antipànic.</w:t>
       </w:r>
     </w:p>
     <w:p>

</xml_diff>

<commit_message>
Memòria: sense notes pendents, S&S al 2 % del PEM, plànols només al PDF i PDF complet amb plànols A3
Co-Authored-By: Claude Opus 5.5 <noreply@anthropic.com>
Claude-Session: https://claude.ai/code/session_01LriNJKpLsMik4TbQD5oKzn
</commit_message>
<xml_diff>
--- a/memoria/20261005 - Memòria substitució portes accés Nau Turbines.docx
+++ b/memoria/20261005 - Memòria substitució portes accés Nau Turbines.docx
@@ -2796,25 +2796,6 @@
       </w:pPr>
       <w:r>
         <w:t xml:space="preserve"/>
-      </w:r>
-    </w:p>
-    <w:p>
-      <w:pPr>
-        <w:spacing w:after="120" w:before="0" w:line="300"/>
-        <w:jc w:val="both"/>
-      </w:pPr>
-      <w:r>
-        <w:rPr>
-          <w:b/>
-          <w:bCs/>
-        </w:rPr>
-        <w:t xml:space="preserve">Nota: </w:t>
-      </w:r>
-      <w:r>
-        <w:rPr>
-          <w:highlight w:val="yellow"/>
-        </w:rPr>
-        <w:t xml:space="preserve">Les llums de pas s’han obtingut del plànol 02 (proposta). Abans de la fabricació el contractista les ha de comprovar en obra, i cal mantenir com a mínim una llum útil total de 15,00 m (criteri dels projectes originals) i 2,40 m de llum lliure per a cada porta peatonal.</w:t>
       </w:r>
     </w:p>
     <w:p>
@@ -3784,18 +3765,6 @@
     </w:p>
     <w:p>
       <w:pPr>
-        <w:spacing w:after="120" w:before="0" w:line="300"/>
-        <w:jc w:val="both"/>
-      </w:pPr>
-      <w:r>
-        <w:rPr>
-          <w:highlight w:val="yellow"/>
-        </w:rPr>
-        <w:t xml:space="preserve">El fabricant de les portes que resulti adjudicatari ha de confirmar les dimensions de les plaques i de la torreta, i les reaccions de la porta corredissa (pes i bolcada), abans de formigonar. La direcció facultativa pot ajustar les dimensions dels daus segons el terreny que es trobi.</w:t>
-      </w:r>
-    </w:p>
-    <w:p>
-      <w:pPr>
         <w:pStyle w:val="Heading2"/>
       </w:pPr>
       <w:r>
@@ -3948,18 +3917,6 @@
       </w:pPr>
       <w:r>
         <w:t xml:space="preserve">El motor de la porta corredissa necessita alimentació monofàsica de 230 V (380 W), que es valora al capítol 09. S’alimentarà des del quadre elèctric existent a l’extrem esquerre de la tanca (element 7 dels plànols), amb una línia nova de cable RZ1-K 3G2,5 mm² protegida al quadre amb magnetotèrmic de 10 A i diferencial de 30 mA. Per arribar al motor, a l’extrem dret, la línia es passarà pel conducte soterrat existent Ø 50 mm (element 8), que ja creua tot el front de la tanca, fent-hi passar només el nou cable amb guia i sense manipular ni desconnectar els cables existents, de manera que no cal obrir cap rasa a la zona de la línia elèctrica soterrada. Es farà d’acord amb el REBT i es lliurarà el butlletí corresponent.</w:t>
-      </w:r>
-    </w:p>
-    <w:p>
-      <w:pPr>
-        <w:spacing w:after="120" w:before="0" w:line="300"/>
-        <w:jc w:val="both"/>
-      </w:pPr>
-      <w:r>
-        <w:rPr>
-          <w:highlight w:val="yellow"/>
-        </w:rPr>
-        <w:t xml:space="preserve">Abans de l’obra cal comprovar que el conducte existent (element 8) té secció lliure suficient per passar-hi la nova línia, i que el quadre 7 té capacitat per a un circuit addicional. Si no en té, la línia s’haurà de passar per un tub nou, que es col·locarà sense afectar la línia existent i amb l’autorització de la direcció facultativa.</w:t>
       </w:r>
     </w:p>
     <w:p>
@@ -4803,7 +4760,7 @@
         <w:jc w:val="both"/>
       </w:pPr>
       <w:r>
-        <w:t xml:space="preserve">Els plànols s’adjunten a continuació a títol informatiu. Els plànols vàlids per a la tramitació són els del PDF a escala.</w:t>
+        <w:t xml:space="preserve">Els plànols s’adjunten a continuació, a escala, en format A3.</w:t>
       </w:r>
     </w:p>
     <w:p>
@@ -4813,257 +4770,6 @@
           <w:footerReference w:type="default" r:id="rId8"/>
           <w:pgSz w:w="11906" w:h="16838" w:orient="portrait"/>
           <w:pgMar w:top="1418" w:right="1134" w:bottom="1134" w:left="1134" w:header="567" w:footer="567" w:gutter="0"/>
-          <w:pgNumType/>
-          <w:docGrid w:linePitch="360"/>
-        </w:sectPr>
-      </w:pPr>
-    </w:p>
-    <w:p>
-      <w:pPr>
-        <w:jc w:val="center"/>
-      </w:pPr>
-      <w:r>
-        <w:drawing>
-          <wp:inline distT="0" distB="0" distL="0" distR="0">
-            <wp:extent cx="8382000" cy="5924550"/>
-            <wp:effectExtent t="0" r="0" b="0" l="0"/>
-            <wp:docPr id="1" name="" descr="" title=""/>
-            <wp:cNvGraphicFramePr>
-              <a:graphicFrameLocks xmlns:a="http://schemas.openxmlformats.org/drawingml/2006/main" noChangeAspect="1"/>
-            </wp:cNvGraphicFramePr>
-            <a:graphic xmlns:a="http://schemas.openxmlformats.org/drawingml/2006/main">
-              <a:graphicData uri="http://schemas.openxmlformats.org/drawingml/2006/picture">
-                <pic:pic xmlns:pic="http://schemas.openxmlformats.org/drawingml/2006/picture">
-                  <pic:nvPicPr>
-                    <pic:cNvPr id="0" name="" descr=""/>
-                    <pic:cNvPicPr>
-                      <a:picLocks noChangeAspect="1" noChangeArrowheads="1"/>
-                    </pic:cNvPicPr>
-                  </pic:nvPicPr>
-                  <pic:blipFill>
-                    <a:blip r:embed="rId13" cstate="none"/>
-                    <a:srcRect/>
-                    <a:stretch>
-                      <a:fillRect/>
-                    </a:stretch>
-                  </pic:blipFill>
-                  <pic:spPr bwMode="auto">
-                    <a:xfrm>
-                      <a:off x="0" y="0"/>
-                      <a:ext cx="8382000" cy="5924550"/>
-                    </a:xfrm>
-                    <a:prstGeom prst="rect">
-                      <a:avLst/>
-                    </a:prstGeom>
-                  </pic:spPr>
-                </pic:pic>
-              </a:graphicData>
-            </a:graphic>
-          </wp:inline>
-        </w:drawing>
-      </w:r>
-    </w:p>
-    <w:p>
-      <w:pPr>
-        <w:jc w:val="center"/>
-      </w:pPr>
-      <w:r>
-        <w:rPr>
-          <w:i/>
-          <w:iCs/>
-          <w:sz w:val="18"/>
-          <w:szCs w:val="18"/>
-        </w:rPr>
-        <w:t xml:space="preserve">Plànol 0 – Emplaçament (E 1:5000)</w:t>
-      </w:r>
-    </w:p>
-    <w:p>
-      <w:pPr>
-        <w:pageBreakBefore/>
-        <w:jc w:val="center"/>
-      </w:pPr>
-      <w:r>
-        <w:drawing>
-          <wp:inline distT="0" distB="0" distL="0" distR="0">
-            <wp:extent cx="8382000" cy="5924550"/>
-            <wp:effectExtent t="0" r="0" b="0" l="0"/>
-            <wp:docPr id="1" name="" descr="" title=""/>
-            <wp:cNvGraphicFramePr>
-              <a:graphicFrameLocks xmlns:a="http://schemas.openxmlformats.org/drawingml/2006/main" noChangeAspect="1"/>
-            </wp:cNvGraphicFramePr>
-            <a:graphic xmlns:a="http://schemas.openxmlformats.org/drawingml/2006/main">
-              <a:graphicData uri="http://schemas.openxmlformats.org/drawingml/2006/picture">
-                <pic:pic xmlns:pic="http://schemas.openxmlformats.org/drawingml/2006/picture">
-                  <pic:nvPicPr>
-                    <pic:cNvPr id="0" name="" descr=""/>
-                    <pic:cNvPicPr>
-                      <a:picLocks noChangeAspect="1" noChangeArrowheads="1"/>
-                    </pic:cNvPicPr>
-                  </pic:nvPicPr>
-                  <pic:blipFill>
-                    <a:blip r:embed="rId14" cstate="none"/>
-                    <a:srcRect/>
-                    <a:stretch>
-                      <a:fillRect/>
-                    </a:stretch>
-                  </pic:blipFill>
-                  <pic:spPr bwMode="auto">
-                    <a:xfrm>
-                      <a:off x="0" y="0"/>
-                      <a:ext cx="8382000" cy="5924550"/>
-                    </a:xfrm>
-                    <a:prstGeom prst="rect">
-                      <a:avLst/>
-                    </a:prstGeom>
-                  </pic:spPr>
-                </pic:pic>
-              </a:graphicData>
-            </a:graphic>
-          </wp:inline>
-        </w:drawing>
-      </w:r>
-    </w:p>
-    <w:p>
-      <w:pPr>
-        <w:jc w:val="center"/>
-      </w:pPr>
-      <w:r>
-        <w:rPr>
-          <w:i/>
-          <w:iCs/>
-          <w:sz w:val="18"/>
-          <w:szCs w:val="18"/>
-        </w:rPr>
-        <w:t xml:space="preserve">Plànol 01 – Estat actual. Planta i alçat (E 1:100 (A3))</w:t>
-      </w:r>
-    </w:p>
-    <w:p>
-      <w:pPr>
-        <w:pageBreakBefore/>
-        <w:jc w:val="center"/>
-      </w:pPr>
-      <w:r>
-        <w:drawing>
-          <wp:inline distT="0" distB="0" distL="0" distR="0">
-            <wp:extent cx="8382000" cy="5924550"/>
-            <wp:effectExtent t="0" r="0" b="0" l="0"/>
-            <wp:docPr id="1" name="" descr="" title=""/>
-            <wp:cNvGraphicFramePr>
-              <a:graphicFrameLocks xmlns:a="http://schemas.openxmlformats.org/drawingml/2006/main" noChangeAspect="1"/>
-            </wp:cNvGraphicFramePr>
-            <a:graphic xmlns:a="http://schemas.openxmlformats.org/drawingml/2006/main">
-              <a:graphicData uri="http://schemas.openxmlformats.org/drawingml/2006/picture">
-                <pic:pic xmlns:pic="http://schemas.openxmlformats.org/drawingml/2006/picture">
-                  <pic:nvPicPr>
-                    <pic:cNvPr id="0" name="" descr=""/>
-                    <pic:cNvPicPr>
-                      <a:picLocks noChangeAspect="1" noChangeArrowheads="1"/>
-                    </pic:cNvPicPr>
-                  </pic:nvPicPr>
-                  <pic:blipFill>
-                    <a:blip r:embed="rId15" cstate="none"/>
-                    <a:srcRect/>
-                    <a:stretch>
-                      <a:fillRect/>
-                    </a:stretch>
-                  </pic:blipFill>
-                  <pic:spPr bwMode="auto">
-                    <a:xfrm>
-                      <a:off x="0" y="0"/>
-                      <a:ext cx="8382000" cy="5924550"/>
-                    </a:xfrm>
-                    <a:prstGeom prst="rect">
-                      <a:avLst/>
-                    </a:prstGeom>
-                  </pic:spPr>
-                </pic:pic>
-              </a:graphicData>
-            </a:graphic>
-          </wp:inline>
-        </w:drawing>
-      </w:r>
-    </w:p>
-    <w:p>
-      <w:pPr>
-        <w:jc w:val="center"/>
-      </w:pPr>
-      <w:r>
-        <w:rPr>
-          <w:i/>
-          <w:iCs/>
-          <w:sz w:val="18"/>
-          <w:szCs w:val="18"/>
-        </w:rPr>
-        <w:t xml:space="preserve">Plànol 02 – Proposta tanca. Planta i alçat (E 1:100 (A3))</w:t>
-      </w:r>
-    </w:p>
-    <w:p>
-      <w:pPr>
-        <w:pageBreakBefore/>
-        <w:jc w:val="center"/>
-      </w:pPr>
-      <w:r>
-        <w:drawing>
-          <wp:inline distT="0" distB="0" distL="0" distR="0">
-            <wp:extent cx="8382000" cy="5924550"/>
-            <wp:effectExtent t="0" r="0" b="0" l="0"/>
-            <wp:docPr id="1" name="" descr="" title=""/>
-            <wp:cNvGraphicFramePr>
-              <a:graphicFrameLocks xmlns:a="http://schemas.openxmlformats.org/drawingml/2006/main" noChangeAspect="1"/>
-            </wp:cNvGraphicFramePr>
-            <a:graphic xmlns:a="http://schemas.openxmlformats.org/drawingml/2006/main">
-              <a:graphicData uri="http://schemas.openxmlformats.org/drawingml/2006/picture">
-                <pic:pic xmlns:pic="http://schemas.openxmlformats.org/drawingml/2006/picture">
-                  <pic:nvPicPr>
-                    <pic:cNvPr id="0" name="" descr=""/>
-                    <pic:cNvPicPr>
-                      <a:picLocks noChangeAspect="1" noChangeArrowheads="1"/>
-                    </pic:cNvPicPr>
-                  </pic:nvPicPr>
-                  <pic:blipFill>
-                    <a:blip r:embed="rId16" cstate="none"/>
-                    <a:srcRect/>
-                    <a:stretch>
-                      <a:fillRect/>
-                    </a:stretch>
-                  </pic:blipFill>
-                  <pic:spPr bwMode="auto">
-                    <a:xfrm>
-                      <a:off x="0" y="0"/>
-                      <a:ext cx="8382000" cy="5924550"/>
-                    </a:xfrm>
-                    <a:prstGeom prst="rect">
-                      <a:avLst/>
-                    </a:prstGeom>
-                  </pic:spPr>
-                </pic:pic>
-              </a:graphicData>
-            </a:graphic>
-          </wp:inline>
-        </w:drawing>
-      </w:r>
-    </w:p>
-    <w:p>
-      <w:pPr>
-        <w:jc w:val="center"/>
-      </w:pPr>
-      <w:r>
-        <w:rPr>
-          <w:i/>
-          <w:iCs/>
-          <w:sz w:val="18"/>
-          <w:szCs w:val="18"/>
-        </w:rPr>
-        <w:t xml:space="preserve">Plànol 03 – Enderroc i obra nova. Planta i alçat (E 1:100 (A3))</w:t>
-      </w:r>
-    </w:p>
-    <w:p>
-      <w:pPr>
-        <w:sectPr>
-          <w:headerReference w:type="default" r:id="rId9"/>
-          <w:footerReference w:type="default" r:id="rId10"/>
-          <w:pgSz w:w="16838" w:h="11906" w:orient="landscape"/>
-          <w:pgMar w:top="1000" w:right="900" w:bottom="800" w:left="900" w:header="400" w:footer="400" w:gutter="0"/>
           <w:pgNumType/>
           <w:docGrid w:linePitch="360"/>
         </w:sectPr>
@@ -13432,7 +13138,7 @@
                 <w:sz w:val="15"/>
                 <w:szCs w:val="15"/>
               </w:rPr>
-              <w:t xml:space="preserve">450,00</w:t>
+              <w:t xml:space="preserve">710,00</w:t>
             </w:r>
           </w:p>
         </w:tc>
@@ -13462,7 +13168,7 @@
                 <w:sz w:val="15"/>
                 <w:szCs w:val="15"/>
               </w:rPr>
-              <w:t xml:space="preserve">450,00</w:t>
+              <w:t xml:space="preserve">710,00</w:t>
             </w:r>
           </w:p>
         </w:tc>
@@ -13682,7 +13388,7 @@
                 <w:sz w:val="15"/>
                 <w:szCs w:val="15"/>
               </w:rPr>
-              <w:t xml:space="preserve">450,00</w:t>
+              <w:t xml:space="preserve">710,00</w:t>
             </w:r>
           </w:p>
         </w:tc>
@@ -15249,7 +14955,7 @@
                 <w:sz w:val="18"/>
                 <w:szCs w:val="18"/>
               </w:rPr>
-              <w:t xml:space="preserve">450,00</w:t>
+              <w:t xml:space="preserve">710,00</w:t>
             </w:r>
           </w:p>
         </w:tc>
@@ -15445,7 +15151,7 @@
                 <w:sz w:val="18"/>
                 <w:szCs w:val="18"/>
               </w:rPr>
-              <w:t xml:space="preserve">34.963,85</w:t>
+              <w:t xml:space="preserve">35.223,85</w:t>
             </w:r>
           </w:p>
         </w:tc>
@@ -15541,7 +15247,7 @@
                 <w:sz w:val="18"/>
                 <w:szCs w:val="18"/>
               </w:rPr>
-              <w:t xml:space="preserve">4.545,30</w:t>
+              <w:t xml:space="preserve">4.579,10</w:t>
             </w:r>
           </w:p>
         </w:tc>
@@ -15637,7 +15343,7 @@
                 <w:sz w:val="18"/>
                 <w:szCs w:val="18"/>
               </w:rPr>
-              <w:t xml:space="preserve">2.097,83</w:t>
+              <w:t xml:space="preserve">2.113,43</w:t>
             </w:r>
           </w:p>
         </w:tc>
@@ -15737,7 +15443,7 @@
                 <w:sz w:val="18"/>
                 <w:szCs w:val="18"/>
               </w:rPr>
-              <w:t xml:space="preserve">41.606,98</w:t>
+              <w:t xml:space="preserve">41.916,38</w:t>
             </w:r>
           </w:p>
         </w:tc>
@@ -15833,7 +15539,7 @@
                 <w:sz w:val="18"/>
                 <w:szCs w:val="18"/>
               </w:rPr>
-              <w:t xml:space="preserve">8.737,47</w:t>
+              <w:t xml:space="preserve">8.802,44</w:t>
             </w:r>
           </w:p>
         </w:tc>
@@ -15933,7 +15639,7 @@
                 <w:sz w:val="18"/>
                 <w:szCs w:val="18"/>
               </w:rPr>
-              <w:t xml:space="preserve">50.344,45</w:t>
+              <w:t xml:space="preserve">50.718,82</w:t>
             </w:r>
           </w:p>
         </w:tc>
@@ -15958,7 +15664,7 @@
           <w:b/>
           <w:bCs/>
         </w:rPr>
-        <w:t xml:space="preserve">El pressupost d’execució material (base imposable de l’ICIO) puja a 34.963,85 €.</w:t>
+        <w:t xml:space="preserve">El pressupost d’execució material (base imposable de l’ICIO) puja a 35.223,85 €.</w:t>
       </w:r>
     </w:p>
     <w:p>
@@ -18044,7 +17750,7 @@
                     </pic:cNvPicPr>
                   </pic:nvPicPr>
                   <pic:blipFill>
-                    <a:blip r:embed="rId17" cstate="none"/>
+                    <a:blip r:embed="rId11" cstate="none"/>
                     <a:srcRect/>
                     <a:stretch>
                       <a:fillRect/>
@@ -18103,7 +17809,7 @@
                     </pic:cNvPicPr>
                   </pic:nvPicPr>
                   <pic:blipFill>
-                    <a:blip r:embed="rId18" cstate="none"/>
+                    <a:blip r:embed="rId12" cstate="none"/>
                     <a:srcRect/>
                     <a:stretch>
                       <a:fillRect/>
@@ -18162,7 +17868,7 @@
                     </pic:cNvPicPr>
                   </pic:nvPicPr>
                   <pic:blipFill>
-                    <a:blip r:embed="rId19" cstate="none"/>
+                    <a:blip r:embed="rId13" cstate="none"/>
                     <a:srcRect/>
                     <a:stretch>
                       <a:fillRect/>
@@ -18221,7 +17927,7 @@
                     </pic:cNvPicPr>
                   </pic:nvPicPr>
                   <pic:blipFill>
-                    <a:blip r:embed="rId20" cstate="none"/>
+                    <a:blip r:embed="rId14" cstate="none"/>
                     <a:srcRect/>
                     <a:stretch>
                       <a:fillRect/>
@@ -18297,7 +18003,7 @@
         <w:jc w:val="both"/>
       </w:pPr>
       <w:r>
-        <w:t xml:space="preserve">Pressupost d’execució material: 34.963,85 €.</w:t>
+        <w:t xml:space="preserve">Pressupost d’execució material: 35.223,85 €.</w:t>
       </w:r>
     </w:p>
     <w:p>
@@ -20384,8 +20090,8 @@
       </w:r>
     </w:p>
     <w:sectPr>
-      <w:headerReference w:type="default" r:id="rId11"/>
-      <w:footerReference w:type="default" r:id="rId12"/>
+      <w:headerReference w:type="default" r:id="rId9"/>
+      <w:footerReference w:type="default" r:id="rId10"/>
       <w:pgSz w:w="11906" w:h="16838" w:orient="portrait"/>
       <w:pgMar w:top="1418" w:right="1134" w:bottom="1134" w:left="1134" w:header="567" w:footer="567" w:gutter="0"/>
       <w:pgNumType/>
@@ -20490,33 +20196,6 @@
 </w:ftr>
 </file>
 
-<file path=word/footer3.xml><?xml version="1.0" encoding="utf-8"?>
-<w:ftr xmlns:wpc="http://schemas.microsoft.com/office/word/2010/wordprocessingCanvas" xmlns:mc="http://schemas.openxmlformats.org/markup-compatibility/2006" xmlns:o="urn:schemas-microsoft-com:office:office" xmlns:r="http://schemas.openxmlformats.org/officeDocument/2006/relationships" xmlns:m="http://schemas.openxmlformats.org/officeDocument/2006/math" xmlns:v="urn:schemas-microsoft-com:vml" xmlns:wp14="http://schemas.microsoft.com/office/word/2010/wordprocessingDrawing" xmlns:wp="http://schemas.openxmlformats.org/drawingml/2006/wordprocessingDrawing" xmlns:w10="urn:schemas-microsoft-com:office:word" xmlns:w="http://schemas.openxmlformats.org/wordprocessingml/2006/main" xmlns:w14="http://schemas.microsoft.com/office/word/2010/wordml" xmlns:w15="http://schemas.microsoft.com/office/word/2012/wordml" xmlns:wpg="http://schemas.microsoft.com/office/word/2010/wordprocessingGroup" xmlns:wpi="http://schemas.microsoft.com/office/word/2010/wordprocessingInk" xmlns:wne="http://schemas.microsoft.com/office/word/2006/wordml" xmlns:wps="http://schemas.microsoft.com/office/word/2010/wordprocessingShape">
-  <w:p>
-    <w:pPr>
-      <w:jc w:val="right"/>
-    </w:pPr>
-    <w:r>
-      <w:rPr>
-        <w:sz w:val="16"/>
-        <w:szCs w:val="16"/>
-      </w:rPr>
-      <w:t xml:space="preserve">Pàgina </w:t>
-    </w:r>
-    <w:r>
-      <w:rPr>
-        <w:sz w:val="16"/>
-        <w:szCs w:val="16"/>
-      </w:rPr>
-      <w:fldChar w:fldCharType="begin"/>
-      <w:instrText xml:space="preserve">PAGE</w:instrText>
-      <w:fldChar w:fldCharType="separate"/>
-      <w:fldChar w:fldCharType="end"/>
-    </w:r>
-  </w:p>
-</w:ftr>
-</file>
-
 <file path=word/footnotes.xml><?xml version="1.0" encoding="utf-8"?>
 <w:footnotes xmlns:wpc="http://schemas.microsoft.com/office/word/2010/wordprocessingCanvas" xmlns:mc="http://schemas.openxmlformats.org/markup-compatibility/2006" xmlns:o="urn:schemas-microsoft-com:office:office" xmlns:r="http://schemas.openxmlformats.org/officeDocument/2006/relationships" xmlns:m="http://schemas.openxmlformats.org/officeDocument/2006/math" xmlns:v="urn:schemas-microsoft-com:vml" xmlns:wp14="http://schemas.microsoft.com/office/word/2010/wordprocessingDrawing" xmlns:wp="http://schemas.openxmlformats.org/drawingml/2006/wordprocessingDrawing" xmlns:w10="urn:schemas-microsoft-com:office:word" xmlns:w="http://schemas.openxmlformats.org/wordprocessingml/2006/main" xmlns:w14="http://schemas.microsoft.com/office/word/2010/wordml" xmlns:w15="http://schemas.microsoft.com/office/word/2012/wordml" xmlns:wpg="http://schemas.microsoft.com/office/word/2010/wordprocessingGroup" xmlns:wpi="http://schemas.microsoft.com/office/word/2010/wordprocessingInk" xmlns:wne="http://schemas.microsoft.com/office/word/2006/wordml" xmlns:wps="http://schemas.microsoft.com/office/word/2010/wordprocessingShape" mc:Ignorable="w14 w15 wp14">
   <w:footnote w:type="separator" w:id="-1">
@@ -20596,47 +20275,6 @@
 </file>
 
 <file path=word/header2.xml><?xml version="1.0" encoding="utf-8"?>
-<w:hdr xmlns:wpc="http://schemas.microsoft.com/office/word/2010/wordprocessingCanvas" xmlns:mc="http://schemas.openxmlformats.org/markup-compatibility/2006" xmlns:o="urn:schemas-microsoft-com:office:office" xmlns:r="http://schemas.openxmlformats.org/officeDocument/2006/relationships" xmlns:m="http://schemas.openxmlformats.org/officeDocument/2006/math" xmlns:v="urn:schemas-microsoft-com:vml" xmlns:wp14="http://schemas.microsoft.com/office/word/2010/wordprocessingDrawing" xmlns:wp="http://schemas.openxmlformats.org/drawingml/2006/wordprocessingDrawing" xmlns:w10="urn:schemas-microsoft-com:office:word" xmlns:w="http://schemas.openxmlformats.org/wordprocessingml/2006/main" xmlns:w14="http://schemas.microsoft.com/office/word/2010/wordml" xmlns:w15="http://schemas.microsoft.com/office/word/2012/wordml" xmlns:wpg="http://schemas.microsoft.com/office/word/2010/wordprocessingGroup" xmlns:wpi="http://schemas.microsoft.com/office/word/2010/wordprocessingInk" xmlns:wne="http://schemas.microsoft.com/office/word/2006/wordml" xmlns:wps="http://schemas.microsoft.com/office/word/2010/wordprocessingShape" xmlns:cx="http://schemas.microsoft.com/office/drawing/2014/chartex" xmlns:cx1="http://schemas.microsoft.com/office/drawing/2015/9/8/chartex" xmlns:cx2="http://schemas.microsoft.com/office/drawing/2015/10/21/chartex" xmlns:cx3="http://schemas.microsoft.com/office/drawing/2016/5/9/chartex" xmlns:cx4="http://schemas.microsoft.com/office/drawing/2016/5/10/chartex" xmlns:cx5="http://schemas.microsoft.com/office/drawing/2016/5/11/chartex" xmlns:cx6="http://schemas.microsoft.com/office/drawing/2016/5/12/chartex" xmlns:cx7="http://schemas.microsoft.com/office/drawing/2016/5/13/chartex" xmlns:cx8="http://schemas.microsoft.com/office/drawing/2016/5/14/chartex" xmlns:w16cid="http://schemas.microsoft.com/office/word/2016/wordml/cid" xmlns:w16se="http://schemas.microsoft.com/office/word/2015/wordml/symex">
-  <w:p>
-    <w:pPr>
-      <w:pBdr>
-        <w:bottom w:val="single" w:color="888888" w:sz="4" w:space="2"/>
-      </w:pBdr>
-      <w:tabs>
-        <w:tab w:val="right" w:pos="9638"/>
-      </w:tabs>
-    </w:pPr>
-    <w:r>
-      <w:rPr>
-        <w:b/>
-        <w:bCs/>
-        <w:sz w:val="16"/>
-        <w:szCs w:val="16"/>
-      </w:rPr>
-      <w:t xml:space="preserve">Ignasi Tutzó Seró</w:t>
-    </w:r>
-    <w:r>
-      <w:rPr>
-        <w:color w:val="666666"/>
-        <w:sz w:val="16"/>
-        <w:szCs w:val="16"/>
-      </w:rPr>
-      <w:t xml:space="preserve">	Substitució de portes d’accés · Nau de Turbines del Besòs</w:t>
-    </w:r>
-  </w:p>
-  <w:p>
-    <w:r>
-      <w:rPr>
-        <w:sz w:val="16"/>
-        <w:szCs w:val="16"/>
-      </w:rPr>
-      <w:t xml:space="preserve">Arquitecte Tècnic</w:t>
-    </w:r>
-  </w:p>
-</w:hdr>
-</file>
-
-<file path=word/header3.xml><?xml version="1.0" encoding="utf-8"?>
 <w:hdr xmlns:wpc="http://schemas.microsoft.com/office/word/2010/wordprocessingCanvas" xmlns:mc="http://schemas.openxmlformats.org/markup-compatibility/2006" xmlns:o="urn:schemas-microsoft-com:office:office" xmlns:r="http://schemas.openxmlformats.org/officeDocument/2006/relationships" xmlns:m="http://schemas.openxmlformats.org/officeDocument/2006/math" xmlns:v="urn:schemas-microsoft-com:vml" xmlns:wp14="http://schemas.microsoft.com/office/word/2010/wordprocessingDrawing" xmlns:wp="http://schemas.openxmlformats.org/drawingml/2006/wordprocessingDrawing" xmlns:w10="urn:schemas-microsoft-com:office:word" xmlns:w="http://schemas.openxmlformats.org/wordprocessingml/2006/main" xmlns:w14="http://schemas.microsoft.com/office/word/2010/wordml" xmlns:w15="http://schemas.microsoft.com/office/word/2012/wordml" xmlns:wpg="http://schemas.microsoft.com/office/word/2010/wordprocessingGroup" xmlns:wpi="http://schemas.microsoft.com/office/word/2010/wordprocessingInk" xmlns:wne="http://schemas.microsoft.com/office/word/2006/wordml" xmlns:wps="http://schemas.microsoft.com/office/word/2010/wordprocessingShape" xmlns:cx="http://schemas.microsoft.com/office/drawing/2014/chartex" xmlns:cx1="http://schemas.microsoft.com/office/drawing/2015/9/8/chartex" xmlns:cx2="http://schemas.microsoft.com/office/drawing/2015/10/21/chartex" xmlns:cx3="http://schemas.microsoft.com/office/drawing/2016/5/9/chartex" xmlns:cx4="http://schemas.microsoft.com/office/drawing/2016/5/10/chartex" xmlns:cx5="http://schemas.microsoft.com/office/drawing/2016/5/11/chartex" xmlns:cx6="http://schemas.microsoft.com/office/drawing/2016/5/12/chartex" xmlns:cx7="http://schemas.microsoft.com/office/drawing/2016/5/13/chartex" xmlns:cx8="http://schemas.microsoft.com/office/drawing/2016/5/14/chartex" xmlns:w16cid="http://schemas.microsoft.com/office/word/2016/wordml/cid" xmlns:w16se="http://schemas.microsoft.com/office/word/2015/wordml/symex">
   <w:p>
     <w:pPr>

</xml_diff>